<commit_message>
Deploy 2026-04-03 10:51 — 27 file(s) updated
</commit_message>
<xml_diff>
--- a/Claude Notes.docx
+++ b/Claude Notes.docx
@@ -3047,11 +3047,31 @@
       <w:pPr>
         <w:pStyle w:val="Normal"/>
         <w:bidi w:val="0"/>
-        <w:jc w:val="left"/>
-        <w:rPr/>
-      </w:pPr>
-      <w:r>
-        <w:rPr/>
+        <w:spacing w:before="0" w:after="283"/>
+        <w:jc w:val="left"/>
+        <w:rPr/>
+      </w:pPr>
+      <w:r>
+        <w:rPr/>
+      </w:r>
+    </w:p>
+    <w:p>
+      <w:pPr>
+        <w:pStyle w:val="BodyText"/>
+        <w:bidi w:val="0"/>
+        <w:jc w:val="left"/>
+        <w:rPr>
+          <w:rFonts w:ascii="Menlo-Regular" w:hAnsi="Menlo-Regular"/>
+          <w:color w:val="000000"/>
+          <w:sz w:val="22"/>
+        </w:rPr>
+      </w:pPr>
+      <w:r>
+        <w:rPr>
+          <w:rFonts w:ascii="Menlo-Regular" w:hAnsi="Menlo-Regular"/>
+          <w:color w:val="000000"/>
+          <w:sz w:val="22"/>
+        </w:rPr>
       </w:r>
     </w:p>
     <w:p>
@@ -3072,6 +3092,7 @@
       <w:pgNumType w:fmt="decimal"/>
       <w:formProt w:val="false"/>
       <w:textDirection w:val="lrTb"/>
+      <w:docGrid w:type="default" w:linePitch="312" w:charSpace="4294961151"/>
     </w:sectPr>
   </w:body>
 </w:document>

</xml_diff>

<commit_message>
Deploy 2026-04-03 15:43 — 14 file(s) updated
</commit_message>
<xml_diff>
--- a/Claude Notes.docx
+++ b/Claude Notes.docx
@@ -4,6 +4,1514 @@
   <w:body>
     <w:p>
       <w:pPr>
+        <w:pStyle w:val="Heading2"/>
+        <w:bidi w:val="0"/>
+        <w:spacing w:lineRule="auto" w:line="276" w:before="0" w:after="140"/>
+        <w:jc w:val="left"/>
+        <w:rPr/>
+      </w:pPr>
+      <w:r>
+        <w:rPr>
+          <w:rStyle w:val="Strong"/>
+          <w:rFonts w:ascii="Helvetica Neue" w:hAnsi="Helvetica Neue"/>
+          <w:b w:val="false"/>
+          <w:bCs w:val="false"/>
+          <w:sz w:val="24"/>
+          <w:szCs w:val="24"/>
+        </w:rPr>
+        <w:t>Website Admin — Command Reference</w:t>
+      </w:r>
+    </w:p>
+    <w:p>
+      <w:pPr>
+        <w:pStyle w:val="Heading3"/>
+        <w:spacing w:lineRule="auto" w:line="276" w:before="0" w:after="140"/>
+        <w:rPr>
+          <w:rFonts w:ascii="Helvetica Neue" w:hAnsi="Helvetica Neue"/>
+          <w:b w:val="false"/>
+          <w:bCs w:val="false"/>
+          <w:sz w:val="24"/>
+          <w:szCs w:val="24"/>
+        </w:rPr>
+      </w:pPr>
+      <w:r>
+        <w:rPr>
+          <w:rFonts w:ascii="Helvetica Neue" w:hAnsi="Helvetica Neue"/>
+          <w:b w:val="false"/>
+          <w:bCs w:val="false"/>
+          <w:sz w:val="24"/>
+          <w:szCs w:val="24"/>
+        </w:rPr>
+        <w:t>Starting a work session</w:t>
+      </w:r>
+    </w:p>
+    <w:p>
+      <w:pPr>
+        <w:pStyle w:val="BodyText"/>
+        <w:ind w:hanging="0" w:left="0" w:right="0"/>
+        <w:rPr/>
+      </w:pPr>
+      <w:r>
+        <w:rPr/>
+        <w:t>bash</w:t>
+      </w:r>
+    </w:p>
+    <w:p>
+      <w:pPr>
+        <w:pStyle w:val="PreformattedText"/>
+        <w:spacing w:lineRule="auto" w:line="276" w:before="0" w:after="140"/>
+        <w:ind w:hanging="0" w:left="0" w:right="0"/>
+        <w:rPr>
+          <w:rFonts w:ascii="Helvetica Neue" w:hAnsi="Helvetica Neue" w:eastAsia="Songti SC" w:cs="Arial Unicode MS"/>
+          <w:sz w:val="24"/>
+          <w:szCs w:val="24"/>
+        </w:rPr>
+      </w:pPr>
+      <w:r>
+        <w:rPr>
+          <w:rStyle w:val="SourceText"/>
+          <w:rFonts w:ascii="var font-mono" w:hAnsi="var font-mono"/>
+          <w:color w:val="6E7687"/>
+          <w:sz w:val="24"/>
+          <w:szCs w:val="24"/>
+          <w:shd w:fill="auto" w:val="clear"/>
+        </w:rPr>
+        <w:t># Step 1 — Always start the admin server first (keep this Terminal window open)</w:t>
+      </w:r>
+    </w:p>
+    <w:p>
+      <w:pPr>
+        <w:pStyle w:val="PreformattedText"/>
+        <w:spacing w:lineRule="auto" w:line="276" w:before="0" w:after="140"/>
+        <w:rPr>
+          <w:rFonts w:ascii="Helvetica Neue" w:hAnsi="Helvetica Neue" w:eastAsia="Songti SC" w:cs="Arial Unicode MS"/>
+          <w:sz w:val="24"/>
+          <w:szCs w:val="24"/>
+        </w:rPr>
+      </w:pPr>
+      <w:r>
+        <w:rPr>
+          <w:rStyle w:val="SourceText"/>
+          <w:rFonts w:ascii="var font-mono" w:hAnsi="var font-mono"/>
+          <w:color w:val="14181F"/>
+          <w:sz w:val="24"/>
+          <w:szCs w:val="24"/>
+          <w:shd w:fill="auto" w:val="clear"/>
+        </w:rPr>
+        <w:t>python3 /Users/ncm/Pictures/Mohangraphy/Scripts/patch_tags.py</w:t>
+      </w:r>
+    </w:p>
+    <w:p>
+      <w:pPr>
+        <w:pStyle w:val="HorizontalLine"/>
+        <w:spacing w:lineRule="auto" w:line="276" w:before="0" w:after="140"/>
+        <w:rPr>
+          <w:sz w:val="24"/>
+          <w:szCs w:val="24"/>
+        </w:rPr>
+      </w:pPr>
+      <w:r>
+        <w:rPr>
+          <w:sz w:val="24"/>
+          <w:szCs w:val="24"/>
+        </w:rPr>
+      </w:r>
+    </w:p>
+    <w:p>
+      <w:pPr>
+        <w:pStyle w:val="Heading3"/>
+        <w:spacing w:lineRule="auto" w:line="276" w:before="0" w:after="140"/>
+        <w:rPr>
+          <w:rFonts w:ascii="Helvetica Neue" w:hAnsi="Helvetica Neue"/>
+          <w:b w:val="false"/>
+          <w:bCs w:val="false"/>
+          <w:sz w:val="24"/>
+          <w:szCs w:val="24"/>
+        </w:rPr>
+      </w:pPr>
+      <w:r>
+        <w:rPr>
+          <w:rFonts w:ascii="Helvetica Neue" w:hAnsi="Helvetica Neue"/>
+          <w:b w:val="false"/>
+          <w:bCs w:val="false"/>
+          <w:sz w:val="24"/>
+          <w:szCs w:val="24"/>
+        </w:rPr>
+        <w:t>Uploading new photos</w:t>
+      </w:r>
+    </w:p>
+    <w:p>
+      <w:pPr>
+        <w:pStyle w:val="BodyText"/>
+        <w:ind w:hanging="0" w:left="0" w:right="0"/>
+        <w:rPr/>
+      </w:pPr>
+      <w:r>
+        <w:rPr/>
+        <w:t>bash</w:t>
+      </w:r>
+    </w:p>
+    <w:p>
+      <w:pPr>
+        <w:pStyle w:val="PreformattedText"/>
+        <w:spacing w:lineRule="auto" w:line="276" w:before="0" w:after="140"/>
+        <w:ind w:hanging="0" w:left="0" w:right="0"/>
+        <w:rPr>
+          <w:rFonts w:ascii="Helvetica Neue" w:hAnsi="Helvetica Neue" w:eastAsia="Songti SC" w:cs="Arial Unicode MS"/>
+          <w:sz w:val="24"/>
+          <w:szCs w:val="24"/>
+        </w:rPr>
+      </w:pPr>
+      <w:r>
+        <w:rPr>
+          <w:rStyle w:val="SourceText"/>
+          <w:rFonts w:ascii="var font-mono" w:hAnsi="var font-mono"/>
+          <w:color w:val="6E7687"/>
+          <w:sz w:val="24"/>
+          <w:szCs w:val="24"/>
+          <w:shd w:fill="auto" w:val="clear"/>
+        </w:rPr>
+        <w:t># Copy photos into the Photos folder — any subfolder or flat into Photos/</w:t>
+      </w:r>
+    </w:p>
+    <w:p>
+      <w:pPr>
+        <w:pStyle w:val="PreformattedText"/>
+        <w:spacing w:lineRule="auto" w:line="276" w:before="0" w:after="140"/>
+        <w:ind w:hanging="0" w:left="0" w:right="0"/>
+        <w:rPr>
+          <w:rFonts w:ascii="Helvetica Neue" w:hAnsi="Helvetica Neue" w:eastAsia="Songti SC" w:cs="Arial Unicode MS"/>
+          <w:sz w:val="24"/>
+          <w:szCs w:val="24"/>
+        </w:rPr>
+      </w:pPr>
+      <w:r>
+        <w:rPr>
+          <w:rStyle w:val="SourceText"/>
+          <w:rFonts w:ascii="var font-mono" w:hAnsi="var font-mono"/>
+          <w:color w:val="6E7687"/>
+          <w:sz w:val="24"/>
+          <w:szCs w:val="24"/>
+          <w:shd w:fill="auto" w:val="clear"/>
+        </w:rPr>
+        <w:t># Then tag them so they appear in the right Collection:</w:t>
+      </w:r>
+    </w:p>
+    <w:p>
+      <w:pPr>
+        <w:pStyle w:val="PreformattedText"/>
+        <w:spacing w:lineRule="auto" w:line="276" w:before="0" w:after="140"/>
+        <w:rPr>
+          <w:rFonts w:ascii="Helvetica Neue" w:hAnsi="Helvetica Neue" w:eastAsia="Songti SC" w:cs="Arial Unicode MS"/>
+          <w:sz w:val="24"/>
+          <w:szCs w:val="24"/>
+        </w:rPr>
+      </w:pPr>
+      <w:r>
+        <w:rPr>
+          <w:rStyle w:val="SourceText"/>
+          <w:rFonts w:ascii="var font-mono" w:hAnsi="var font-mono"/>
+          <w:color w:val="14181F"/>
+          <w:sz w:val="24"/>
+          <w:szCs w:val="24"/>
+          <w:shd w:fill="auto" w:val="clear"/>
+        </w:rPr>
+        <w:t>python3 /Users/ncm/Pictures/Mohangraphy/Scripts/curator.py</w:t>
+      </w:r>
+    </w:p>
+    <w:p>
+      <w:pPr>
+        <w:pStyle w:val="BodyText"/>
+        <w:rPr/>
+      </w:pPr>
+      <w:r>
+        <w:rPr/>
+        <w:t>Curator opens each photo on screen and asks: category tags, place name, date. This is what makes photos appear in Collections.</w:t>
+      </w:r>
+    </w:p>
+    <w:p>
+      <w:pPr>
+        <w:pStyle w:val="HorizontalLine"/>
+        <w:spacing w:lineRule="auto" w:line="276" w:before="0" w:after="140"/>
+        <w:rPr>
+          <w:sz w:val="24"/>
+          <w:szCs w:val="24"/>
+        </w:rPr>
+      </w:pPr>
+      <w:r>
+        <w:rPr>
+          <w:sz w:val="24"/>
+          <w:szCs w:val="24"/>
+        </w:rPr>
+      </w:r>
+    </w:p>
+    <w:p>
+      <w:pPr>
+        <w:pStyle w:val="Heading3"/>
+        <w:spacing w:lineRule="auto" w:line="276" w:before="0" w:after="140"/>
+        <w:rPr>
+          <w:rFonts w:ascii="Helvetica Neue" w:hAnsi="Helvetica Neue"/>
+          <w:b w:val="false"/>
+          <w:bCs w:val="false"/>
+          <w:sz w:val="24"/>
+          <w:szCs w:val="24"/>
+        </w:rPr>
+      </w:pPr>
+      <w:r>
+        <w:rPr>
+          <w:rFonts w:ascii="Helvetica Neue" w:hAnsi="Helvetica Neue"/>
+          <w:b w:val="false"/>
+          <w:bCs w:val="false"/>
+          <w:sz w:val="24"/>
+          <w:szCs w:val="24"/>
+        </w:rPr>
+        <w:t>Editing tags on already-uploaded photos</w:t>
+      </w:r>
+    </w:p>
+    <w:p>
+      <w:pPr>
+        <w:pStyle w:val="BodyText"/>
+        <w:rPr/>
+      </w:pPr>
+      <w:r>
+        <w:rPr/>
+        <w:t>The admin server must be running (Step 1 above), then in your browser:</w:t>
+      </w:r>
+    </w:p>
+    <w:p>
+      <w:pPr>
+        <w:pStyle w:val="BodyText"/>
+        <w:numPr>
+          <w:ilvl w:val="0"/>
+          <w:numId w:val="1"/>
+        </w:numPr>
+        <w:tabs>
+          <w:tab w:val="clear" w:pos="709"/>
+          <w:tab w:val="left" w:pos="0" w:leader="none"/>
+        </w:tabs>
+        <w:spacing w:before="0" w:after="0"/>
+        <w:ind w:hanging="283" w:left="709"/>
+        <w:rPr/>
+      </w:pPr>
+      <w:r>
+        <w:rPr/>
+        <w:t xml:space="preserve">Press </w:t>
+      </w:r>
+      <w:r>
+        <w:rPr>
+          <w:rStyle w:val="SourceText"/>
+        </w:rPr>
+        <w:t>Ctrl+Shift+A</w:t>
+      </w:r>
+      <w:r>
+        <w:rPr/>
+        <w:t xml:space="preserve"> → admin mode </w:t>
+      </w:r>
+    </w:p>
+    <w:p>
+      <w:pPr>
+        <w:pStyle w:val="BodyText"/>
+        <w:numPr>
+          <w:ilvl w:val="0"/>
+          <w:numId w:val="1"/>
+        </w:numPr>
+        <w:tabs>
+          <w:tab w:val="clear" w:pos="709"/>
+          <w:tab w:val="left" w:pos="0" w:leader="none"/>
+        </w:tabs>
+        <w:spacing w:before="0" w:after="0"/>
+        <w:ind w:hanging="283" w:left="709"/>
+        <w:rPr/>
+      </w:pPr>
+      <w:r>
+        <w:rPr/>
+        <w:t xml:space="preserve">Right-click any photo → Edit tags </w:t>
+      </w:r>
+    </w:p>
+    <w:p>
+      <w:pPr>
+        <w:pStyle w:val="BodyText"/>
+        <w:numPr>
+          <w:ilvl w:val="0"/>
+          <w:numId w:val="1"/>
+        </w:numPr>
+        <w:tabs>
+          <w:tab w:val="clear" w:pos="709"/>
+          <w:tab w:val="left" w:pos="0" w:leader="none"/>
+        </w:tabs>
+        <w:spacing w:before="0" w:after="0"/>
+        <w:ind w:hanging="283" w:left="709"/>
+        <w:rPr/>
+      </w:pPr>
+      <w:r>
+        <w:rPr/>
+        <w:t xml:space="preserve">Fill State, City, Remarks → </w:t>
+      </w:r>
+      <w:r>
+        <w:rPr>
+          <w:rStyle w:val="Strong"/>
+        </w:rPr>
+        <w:t>Save Tags</w:t>
+      </w:r>
+      <w:r>
+        <w:rPr/>
+        <w:t xml:space="preserve"> </w:t>
+      </w:r>
+    </w:p>
+    <w:p>
+      <w:pPr>
+        <w:pStyle w:val="BodyText"/>
+        <w:numPr>
+          <w:ilvl w:val="0"/>
+          <w:numId w:val="1"/>
+        </w:numPr>
+        <w:tabs>
+          <w:tab w:val="clear" w:pos="709"/>
+          <w:tab w:val="left" w:pos="0" w:leader="none"/>
+        </w:tabs>
+        <w:ind w:hanging="283" w:left="709"/>
+        <w:rPr/>
+      </w:pPr>
+      <w:r>
+        <w:rPr/>
+        <w:t xml:space="preserve">Click </w:t>
+      </w:r>
+      <w:r>
+        <w:rPr>
+          <w:rStyle w:val="Strong"/>
+        </w:rPr>
+        <w:t>Deploy Now</w:t>
+      </w:r>
+      <w:r>
+        <w:rPr/>
+        <w:t xml:space="preserve"> when done (no need to run deploy separately) </w:t>
+      </w:r>
+    </w:p>
+    <w:p>
+      <w:pPr>
+        <w:pStyle w:val="HorizontalLine"/>
+        <w:spacing w:lineRule="auto" w:line="276" w:before="0" w:after="140"/>
+        <w:rPr>
+          <w:sz w:val="24"/>
+          <w:szCs w:val="24"/>
+        </w:rPr>
+      </w:pPr>
+      <w:r>
+        <w:rPr>
+          <w:sz w:val="24"/>
+          <w:szCs w:val="24"/>
+        </w:rPr>
+      </w:r>
+    </w:p>
+    <w:p>
+      <w:pPr>
+        <w:pStyle w:val="Heading3"/>
+        <w:spacing w:lineRule="auto" w:line="276" w:before="0" w:after="140"/>
+        <w:rPr>
+          <w:rFonts w:ascii="Helvetica Neue" w:hAnsi="Helvetica Neue"/>
+          <w:b w:val="false"/>
+          <w:bCs w:val="false"/>
+          <w:sz w:val="24"/>
+          <w:szCs w:val="24"/>
+        </w:rPr>
+      </w:pPr>
+      <w:r>
+        <w:rPr>
+          <w:rFonts w:ascii="Helvetica Neue" w:hAnsi="Helvetica Neue"/>
+          <w:b w:val="false"/>
+          <w:bCs w:val="false"/>
+          <w:sz w:val="24"/>
+          <w:szCs w:val="24"/>
+        </w:rPr>
+        <w:t>Writing a new travel blog</w:t>
+      </w:r>
+    </w:p>
+    <w:p>
+      <w:pPr>
+        <w:pStyle w:val="BodyText"/>
+        <w:ind w:hanging="0" w:left="0" w:right="0"/>
+        <w:rPr/>
+      </w:pPr>
+      <w:r>
+        <w:rPr/>
+        <w:t>bash</w:t>
+      </w:r>
+    </w:p>
+    <w:p>
+      <w:pPr>
+        <w:pStyle w:val="PreformattedText"/>
+        <w:spacing w:lineRule="auto" w:line="276" w:before="0" w:after="140"/>
+        <w:ind w:hanging="0" w:left="0" w:right="0"/>
+        <w:rPr>
+          <w:rFonts w:ascii="Helvetica Neue" w:hAnsi="Helvetica Neue" w:eastAsia="Songti SC" w:cs="Arial Unicode MS"/>
+          <w:sz w:val="24"/>
+          <w:szCs w:val="24"/>
+        </w:rPr>
+      </w:pPr>
+      <w:r>
+        <w:rPr>
+          <w:rStyle w:val="SourceText"/>
+          <w:rFonts w:ascii="var font-mono" w:hAnsi="var font-mono"/>
+          <w:color w:val="14181F"/>
+          <w:sz w:val="24"/>
+          <w:szCs w:val="24"/>
+          <w:shd w:fill="auto" w:val="clear"/>
+        </w:rPr>
+        <w:t>python3 /Users/ncm/Pictures/Mohangraphy/Scripts/blog_editor.py</w:t>
+      </w:r>
+    </w:p>
+    <w:p>
+      <w:pPr>
+        <w:pStyle w:val="PreformattedText"/>
+        <w:spacing w:lineRule="auto" w:line="276" w:before="0" w:after="140"/>
+        <w:ind w:hanging="0" w:left="0" w:right="0"/>
+        <w:rPr>
+          <w:rFonts w:ascii="Helvetica Neue" w:hAnsi="Helvetica Neue" w:eastAsia="Songti SC" w:cs="Arial Unicode MS"/>
+          <w:sz w:val="24"/>
+          <w:szCs w:val="24"/>
+        </w:rPr>
+      </w:pPr>
+      <w:r>
+        <w:rPr>
+          <w:rStyle w:val="SourceText"/>
+          <w:rFonts w:ascii="var font-mono" w:hAnsi="var font-mono"/>
+          <w:color w:val="6E7687"/>
+          <w:sz w:val="24"/>
+          <w:szCs w:val="24"/>
+          <w:shd w:fill="auto" w:val="clear"/>
+        </w:rPr>
+        <w:t># Choose "New post" → fill in the Mac dialogs → Done</w:t>
+      </w:r>
+    </w:p>
+    <w:p>
+      <w:pPr>
+        <w:pStyle w:val="PreformattedText"/>
+        <w:spacing w:lineRule="auto" w:line="276" w:before="0" w:after="140"/>
+        <w:ind w:hanging="0" w:left="0" w:right="0"/>
+        <w:rPr>
+          <w:rFonts w:ascii="Helvetica Neue" w:hAnsi="Helvetica Neue" w:eastAsia="Songti SC" w:cs="Arial Unicode MS"/>
+          <w:sz w:val="24"/>
+          <w:szCs w:val="24"/>
+        </w:rPr>
+      </w:pPr>
+      <w:r>
+        <w:rPr>
+          <w:rStyle w:val="SourceText"/>
+          <w:rFonts w:ascii="var font-mono" w:hAnsi="var font-mono"/>
+          <w:color w:val="6E7687"/>
+          <w:sz w:val="24"/>
+          <w:szCs w:val="24"/>
+          <w:shd w:fill="auto" w:val="clear"/>
+        </w:rPr>
+        <w:t># Then deploy:</w:t>
+      </w:r>
+    </w:p>
+    <w:p>
+      <w:pPr>
+        <w:pStyle w:val="PreformattedText"/>
+        <w:spacing w:lineRule="auto" w:line="276" w:before="0" w:after="140"/>
+        <w:rPr>
+          <w:rFonts w:ascii="Helvetica Neue" w:hAnsi="Helvetica Neue" w:eastAsia="Songti SC" w:cs="Arial Unicode MS"/>
+          <w:sz w:val="24"/>
+          <w:szCs w:val="24"/>
+        </w:rPr>
+      </w:pPr>
+      <w:r>
+        <w:rPr>
+          <w:rStyle w:val="SourceText"/>
+          <w:rFonts w:ascii="var font-mono" w:hAnsi="var font-mono"/>
+          <w:color w:val="14181F"/>
+          <w:sz w:val="24"/>
+          <w:szCs w:val="24"/>
+          <w:shd w:fill="auto" w:val="clear"/>
+        </w:rPr>
+        <w:t>python3 /Users/ncm/Pictures/Mohangraphy/Scripts/Claude_mohangraphy.py</w:t>
+      </w:r>
+    </w:p>
+    <w:p>
+      <w:pPr>
+        <w:pStyle w:val="HorizontalLine"/>
+        <w:spacing w:lineRule="auto" w:line="276" w:before="0" w:after="140"/>
+        <w:rPr>
+          <w:sz w:val="24"/>
+          <w:szCs w:val="24"/>
+        </w:rPr>
+      </w:pPr>
+      <w:r>
+        <w:rPr>
+          <w:sz w:val="24"/>
+          <w:szCs w:val="24"/>
+        </w:rPr>
+      </w:r>
+    </w:p>
+    <w:p>
+      <w:pPr>
+        <w:pStyle w:val="Heading3"/>
+        <w:spacing w:lineRule="auto" w:line="276" w:before="0" w:after="140"/>
+        <w:rPr>
+          <w:rFonts w:ascii="Helvetica Neue" w:hAnsi="Helvetica Neue"/>
+          <w:b w:val="false"/>
+          <w:bCs w:val="false"/>
+          <w:sz w:val="24"/>
+          <w:szCs w:val="24"/>
+        </w:rPr>
+      </w:pPr>
+      <w:r>
+        <w:rPr>
+          <w:rFonts w:ascii="Helvetica Neue" w:hAnsi="Helvetica Neue"/>
+          <w:b w:val="false"/>
+          <w:bCs w:val="false"/>
+          <w:sz w:val="24"/>
+          <w:szCs w:val="24"/>
+        </w:rPr>
+        <w:t>Editing an existing blog post</w:t>
+      </w:r>
+    </w:p>
+    <w:p>
+      <w:pPr>
+        <w:pStyle w:val="BodyText"/>
+        <w:ind w:hanging="0" w:left="0" w:right="0"/>
+        <w:rPr/>
+      </w:pPr>
+      <w:r>
+        <w:rPr/>
+        <w:t>bash</w:t>
+      </w:r>
+    </w:p>
+    <w:p>
+      <w:pPr>
+        <w:pStyle w:val="PreformattedText"/>
+        <w:spacing w:lineRule="auto" w:line="276" w:before="0" w:after="140"/>
+        <w:ind w:hanging="0" w:left="0" w:right="0"/>
+        <w:rPr>
+          <w:rFonts w:ascii="Helvetica Neue" w:hAnsi="Helvetica Neue" w:eastAsia="Songti SC" w:cs="Arial Unicode MS"/>
+          <w:sz w:val="24"/>
+          <w:szCs w:val="24"/>
+        </w:rPr>
+      </w:pPr>
+      <w:r>
+        <w:rPr>
+          <w:rStyle w:val="SourceText"/>
+          <w:rFonts w:ascii="var font-mono" w:hAnsi="var font-mono"/>
+          <w:color w:val="14181F"/>
+          <w:sz w:val="24"/>
+          <w:szCs w:val="24"/>
+          <w:shd w:fill="auto" w:val="clear"/>
+        </w:rPr>
+        <w:t>python3 /Users/ncm/Pictures/Mohangraphy/Scripts/blog_editor.py</w:t>
+      </w:r>
+    </w:p>
+    <w:p>
+      <w:pPr>
+        <w:pStyle w:val="PreformattedText"/>
+        <w:spacing w:lineRule="auto" w:line="276" w:before="0" w:after="140"/>
+        <w:ind w:hanging="0" w:left="0" w:right="0"/>
+        <w:rPr>
+          <w:rFonts w:ascii="Helvetica Neue" w:hAnsi="Helvetica Neue" w:eastAsia="Songti SC" w:cs="Arial Unicode MS"/>
+          <w:sz w:val="24"/>
+          <w:szCs w:val="24"/>
+        </w:rPr>
+      </w:pPr>
+      <w:r>
+        <w:rPr>
+          <w:rStyle w:val="SourceText"/>
+          <w:rFonts w:ascii="var font-mono" w:hAnsi="var font-mono"/>
+          <w:color w:val="6E7687"/>
+          <w:sz w:val="24"/>
+          <w:szCs w:val="24"/>
+          <w:shd w:fill="auto" w:val="clear"/>
+        </w:rPr>
+        <w:t># Choose "Edit: [post name]" → make changes → Done → deploy</w:t>
+      </w:r>
+    </w:p>
+    <w:p>
+      <w:pPr>
+        <w:pStyle w:val="PreformattedText"/>
+        <w:spacing w:lineRule="auto" w:line="276" w:before="0" w:after="140"/>
+        <w:rPr>
+          <w:rFonts w:ascii="Helvetica Neue" w:hAnsi="Helvetica Neue" w:eastAsia="Songti SC" w:cs="Arial Unicode MS"/>
+          <w:sz w:val="24"/>
+          <w:szCs w:val="24"/>
+        </w:rPr>
+      </w:pPr>
+      <w:r>
+        <w:rPr>
+          <w:rStyle w:val="SourceText"/>
+          <w:rFonts w:ascii="var font-mono" w:hAnsi="var font-mono"/>
+          <w:color w:val="14181F"/>
+          <w:sz w:val="24"/>
+          <w:szCs w:val="24"/>
+          <w:shd w:fill="auto" w:val="clear"/>
+        </w:rPr>
+        <w:t>python3 /Users/ncm/Pictures/Mohangraphy/Scripts/Claude_mohangraphy.py</w:t>
+      </w:r>
+    </w:p>
+    <w:p>
+      <w:pPr>
+        <w:pStyle w:val="HorizontalLine"/>
+        <w:spacing w:lineRule="auto" w:line="276" w:before="0" w:after="140"/>
+        <w:rPr>
+          <w:sz w:val="24"/>
+          <w:szCs w:val="24"/>
+        </w:rPr>
+      </w:pPr>
+      <w:r>
+        <w:rPr>
+          <w:sz w:val="24"/>
+          <w:szCs w:val="24"/>
+        </w:rPr>
+      </w:r>
+    </w:p>
+    <w:p>
+      <w:pPr>
+        <w:pStyle w:val="Heading3"/>
+        <w:spacing w:lineRule="auto" w:line="276" w:before="0" w:after="140"/>
+        <w:rPr>
+          <w:rFonts w:ascii="Helvetica Neue" w:hAnsi="Helvetica Neue"/>
+          <w:b w:val="false"/>
+          <w:bCs w:val="false"/>
+          <w:sz w:val="24"/>
+          <w:szCs w:val="24"/>
+        </w:rPr>
+      </w:pPr>
+      <w:r>
+        <w:rPr>
+          <w:rFonts w:ascii="Helvetica Neue" w:hAnsi="Helvetica Neue"/>
+          <w:b w:val="false"/>
+          <w:bCs w:val="false"/>
+          <w:sz w:val="24"/>
+          <w:szCs w:val="24"/>
+        </w:rPr>
+        <w:t>Downloading subscriber data</w:t>
+      </w:r>
+    </w:p>
+    <w:p>
+      <w:pPr>
+        <w:pStyle w:val="BodyText"/>
+        <w:ind w:hanging="0" w:left="0" w:right="0"/>
+        <w:rPr/>
+      </w:pPr>
+      <w:r>
+        <w:rPr/>
+        <w:t>bash</w:t>
+      </w:r>
+    </w:p>
+    <w:p>
+      <w:pPr>
+        <w:pStyle w:val="PreformattedText"/>
+        <w:spacing w:lineRule="auto" w:line="276" w:before="0" w:after="140"/>
+        <w:ind w:hanging="0" w:left="0" w:right="0"/>
+        <w:rPr>
+          <w:rFonts w:ascii="Helvetica Neue" w:hAnsi="Helvetica Neue" w:eastAsia="Songti SC" w:cs="Arial Unicode MS"/>
+          <w:sz w:val="24"/>
+          <w:szCs w:val="24"/>
+        </w:rPr>
+      </w:pPr>
+      <w:r>
+        <w:rPr>
+          <w:rStyle w:val="SourceText"/>
+          <w:rFonts w:ascii="var font-mono" w:hAnsi="var font-mono"/>
+          <w:color w:val="14181F"/>
+          <w:sz w:val="24"/>
+          <w:szCs w:val="24"/>
+          <w:shd w:fill="auto" w:val="clear"/>
+        </w:rPr>
+        <w:t>python3 /Users/ncm/Pictures/Mohangraphy/Scripts/list_subscribers.py</w:t>
+      </w:r>
+    </w:p>
+    <w:p>
+      <w:pPr>
+        <w:pStyle w:val="PreformattedText"/>
+        <w:spacing w:lineRule="auto" w:line="276" w:before="0" w:after="140"/>
+        <w:ind w:hanging="0" w:left="0" w:right="0"/>
+        <w:rPr>
+          <w:rFonts w:ascii="Helvetica Neue" w:hAnsi="Helvetica Neue" w:eastAsia="Songti SC" w:cs="Arial Unicode MS"/>
+          <w:sz w:val="24"/>
+          <w:szCs w:val="24"/>
+        </w:rPr>
+      </w:pPr>
+      <w:r>
+        <w:rPr>
+          <w:rStyle w:val="SourceText"/>
+          <w:rFonts w:ascii="var font-mono" w:hAnsi="var font-mono"/>
+          <w:color w:val="6E7687"/>
+          <w:sz w:val="24"/>
+          <w:szCs w:val="24"/>
+          <w:shd w:fill="auto" w:val="clear"/>
+        </w:rPr>
+        <w:t># Saves an Excel file in Scripts/ with name, email, date subscribed</w:t>
+      </w:r>
+    </w:p>
+    <w:p>
+      <w:pPr>
+        <w:pStyle w:val="HorizontalLine"/>
+        <w:spacing w:lineRule="auto" w:line="276" w:before="0" w:after="140"/>
+        <w:rPr>
+          <w:sz w:val="24"/>
+          <w:szCs w:val="24"/>
+        </w:rPr>
+      </w:pPr>
+      <w:r>
+        <w:rPr>
+          <w:sz w:val="24"/>
+          <w:szCs w:val="24"/>
+        </w:rPr>
+      </w:r>
+    </w:p>
+    <w:p>
+      <w:pPr>
+        <w:pStyle w:val="Heading3"/>
+        <w:spacing w:lineRule="auto" w:line="276" w:before="0" w:after="140"/>
+        <w:rPr>
+          <w:rFonts w:ascii="Helvetica Neue" w:hAnsi="Helvetica Neue"/>
+          <w:b w:val="false"/>
+          <w:bCs w:val="false"/>
+          <w:sz w:val="24"/>
+          <w:szCs w:val="24"/>
+        </w:rPr>
+      </w:pPr>
+      <w:r>
+        <w:rPr>
+          <w:rFonts w:ascii="Helvetica Neue" w:hAnsi="Helvetica Neue"/>
+          <w:b w:val="false"/>
+          <w:bCs w:val="false"/>
+          <w:sz w:val="24"/>
+          <w:szCs w:val="24"/>
+        </w:rPr>
+        <w:t>Full typical work session (sequential order)</w:t>
+      </w:r>
+    </w:p>
+    <w:p>
+      <w:pPr>
+        <w:pStyle w:val="BodyText"/>
+        <w:ind w:hanging="0" w:left="0" w:right="0"/>
+        <w:rPr/>
+      </w:pPr>
+      <w:r>
+        <w:rPr/>
+        <w:t>bash</w:t>
+      </w:r>
+    </w:p>
+    <w:p>
+      <w:pPr>
+        <w:pStyle w:val="PreformattedText"/>
+        <w:spacing w:lineRule="auto" w:line="276" w:before="0" w:after="140"/>
+        <w:ind w:hanging="0" w:left="0" w:right="0"/>
+        <w:rPr>
+          <w:rFonts w:ascii="Helvetica Neue" w:hAnsi="Helvetica Neue" w:eastAsia="Songti SC" w:cs="Arial Unicode MS"/>
+          <w:sz w:val="24"/>
+          <w:szCs w:val="24"/>
+        </w:rPr>
+      </w:pPr>
+      <w:r>
+        <w:rPr>
+          <w:rStyle w:val="SourceText"/>
+          <w:rFonts w:ascii="var font-mono" w:hAnsi="var font-mono"/>
+          <w:color w:val="6E7687"/>
+          <w:sz w:val="24"/>
+          <w:szCs w:val="24"/>
+          <w:shd w:fill="auto" w:val="clear"/>
+        </w:rPr>
+        <w:t># 1. Start admin server</w:t>
+      </w:r>
+    </w:p>
+    <w:p>
+      <w:pPr>
+        <w:pStyle w:val="PreformattedText"/>
+        <w:spacing w:lineRule="auto" w:line="276" w:before="0" w:after="140"/>
+        <w:rPr>
+          <w:rFonts w:ascii="Helvetica Neue" w:hAnsi="Helvetica Neue" w:eastAsia="Songti SC" w:cs="Arial Unicode MS"/>
+          <w:sz w:val="24"/>
+          <w:szCs w:val="24"/>
+        </w:rPr>
+      </w:pPr>
+      <w:r>
+        <w:rPr>
+          <w:rStyle w:val="SourceText"/>
+          <w:rFonts w:ascii="var font-mono" w:hAnsi="var font-mono"/>
+          <w:color w:val="14181F"/>
+          <w:sz w:val="24"/>
+          <w:szCs w:val="24"/>
+          <w:shd w:fill="auto" w:val="clear"/>
+        </w:rPr>
+        <w:t>python3 /Users/ncm/Pictures/Mohangraphy/Scripts/patch_tags.py</w:t>
+      </w:r>
+    </w:p>
+    <w:p>
+      <w:pPr>
+        <w:pStyle w:val="PreformattedText"/>
+        <w:spacing w:lineRule="auto" w:line="276" w:before="0" w:after="140"/>
+        <w:rPr>
+          <w:rFonts w:ascii="Helvetica Neue" w:hAnsi="Helvetica Neue" w:eastAsia="Songti SC" w:cs="Arial Unicode MS"/>
+          <w:sz w:val="24"/>
+          <w:szCs w:val="24"/>
+        </w:rPr>
+      </w:pPr>
+      <w:r>
+        <w:rPr>
+          <w:rFonts w:eastAsia="Songti SC" w:cs="Arial Unicode MS" w:ascii="Helvetica Neue" w:hAnsi="Helvetica Neue"/>
+          <w:sz w:val="24"/>
+          <w:szCs w:val="24"/>
+        </w:rPr>
+      </w:r>
+    </w:p>
+    <w:p>
+      <w:pPr>
+        <w:pStyle w:val="PreformattedText"/>
+        <w:spacing w:lineRule="auto" w:line="276" w:before="0" w:after="140"/>
+        <w:ind w:hanging="0" w:left="0" w:right="0"/>
+        <w:rPr>
+          <w:rFonts w:ascii="Helvetica Neue" w:hAnsi="Helvetica Neue" w:eastAsia="Songti SC" w:cs="Arial Unicode MS"/>
+          <w:sz w:val="24"/>
+          <w:szCs w:val="24"/>
+        </w:rPr>
+      </w:pPr>
+      <w:r>
+        <w:rPr>
+          <w:rStyle w:val="SourceText"/>
+          <w:rFonts w:ascii="var font-mono" w:hAnsi="var font-mono"/>
+          <w:color w:val="6E7687"/>
+          <w:sz w:val="24"/>
+          <w:szCs w:val="24"/>
+          <w:shd w:fill="auto" w:val="clear"/>
+        </w:rPr>
+        <w:t># 2a. Tag new photos (if you added any)</w:t>
+      </w:r>
+    </w:p>
+    <w:p>
+      <w:pPr>
+        <w:pStyle w:val="PreformattedText"/>
+        <w:spacing w:lineRule="auto" w:line="276" w:before="0" w:after="140"/>
+        <w:rPr>
+          <w:rFonts w:ascii="Helvetica Neue" w:hAnsi="Helvetica Neue" w:eastAsia="Songti SC" w:cs="Arial Unicode MS"/>
+          <w:sz w:val="24"/>
+          <w:szCs w:val="24"/>
+        </w:rPr>
+      </w:pPr>
+      <w:r>
+        <w:rPr>
+          <w:rStyle w:val="SourceText"/>
+          <w:rFonts w:ascii="var font-mono" w:hAnsi="var font-mono"/>
+          <w:color w:val="14181F"/>
+          <w:sz w:val="24"/>
+          <w:szCs w:val="24"/>
+          <w:shd w:fill="auto" w:val="clear"/>
+        </w:rPr>
+        <w:t>python3 /Users/ncm/Pictures/Mohangraphy/Scripts/curator.py</w:t>
+      </w:r>
+    </w:p>
+    <w:p>
+      <w:pPr>
+        <w:pStyle w:val="PreformattedText"/>
+        <w:spacing w:lineRule="auto" w:line="276" w:before="0" w:after="140"/>
+        <w:rPr>
+          <w:rFonts w:ascii="Helvetica Neue" w:hAnsi="Helvetica Neue" w:eastAsia="Songti SC" w:cs="Arial Unicode MS"/>
+          <w:sz w:val="24"/>
+          <w:szCs w:val="24"/>
+        </w:rPr>
+      </w:pPr>
+      <w:r>
+        <w:rPr>
+          <w:rFonts w:eastAsia="Songti SC" w:cs="Arial Unicode MS" w:ascii="Helvetica Neue" w:hAnsi="Helvetica Neue"/>
+          <w:sz w:val="24"/>
+          <w:szCs w:val="24"/>
+        </w:rPr>
+      </w:r>
+    </w:p>
+    <w:p>
+      <w:pPr>
+        <w:pStyle w:val="PreformattedText"/>
+        <w:spacing w:lineRule="auto" w:line="276" w:before="0" w:after="140"/>
+        <w:ind w:hanging="0" w:left="0" w:right="0"/>
+        <w:rPr>
+          <w:rFonts w:ascii="Helvetica Neue" w:hAnsi="Helvetica Neue" w:eastAsia="Songti SC" w:cs="Arial Unicode MS"/>
+          <w:sz w:val="24"/>
+          <w:szCs w:val="24"/>
+        </w:rPr>
+      </w:pPr>
+      <w:r>
+        <w:rPr>
+          <w:rStyle w:val="SourceText"/>
+          <w:rFonts w:ascii="var font-mono" w:hAnsi="var font-mono"/>
+          <w:color w:val="6E7687"/>
+          <w:sz w:val="24"/>
+          <w:szCs w:val="24"/>
+          <w:shd w:fill="auto" w:val="clear"/>
+        </w:rPr>
+        <w:t># 2b. Fix tags via browser (right-click → Edit tags → Deploy Now)</w:t>
+      </w:r>
+    </w:p>
+    <w:p>
+      <w:pPr>
+        <w:pStyle w:val="PreformattedText"/>
+        <w:spacing w:lineRule="auto" w:line="276" w:before="0" w:after="140"/>
+        <w:ind w:hanging="0" w:left="0" w:right="0"/>
+        <w:rPr>
+          <w:rFonts w:ascii="Helvetica Neue" w:hAnsi="Helvetica Neue" w:eastAsia="Songti SC" w:cs="Arial Unicode MS"/>
+          <w:sz w:val="24"/>
+          <w:szCs w:val="24"/>
+        </w:rPr>
+      </w:pPr>
+      <w:r>
+        <w:rPr>
+          <w:rStyle w:val="SourceText"/>
+          <w:rFonts w:ascii="var font-mono" w:hAnsi="var font-mono"/>
+          <w:color w:val="6E7687"/>
+          <w:sz w:val="24"/>
+          <w:szCs w:val="24"/>
+          <w:shd w:fill="auto" w:val="clear"/>
+        </w:rPr>
+        <w:t>#     (admin server must be running from step 1)</w:t>
+      </w:r>
+    </w:p>
+    <w:p>
+      <w:pPr>
+        <w:pStyle w:val="PreformattedText"/>
+        <w:spacing w:lineRule="auto" w:line="276" w:before="0" w:after="140"/>
+        <w:rPr>
+          <w:rFonts w:ascii="Helvetica Neue" w:hAnsi="Helvetica Neue" w:eastAsia="Songti SC" w:cs="Arial Unicode MS"/>
+          <w:sz w:val="24"/>
+          <w:szCs w:val="24"/>
+        </w:rPr>
+      </w:pPr>
+      <w:r>
+        <w:rPr>
+          <w:rFonts w:eastAsia="Songti SC" w:cs="Arial Unicode MS" w:ascii="Helvetica Neue" w:hAnsi="Helvetica Neue"/>
+          <w:sz w:val="24"/>
+          <w:szCs w:val="24"/>
+        </w:rPr>
+      </w:r>
+    </w:p>
+    <w:p>
+      <w:pPr>
+        <w:pStyle w:val="PreformattedText"/>
+        <w:spacing w:lineRule="auto" w:line="276" w:before="0" w:after="140"/>
+        <w:ind w:hanging="0" w:left="0" w:right="0"/>
+        <w:rPr>
+          <w:rFonts w:ascii="Helvetica Neue" w:hAnsi="Helvetica Neue" w:eastAsia="Songti SC" w:cs="Arial Unicode MS"/>
+          <w:sz w:val="24"/>
+          <w:szCs w:val="24"/>
+        </w:rPr>
+      </w:pPr>
+      <w:r>
+        <w:rPr>
+          <w:rStyle w:val="SourceText"/>
+          <w:rFonts w:ascii="var font-mono" w:hAnsi="var font-mono"/>
+          <w:color w:val="6E7687"/>
+          <w:sz w:val="24"/>
+          <w:szCs w:val="24"/>
+          <w:shd w:fill="auto" w:val="clear"/>
+        </w:rPr>
+        <w:t># 3. Write or edit a blog post</w:t>
+      </w:r>
+    </w:p>
+    <w:p>
+      <w:pPr>
+        <w:pStyle w:val="PreformattedText"/>
+        <w:spacing w:lineRule="auto" w:line="276" w:before="0" w:after="140"/>
+        <w:rPr>
+          <w:rFonts w:ascii="Helvetica Neue" w:hAnsi="Helvetica Neue" w:eastAsia="Songti SC" w:cs="Arial Unicode MS"/>
+          <w:sz w:val="24"/>
+          <w:szCs w:val="24"/>
+        </w:rPr>
+      </w:pPr>
+      <w:r>
+        <w:rPr>
+          <w:rStyle w:val="SourceText"/>
+          <w:rFonts w:ascii="var font-mono" w:hAnsi="var font-mono"/>
+          <w:color w:val="14181F"/>
+          <w:sz w:val="24"/>
+          <w:szCs w:val="24"/>
+          <w:shd w:fill="auto" w:val="clear"/>
+        </w:rPr>
+        <w:t>python3 /Users/ncm/Pictures/Mohangraphy/Scripts/blog_editor.py</w:t>
+      </w:r>
+    </w:p>
+    <w:p>
+      <w:pPr>
+        <w:pStyle w:val="PreformattedText"/>
+        <w:spacing w:lineRule="auto" w:line="276" w:before="0" w:after="140"/>
+        <w:rPr>
+          <w:rFonts w:ascii="Helvetica Neue" w:hAnsi="Helvetica Neue" w:eastAsia="Songti SC" w:cs="Arial Unicode MS"/>
+          <w:sz w:val="24"/>
+          <w:szCs w:val="24"/>
+        </w:rPr>
+      </w:pPr>
+      <w:r>
+        <w:rPr>
+          <w:rFonts w:eastAsia="Songti SC" w:cs="Arial Unicode MS" w:ascii="Helvetica Neue" w:hAnsi="Helvetica Neue"/>
+          <w:sz w:val="24"/>
+          <w:szCs w:val="24"/>
+        </w:rPr>
+      </w:r>
+    </w:p>
+    <w:p>
+      <w:pPr>
+        <w:pStyle w:val="PreformattedText"/>
+        <w:spacing w:lineRule="auto" w:line="276" w:before="0" w:after="140"/>
+        <w:ind w:hanging="0" w:left="0" w:right="0"/>
+        <w:rPr>
+          <w:rFonts w:ascii="Helvetica Neue" w:hAnsi="Helvetica Neue" w:eastAsia="Songti SC" w:cs="Arial Unicode MS"/>
+          <w:sz w:val="24"/>
+          <w:szCs w:val="24"/>
+        </w:rPr>
+      </w:pPr>
+      <w:r>
+        <w:rPr>
+          <w:rStyle w:val="SourceText"/>
+          <w:rFonts w:ascii="var font-mono" w:hAnsi="var font-mono"/>
+          <w:color w:val="6E7687"/>
+          <w:sz w:val="24"/>
+          <w:szCs w:val="24"/>
+          <w:shd w:fill="auto" w:val="clear"/>
+        </w:rPr>
+        <w:t># 4. Build and deploy</w:t>
+      </w:r>
+    </w:p>
+    <w:p>
+      <w:pPr>
+        <w:pStyle w:val="PreformattedText"/>
+        <w:spacing w:lineRule="auto" w:line="276" w:before="0" w:after="140"/>
+        <w:rPr>
+          <w:rFonts w:ascii="Helvetica Neue" w:hAnsi="Helvetica Neue" w:eastAsia="Songti SC" w:cs="Arial Unicode MS"/>
+          <w:sz w:val="24"/>
+          <w:szCs w:val="24"/>
+        </w:rPr>
+      </w:pPr>
+      <w:r>
+        <w:rPr>
+          <w:rStyle w:val="SourceText"/>
+          <w:rFonts w:ascii="var font-mono" w:hAnsi="var font-mono"/>
+          <w:color w:val="14181F"/>
+          <w:sz w:val="24"/>
+          <w:szCs w:val="24"/>
+          <w:shd w:fill="auto" w:val="clear"/>
+        </w:rPr>
+        <w:t>python3 /Users/ncm/Pictures/Mohangraphy/Scripts/Claude_mohangraphy.py</w:t>
+      </w:r>
+    </w:p>
+    <w:p>
+      <w:pPr>
+        <w:pStyle w:val="PreformattedText"/>
+        <w:spacing w:lineRule="auto" w:line="276" w:before="0" w:after="140"/>
+        <w:rPr>
+          <w:rFonts w:ascii="Helvetica Neue" w:hAnsi="Helvetica Neue" w:eastAsia="Songti SC" w:cs="Arial Unicode MS"/>
+          <w:sz w:val="24"/>
+          <w:szCs w:val="24"/>
+        </w:rPr>
+      </w:pPr>
+      <w:r>
+        <w:rPr>
+          <w:rFonts w:eastAsia="Songti SC" w:cs="Arial Unicode MS" w:ascii="Helvetica Neue" w:hAnsi="Helvetica Neue"/>
+          <w:sz w:val="24"/>
+          <w:szCs w:val="24"/>
+        </w:rPr>
+      </w:r>
+    </w:p>
+    <w:p>
+      <w:pPr>
+        <w:pStyle w:val="PreformattedText"/>
+        <w:spacing w:lineRule="auto" w:line="276" w:before="0" w:after="140"/>
+        <w:ind w:hanging="0" w:left="0" w:right="0"/>
+        <w:rPr>
+          <w:rFonts w:ascii="Helvetica Neue" w:hAnsi="Helvetica Neue" w:eastAsia="Songti SC" w:cs="Arial Unicode MS"/>
+          <w:sz w:val="24"/>
+          <w:szCs w:val="24"/>
+        </w:rPr>
+      </w:pPr>
+      <w:r>
+        <w:rPr>
+          <w:rStyle w:val="SourceText"/>
+          <w:rFonts w:ascii="var font-mono" w:hAnsi="var font-mono"/>
+          <w:color w:val="6E7687"/>
+          <w:sz w:val="24"/>
+          <w:szCs w:val="24"/>
+          <w:shd w:fill="auto" w:val="clear"/>
+        </w:rPr>
+        <w:t># 5. Stop admin server</w:t>
+      </w:r>
+    </w:p>
+    <w:p>
+      <w:pPr>
+        <w:pStyle w:val="PreformattedText"/>
+        <w:spacing w:lineRule="auto" w:line="276" w:before="0" w:after="140"/>
+        <w:ind w:hanging="0" w:left="0" w:right="0"/>
+        <w:rPr>
+          <w:rFonts w:ascii="Helvetica Neue" w:hAnsi="Helvetica Neue" w:eastAsia="Songti SC" w:cs="Arial Unicode MS"/>
+          <w:sz w:val="24"/>
+          <w:szCs w:val="24"/>
+        </w:rPr>
+      </w:pPr>
+      <w:r>
+        <w:rPr>
+          <w:rStyle w:val="SourceText"/>
+          <w:rFonts w:ascii="var font-mono" w:hAnsi="var font-mono"/>
+          <w:color w:val="6E7687"/>
+          <w:sz w:val="24"/>
+          <w:szCs w:val="24"/>
+          <w:shd w:fill="auto" w:val="clear"/>
+        </w:rPr>
+        <w:t># Ctrl+C in the terminal running patch_tags.py</w:t>
+      </w:r>
+    </w:p>
+    <w:p>
+      <w:pPr>
+        <w:pStyle w:val="PreformattedText"/>
+        <w:spacing w:lineRule="auto" w:line="276" w:before="0" w:after="140"/>
+        <w:rPr>
+          <w:rFonts w:ascii="Helvetica Neue" w:hAnsi="Helvetica Neue" w:eastAsia="Songti SC" w:cs="Arial Unicode MS"/>
+          <w:sz w:val="24"/>
+          <w:szCs w:val="24"/>
+        </w:rPr>
+      </w:pPr>
+      <w:r>
+        <w:rPr>
+          <w:rFonts w:eastAsia="Songti SC" w:cs="Arial Unicode MS" w:ascii="Helvetica Neue" w:hAnsi="Helvetica Neue"/>
+          <w:sz w:val="24"/>
+          <w:szCs w:val="24"/>
+        </w:rPr>
+      </w:r>
+    </w:p>
+    <w:p>
+      <w:pPr>
+        <w:pStyle w:val="PreformattedText"/>
+        <w:spacing w:lineRule="auto" w:line="276" w:before="0" w:after="140"/>
+        <w:ind w:hanging="0" w:left="0" w:right="0"/>
+        <w:rPr>
+          <w:rFonts w:ascii="Helvetica Neue" w:hAnsi="Helvetica Neue" w:eastAsia="Songti SC" w:cs="Arial Unicode MS"/>
+          <w:sz w:val="24"/>
+          <w:szCs w:val="24"/>
+        </w:rPr>
+      </w:pPr>
+      <w:r>
+        <w:rPr>
+          <w:rStyle w:val="SourceText"/>
+          <w:rFonts w:ascii="var font-mono" w:hAnsi="var font-mono"/>
+          <w:color w:val="6E7687"/>
+          <w:sz w:val="24"/>
+          <w:szCs w:val="24"/>
+          <w:shd w:fill="auto" w:val="clear"/>
+        </w:rPr>
+        <w:t># 6. Download subscriber list (any time)</w:t>
+      </w:r>
+    </w:p>
+    <w:p>
+      <w:pPr>
+        <w:pStyle w:val="PreformattedText"/>
+        <w:spacing w:lineRule="auto" w:line="276" w:before="0" w:after="140"/>
+        <w:rPr>
+          <w:rFonts w:ascii="Helvetica Neue" w:hAnsi="Helvetica Neue" w:eastAsia="Songti SC" w:cs="Arial Unicode MS"/>
+          <w:sz w:val="24"/>
+          <w:szCs w:val="24"/>
+        </w:rPr>
+      </w:pPr>
+      <w:r>
+        <w:rPr>
+          <w:rStyle w:val="SourceText"/>
+          <w:rFonts w:ascii="var font-mono" w:hAnsi="var font-mono"/>
+          <w:color w:val="14181F"/>
+          <w:sz w:val="24"/>
+          <w:szCs w:val="24"/>
+          <w:shd w:fill="auto" w:val="clear"/>
+        </w:rPr>
+        <w:t>python3 /Users/ncm/Pictures/Mohangraphy/Scripts/list_subscribers.py</w:t>
+      </w:r>
+    </w:p>
+    <w:p>
+      <w:pPr>
+        <w:pStyle w:val="HorizontalLine"/>
+        <w:spacing w:lineRule="auto" w:line="276" w:before="0" w:after="140"/>
+        <w:rPr>
+          <w:sz w:val="24"/>
+          <w:szCs w:val="24"/>
+        </w:rPr>
+      </w:pPr>
+      <w:r>
+        <w:rPr>
+          <w:sz w:val="24"/>
+          <w:szCs w:val="24"/>
+        </w:rPr>
+      </w:r>
+    </w:p>
+    <w:p>
+      <w:pPr>
+        <w:pStyle w:val="Heading2"/>
+        <w:spacing w:lineRule="auto" w:line="276" w:before="0" w:after="140"/>
+        <w:rPr>
+          <w:rFonts w:ascii="Helvetica Neue" w:hAnsi="Helvetica Neue"/>
+          <w:b w:val="false"/>
+          <w:bCs w:val="false"/>
+          <w:sz w:val="24"/>
+          <w:szCs w:val="24"/>
+        </w:rPr>
+      </w:pPr>
+      <w:r>
+        <w:rPr>
+          <w:rFonts w:ascii="Helvetica Neue" w:hAnsi="Helvetica Neue"/>
+          <w:b w:val="false"/>
+          <w:bCs w:val="false"/>
+          <w:sz w:val="24"/>
+          <w:szCs w:val="24"/>
+        </w:rPr>
+        <w:t>Photos folder — how it works</w:t>
+      </w:r>
+    </w:p>
+    <w:p>
+      <w:pPr>
+        <w:pStyle w:val="BodyText"/>
+        <w:rPr/>
+      </w:pPr>
+      <w:r>
+        <w:rPr>
+          <w:rStyle w:val="Strong"/>
+        </w:rPr>
+        <w:t>No, photos are NOT auto-sorted by the script.</w:t>
+      </w:r>
+      <w:r>
+        <w:rPr/>
+        <w:t xml:space="preserve"> Here is what actually happens:</w:t>
+      </w:r>
+    </w:p>
+    <w:tbl>
+      <w:tblPr>
+        <w:tblW w:w="9170" w:type="dxa"/>
+        <w:jc w:val="left"/>
+        <w:tblInd w:w="28" w:type="dxa"/>
+        <w:tblLayout w:type="fixed"/>
+        <w:tblCellMar>
+          <w:top w:w="28" w:type="dxa"/>
+          <w:left w:w="28" w:type="dxa"/>
+          <w:bottom w:w="28" w:type="dxa"/>
+          <w:right w:w="28" w:type="dxa"/>
+        </w:tblCellMar>
+      </w:tblPr>
+      <w:tblGrid>
+        <w:gridCol w:w="4659"/>
+        <w:gridCol w:w="4511"/>
+      </w:tblGrid>
+      <w:tr>
+        <w:trPr>
+          <w:tblHeader w:val="true"/>
+        </w:trPr>
+        <w:tc>
+          <w:tcPr>
+            <w:tcW w:w="4659" w:type="dxa"/>
+            <w:tcBorders/>
+            <w:vAlign w:val="center"/>
+          </w:tcPr>
+          <w:p>
+            <w:pPr>
+              <w:pStyle w:val="TableHeading"/>
+              <w:rPr/>
+            </w:pPr>
+            <w:r>
+              <w:rPr/>
+              <w:t>What you do</w:t>
+            </w:r>
+          </w:p>
+        </w:tc>
+        <w:tc>
+          <w:tcPr>
+            <w:tcW w:w="4511" w:type="dxa"/>
+            <w:tcBorders/>
+            <w:vAlign w:val="center"/>
+          </w:tcPr>
+          <w:p>
+            <w:pPr>
+              <w:pStyle w:val="TableHeading"/>
+              <w:rPr/>
+            </w:pPr>
+            <w:r>
+              <w:rPr/>
+              <w:t>What appears on site</w:t>
+            </w:r>
+          </w:p>
+        </w:tc>
+      </w:tr>
+      <w:tr>
+        <w:trPr/>
+        <w:tc>
+          <w:tcPr>
+            <w:tcW w:w="4659" w:type="dxa"/>
+            <w:tcBorders/>
+            <w:vAlign w:val="center"/>
+          </w:tcPr>
+          <w:p>
+            <w:pPr>
+              <w:pStyle w:val="TableContents"/>
+              <w:rPr/>
+            </w:pPr>
+            <w:r>
+              <w:rPr/>
+              <w:t xml:space="preserve">Drop photo in </w:t>
+            </w:r>
+            <w:r>
+              <w:rPr>
+                <w:rStyle w:val="SourceText"/>
+              </w:rPr>
+              <w:t>Photos/Nature/Birds/</w:t>
+            </w:r>
+          </w:p>
+        </w:tc>
+        <w:tc>
+          <w:tcPr>
+            <w:tcW w:w="4511" w:type="dxa"/>
+            <w:tcBorders/>
+            <w:vAlign w:val="center"/>
+          </w:tcPr>
+          <w:p>
+            <w:pPr>
+              <w:pStyle w:val="TableContents"/>
+              <w:rPr/>
+            </w:pPr>
+            <w:r>
+              <w:rPr/>
+              <w:t>Appears in Nature → Birds automatically</w:t>
+            </w:r>
+          </w:p>
+        </w:tc>
+      </w:tr>
+      <w:tr>
+        <w:trPr/>
+        <w:tc>
+          <w:tcPr>
+            <w:tcW w:w="4659" w:type="dxa"/>
+            <w:tcBorders/>
+            <w:vAlign w:val="center"/>
+          </w:tcPr>
+          <w:p>
+            <w:pPr>
+              <w:pStyle w:val="TableContents"/>
+              <w:rPr/>
+            </w:pPr>
+            <w:r>
+              <w:rPr/>
+              <w:t xml:space="preserve">Drop photo in </w:t>
+            </w:r>
+            <w:r>
+              <w:rPr>
+                <w:rStyle w:val="SourceText"/>
+              </w:rPr>
+              <w:t>Photos/</w:t>
+            </w:r>
+            <w:r>
+              <w:rPr/>
+              <w:t xml:space="preserve"> (flat, no subfolder)</w:t>
+            </w:r>
+          </w:p>
+        </w:tc>
+        <w:tc>
+          <w:tcPr>
+            <w:tcW w:w="4511" w:type="dxa"/>
+            <w:tcBorders/>
+            <w:vAlign w:val="center"/>
+          </w:tcPr>
+          <w:p>
+            <w:pPr>
+              <w:pStyle w:val="TableContents"/>
+              <w:rPr/>
+            </w:pPr>
+            <w:r>
+              <w:rPr/>
+              <w:t>Does NOT appear anywhere until tagged</w:t>
+            </w:r>
+          </w:p>
+        </w:tc>
+      </w:tr>
+      <w:tr>
+        <w:trPr/>
+        <w:tc>
+          <w:tcPr>
+            <w:tcW w:w="4659" w:type="dxa"/>
+            <w:tcBorders/>
+            <w:vAlign w:val="center"/>
+          </w:tcPr>
+          <w:p>
+            <w:pPr>
+              <w:pStyle w:val="TableContents"/>
+              <w:rPr/>
+            </w:pPr>
+            <w:r>
+              <w:rPr/>
+              <w:t xml:space="preserve">Run </w:t>
+            </w:r>
+            <w:r>
+              <w:rPr>
+                <w:rStyle w:val="SourceText"/>
+              </w:rPr>
+              <w:t>curator.py</w:t>
+            </w:r>
+            <w:r>
+              <w:rPr/>
+              <w:t xml:space="preserve"> on any photo</w:t>
+            </w:r>
+          </w:p>
+        </w:tc>
+        <w:tc>
+          <w:tcPr>
+            <w:tcW w:w="4511" w:type="dxa"/>
+            <w:tcBorders/>
+            <w:vAlign w:val="center"/>
+          </w:tcPr>
+          <w:p>
+            <w:pPr>
+              <w:pStyle w:val="TableContents"/>
+              <w:rPr/>
+            </w:pPr>
+            <w:r>
+              <w:rPr/>
+              <w:t>Tags it → appears in correct Collection</w:t>
+            </w:r>
+          </w:p>
+        </w:tc>
+      </w:tr>
+    </w:tbl>
+    <w:p>
+      <w:pPr>
+        <w:pStyle w:val="BodyText"/>
+        <w:bidi w:val="0"/>
+        <w:spacing w:lineRule="auto" w:line="276" w:before="0" w:after="140"/>
+        <w:jc w:val="left"/>
+        <w:rPr>
+          <w:rStyle w:val="Strong"/>
+          <w:b w:val="false"/>
+          <w:bCs w:val="false"/>
+        </w:rPr>
+      </w:pPr>
+      <w:r>
+        <w:rPr/>
+      </w:r>
+    </w:p>
+    <w:p>
+      <w:pPr>
+        <w:pStyle w:val="BodyText"/>
+        <w:bidi w:val="0"/>
+        <w:spacing w:lineRule="auto" w:line="276" w:before="0" w:after="140"/>
+        <w:jc w:val="left"/>
+        <w:rPr>
+          <w:rStyle w:val="Strong"/>
+        </w:rPr>
+      </w:pPr>
+      <w:r>
+        <w:rPr/>
+      </w:r>
+    </w:p>
+    <w:p>
+      <w:pPr>
+        <w:pStyle w:val="BodyText"/>
+        <w:bidi w:val="0"/>
+        <w:spacing w:lineRule="auto" w:line="276" w:before="0" w:after="140"/>
+        <w:jc w:val="left"/>
+        <w:rPr>
+          <w:rStyle w:val="Strong"/>
+        </w:rPr>
+      </w:pPr>
+      <w:r>
+        <w:rPr/>
+      </w:r>
+    </w:p>
+    <w:p>
+      <w:pPr>
         <w:pStyle w:val="BodyText"/>
         <w:bidi w:val="0"/>
         <w:spacing w:lineRule="auto" w:line="276" w:before="0" w:after="140"/>
@@ -179,6 +1687,175 @@
       <w:r>
         <w:rPr/>
       </w:r>
+    </w:p>
+    <w:p>
+      <w:pPr>
+        <w:pStyle w:val="Normal"/>
+        <w:bidi w:val="0"/>
+        <w:jc w:val="left"/>
+        <w:rPr>
+          <w:b/>
+          <w:bCs/>
+        </w:rPr>
+      </w:pPr>
+      <w:r>
+        <w:rPr>
+          <w:b/>
+          <w:bCs/>
+        </w:rPr>
+        <w:t>Patch script to update photo tags:</w:t>
+      </w:r>
+    </w:p>
+    <w:p>
+      <w:pPr>
+        <w:pStyle w:val="Normal"/>
+        <w:bidi w:val="0"/>
+        <w:jc w:val="left"/>
+        <w:rPr/>
+      </w:pPr>
+      <w:r>
+        <w:rPr/>
+      </w:r>
+    </w:p>
+    <w:p>
+      <w:pPr>
+        <w:pStyle w:val="Normal"/>
+        <w:bidi w:val="0"/>
+        <w:jc w:val="left"/>
+        <w:rPr/>
+      </w:pPr>
+      <w:r>
+        <w:rPr/>
+        <w:t>python3 /Users/ncm/Pictures/Mohangraphy/Scripts/patch_tags.py</w:t>
+      </w:r>
+    </w:p>
+    <w:p>
+      <w:pPr>
+        <w:pStyle w:val="Normal"/>
+        <w:bidi w:val="0"/>
+        <w:jc w:val="left"/>
+        <w:rPr/>
+      </w:pPr>
+      <w:r>
+        <w:rPr/>
+      </w:r>
+    </w:p>
+    <w:p>
+      <w:pPr>
+        <w:pStyle w:val="Normal"/>
+        <w:bidi w:val="0"/>
+        <w:jc w:val="left"/>
+        <w:rPr>
+          <w:b/>
+          <w:bCs/>
+        </w:rPr>
+      </w:pPr>
+      <w:r>
+        <w:rPr>
+          <w:b/>
+          <w:bCs/>
+        </w:rPr>
+        <w:t>Blog Writing/Editing</w:t>
+      </w:r>
+    </w:p>
+    <w:p>
+      <w:pPr>
+        <w:pStyle w:val="Normal"/>
+        <w:bidi w:val="0"/>
+        <w:jc w:val="left"/>
+        <w:rPr>
+          <w:rFonts w:ascii="Menlo-Regular" w:hAnsi="Menlo-Regular"/>
+          <w:color w:val="000000"/>
+          <w:sz w:val="22"/>
+        </w:rPr>
+      </w:pPr>
+      <w:r>
+        <w:rPr>
+          <w:rFonts w:ascii="Menlo-Regular" w:hAnsi="Menlo-Regular"/>
+          <w:color w:val="000000"/>
+          <w:sz w:val="22"/>
+        </w:rPr>
+        <w:t>% python3 /Users/ncm/Pictures/Mohangraphy/Scripts/blog_editor.py</w:t>
+      </w:r>
+    </w:p>
+    <w:p>
+      <w:pPr>
+        <w:pStyle w:val="Normal"/>
+        <w:bidi w:val="0"/>
+        <w:jc w:val="left"/>
+        <w:rPr>
+          <w:rFonts w:ascii="Menlo-Regular" w:hAnsi="Menlo-Regular"/>
+          <w:color w:val="000000"/>
+          <w:sz w:val="22"/>
+        </w:rPr>
+      </w:pPr>
+      <w:r>
+        <w:rPr>
+          <w:rFonts w:ascii="Menlo-Regular" w:hAnsi="Menlo-Regular"/>
+          <w:color w:val="000000"/>
+          <w:sz w:val="22"/>
+        </w:rPr>
+      </w:r>
+    </w:p>
+    <w:p>
+      <w:pPr>
+        <w:pStyle w:val="Normal"/>
+        <w:bidi w:val="0"/>
+        <w:jc w:val="left"/>
+        <w:rPr>
+          <w:rFonts w:ascii="Menlo-Regular" w:hAnsi="Menlo-Regular"/>
+          <w:color w:val="000000"/>
+          <w:sz w:val="22"/>
+        </w:rPr>
+      </w:pPr>
+      <w:r>
+        <w:rPr>
+          <w:rFonts w:ascii="Menlo-Regular" w:hAnsi="Menlo-Regular"/>
+          <w:color w:val="000000"/>
+          <w:sz w:val="22"/>
+        </w:rPr>
+        <w:t>cp ~/Downloads/Claude_mohangraphy.py /Users/ncm/Pictures/Mohangraphy/Scripts/</w:t>
+      </w:r>
+    </w:p>
+    <w:p>
+      <w:pPr>
+        <w:pStyle w:val="Normal"/>
+        <w:bidi w:val="0"/>
+        <w:jc w:val="left"/>
+        <w:rPr>
+          <w:rFonts w:ascii="Menlo-Regular" w:hAnsi="Menlo-Regular"/>
+          <w:color w:val="000000"/>
+          <w:sz w:val="22"/>
+        </w:rPr>
+      </w:pPr>
+      <w:r>
+        <w:rPr>
+          <w:rFonts w:ascii="Menlo-Regular" w:hAnsi="Menlo-Regular"/>
+          <w:color w:val="000000"/>
+          <w:sz w:val="22"/>
+        </w:rPr>
+        <w:t>cp ~/Downloads/patch_tags.py /Users/ncm/Pictures/Mohangraphy/Scripts/</w:t>
+      </w:r>
+    </w:p>
+    <w:p>
+      <w:pPr>
+        <w:pStyle w:val="Normal"/>
+        <w:bidi w:val="0"/>
+        <w:jc w:val="left"/>
+        <w:rPr>
+          <w:rFonts w:ascii="Menlo-Regular" w:hAnsi="Menlo-Regular"/>
+          <w:color w:val="000000"/>
+          <w:sz w:val="22"/>
+        </w:rPr>
+      </w:pPr>
+      <w:r>
+        <w:rPr>
+          <w:rFonts w:ascii="Menlo-Regular" w:hAnsi="Menlo-Regular"/>
+          <w:color w:val="000000"/>
+          <w:sz w:val="22"/>
+        </w:rPr>
+        <w:t>python3 /Users/ncm/Pictures/Mohangraphy/Scripts/Claude_mohangraphy.py</w:t>
+      </w:r>
       <w:r>
         <w:br w:type="page"/>
       </w:r>
@@ -187,6 +1864,7 @@
       <w:pPr>
         <w:pStyle w:val="Normal"/>
         <w:bidi w:val="0"/>
+        <w:spacing w:before="0" w:after="0"/>
         <w:jc w:val="left"/>
         <w:rPr/>
       </w:pPr>
@@ -3092,10 +4770,279 @@
       <w:pgNumType w:fmt="decimal"/>
       <w:formProt w:val="false"/>
       <w:textDirection w:val="lrTb"/>
-      <w:docGrid w:type="default" w:linePitch="312" w:charSpace="4294961151"/>
+      <w:docGrid w:type="default" w:linePitch="312" w:charSpace="0"/>
     </w:sectPr>
   </w:body>
 </w:document>
+</file>
+
+<file path=word/numbering.xml><?xml version="1.0" encoding="utf-8"?>
+<w:numbering xmlns:w="http://schemas.openxmlformats.org/wordprocessingml/2006/main" xmlns:o="urn:schemas-microsoft-com:office:office" xmlns:r="http://schemas.openxmlformats.org/officeDocument/2006/relationships" xmlns:v="urn:schemas-microsoft-com:vml" xmlns:mc="http://schemas.openxmlformats.org/markup-compatibility/2006" xmlns:w14="http://schemas.microsoft.com/office/word/2010/wordml" mc:Ignorable="w14">
+  <w:abstractNum w:abstractNumId="1">
+    <w:lvl w:ilvl="0">
+      <w:start w:val="1"/>
+      <w:numFmt w:val="bullet"/>
+      <w:lvlText w:val=""/>
+      <w:lvlJc w:val="left"/>
+      <w:pPr>
+        <w:tabs>
+          <w:tab w:val="num" w:pos="709"/>
+        </w:tabs>
+        <w:ind w:left="709" w:hanging="283"/>
+      </w:pPr>
+      <w:rPr>
+        <w:rFonts w:ascii="Symbol" w:hAnsi="Symbol" w:cs="Symbol" w:hint="default"/>
+      </w:rPr>
+    </w:lvl>
+    <w:lvl w:ilvl="1">
+      <w:start w:val="1"/>
+      <w:numFmt w:val="bullet"/>
+      <w:lvlText w:val=""/>
+      <w:lvlJc w:val="left"/>
+      <w:pPr>
+        <w:tabs>
+          <w:tab w:val="num" w:pos="1418"/>
+        </w:tabs>
+        <w:ind w:left="1418" w:hanging="283"/>
+      </w:pPr>
+      <w:rPr>
+        <w:rFonts w:ascii="Symbol" w:hAnsi="Symbol" w:cs="Symbol" w:hint="default"/>
+      </w:rPr>
+    </w:lvl>
+    <w:lvl w:ilvl="2">
+      <w:start w:val="1"/>
+      <w:numFmt w:val="bullet"/>
+      <w:lvlText w:val=""/>
+      <w:lvlJc w:val="left"/>
+      <w:pPr>
+        <w:tabs>
+          <w:tab w:val="num" w:pos="2127"/>
+        </w:tabs>
+        <w:ind w:left="2127" w:hanging="283"/>
+      </w:pPr>
+      <w:rPr>
+        <w:rFonts w:ascii="Symbol" w:hAnsi="Symbol" w:cs="Symbol" w:hint="default"/>
+      </w:rPr>
+    </w:lvl>
+    <w:lvl w:ilvl="3">
+      <w:start w:val="1"/>
+      <w:numFmt w:val="bullet"/>
+      <w:lvlText w:val=""/>
+      <w:lvlJc w:val="left"/>
+      <w:pPr>
+        <w:tabs>
+          <w:tab w:val="num" w:pos="2836"/>
+        </w:tabs>
+        <w:ind w:left="2836" w:hanging="283"/>
+      </w:pPr>
+      <w:rPr>
+        <w:rFonts w:ascii="Symbol" w:hAnsi="Symbol" w:cs="Symbol" w:hint="default"/>
+      </w:rPr>
+    </w:lvl>
+    <w:lvl w:ilvl="4">
+      <w:start w:val="1"/>
+      <w:numFmt w:val="bullet"/>
+      <w:lvlText w:val=""/>
+      <w:lvlJc w:val="left"/>
+      <w:pPr>
+        <w:tabs>
+          <w:tab w:val="num" w:pos="3545"/>
+        </w:tabs>
+        <w:ind w:left="3545" w:hanging="283"/>
+      </w:pPr>
+      <w:rPr>
+        <w:rFonts w:ascii="Symbol" w:hAnsi="Symbol" w:cs="Symbol" w:hint="default"/>
+      </w:rPr>
+    </w:lvl>
+    <w:lvl w:ilvl="5">
+      <w:start w:val="1"/>
+      <w:numFmt w:val="bullet"/>
+      <w:lvlText w:val=""/>
+      <w:lvlJc w:val="left"/>
+      <w:pPr>
+        <w:tabs>
+          <w:tab w:val="num" w:pos="4254"/>
+        </w:tabs>
+        <w:ind w:left="4254" w:hanging="283"/>
+      </w:pPr>
+      <w:rPr>
+        <w:rFonts w:ascii="Symbol" w:hAnsi="Symbol" w:cs="Symbol" w:hint="default"/>
+      </w:rPr>
+    </w:lvl>
+    <w:lvl w:ilvl="6">
+      <w:start w:val="1"/>
+      <w:numFmt w:val="bullet"/>
+      <w:lvlText w:val=""/>
+      <w:lvlJc w:val="left"/>
+      <w:pPr>
+        <w:tabs>
+          <w:tab w:val="num" w:pos="4963"/>
+        </w:tabs>
+        <w:ind w:left="4963" w:hanging="283"/>
+      </w:pPr>
+      <w:rPr>
+        <w:rFonts w:ascii="Symbol" w:hAnsi="Symbol" w:cs="Symbol" w:hint="default"/>
+      </w:rPr>
+    </w:lvl>
+    <w:lvl w:ilvl="7">
+      <w:start w:val="1"/>
+      <w:numFmt w:val="bullet"/>
+      <w:lvlText w:val=""/>
+      <w:lvlJc w:val="left"/>
+      <w:pPr>
+        <w:tabs>
+          <w:tab w:val="num" w:pos="5672"/>
+        </w:tabs>
+        <w:ind w:left="5672" w:hanging="283"/>
+      </w:pPr>
+      <w:rPr>
+        <w:rFonts w:ascii="Symbol" w:hAnsi="Symbol" w:cs="Symbol" w:hint="default"/>
+      </w:rPr>
+    </w:lvl>
+    <w:lvl w:ilvl="8">
+      <w:start w:val="1"/>
+      <w:numFmt w:val="bullet"/>
+      <w:lvlText w:val=""/>
+      <w:lvlJc w:val="left"/>
+      <w:pPr>
+        <w:tabs>
+          <w:tab w:val="num" w:pos="6381"/>
+        </w:tabs>
+        <w:ind w:left="6381" w:hanging="283"/>
+      </w:pPr>
+      <w:rPr>
+        <w:rFonts w:ascii="Symbol" w:hAnsi="Symbol" w:cs="Symbol" w:hint="default"/>
+      </w:rPr>
+    </w:lvl>
+  </w:abstractNum>
+  <w:abstractNum w:abstractNumId="2">
+    <w:lvl w:ilvl="0">
+      <w:start w:val="1"/>
+      <w:numFmt w:val="none"/>
+      <w:suff w:val="nothing"/>
+      <w:lvlText w:val=""/>
+      <w:lvlJc w:val="left"/>
+      <w:pPr>
+        <w:tabs>
+          <w:tab w:val="num" w:pos="0"/>
+        </w:tabs>
+        <w:ind w:left="0" w:hanging="0"/>
+      </w:pPr>
+    </w:lvl>
+    <w:lvl w:ilvl="1">
+      <w:start w:val="1"/>
+      <w:numFmt w:val="none"/>
+      <w:pStyle w:val="Heading2"/>
+      <w:suff w:val="nothing"/>
+      <w:lvlText w:val=""/>
+      <w:lvlJc w:val="left"/>
+      <w:pPr>
+        <w:tabs>
+          <w:tab w:val="num" w:pos="0"/>
+        </w:tabs>
+        <w:ind w:left="0" w:hanging="0"/>
+      </w:pPr>
+    </w:lvl>
+    <w:lvl w:ilvl="2">
+      <w:start w:val="1"/>
+      <w:numFmt w:val="none"/>
+      <w:pStyle w:val="Heading3"/>
+      <w:suff w:val="nothing"/>
+      <w:lvlText w:val=""/>
+      <w:lvlJc w:val="left"/>
+      <w:pPr>
+        <w:tabs>
+          <w:tab w:val="num" w:pos="0"/>
+        </w:tabs>
+        <w:ind w:left="0" w:hanging="0"/>
+      </w:pPr>
+    </w:lvl>
+    <w:lvl w:ilvl="3">
+      <w:start w:val="1"/>
+      <w:numFmt w:val="none"/>
+      <w:suff w:val="nothing"/>
+      <w:lvlText w:val=""/>
+      <w:lvlJc w:val="left"/>
+      <w:pPr>
+        <w:tabs>
+          <w:tab w:val="num" w:pos="0"/>
+        </w:tabs>
+        <w:ind w:left="0" w:hanging="0"/>
+      </w:pPr>
+    </w:lvl>
+    <w:lvl w:ilvl="4">
+      <w:start w:val="1"/>
+      <w:numFmt w:val="none"/>
+      <w:suff w:val="nothing"/>
+      <w:lvlText w:val=""/>
+      <w:lvlJc w:val="left"/>
+      <w:pPr>
+        <w:tabs>
+          <w:tab w:val="num" w:pos="0"/>
+        </w:tabs>
+        <w:ind w:left="0" w:hanging="0"/>
+      </w:pPr>
+    </w:lvl>
+    <w:lvl w:ilvl="5">
+      <w:start w:val="1"/>
+      <w:numFmt w:val="none"/>
+      <w:suff w:val="nothing"/>
+      <w:lvlText w:val=""/>
+      <w:lvlJc w:val="left"/>
+      <w:pPr>
+        <w:tabs>
+          <w:tab w:val="num" w:pos="0"/>
+        </w:tabs>
+        <w:ind w:left="0" w:hanging="0"/>
+      </w:pPr>
+    </w:lvl>
+    <w:lvl w:ilvl="6">
+      <w:start w:val="1"/>
+      <w:numFmt w:val="none"/>
+      <w:suff w:val="nothing"/>
+      <w:lvlText w:val=""/>
+      <w:lvlJc w:val="left"/>
+      <w:pPr>
+        <w:tabs>
+          <w:tab w:val="num" w:pos="0"/>
+        </w:tabs>
+        <w:ind w:left="0" w:hanging="0"/>
+      </w:pPr>
+    </w:lvl>
+    <w:lvl w:ilvl="7">
+      <w:start w:val="1"/>
+      <w:numFmt w:val="none"/>
+      <w:suff w:val="nothing"/>
+      <w:lvlText w:val=""/>
+      <w:lvlJc w:val="left"/>
+      <w:pPr>
+        <w:tabs>
+          <w:tab w:val="num" w:pos="0"/>
+        </w:tabs>
+        <w:ind w:left="0" w:hanging="0"/>
+      </w:pPr>
+    </w:lvl>
+    <w:lvl w:ilvl="8">
+      <w:start w:val="1"/>
+      <w:numFmt w:val="none"/>
+      <w:suff w:val="nothing"/>
+      <w:lvlText w:val=""/>
+      <w:lvlJc w:val="left"/>
+      <w:pPr>
+        <w:tabs>
+          <w:tab w:val="num" w:pos="0"/>
+        </w:tabs>
+        <w:ind w:left="0" w:hanging="0"/>
+      </w:pPr>
+    </w:lvl>
+  </w:abstractNum>
+  <w:num w:numId="1">
+    <w:abstractNumId w:val="1"/>
+  </w:num>
+  <w:num w:numId="2">
+    <w:abstractNumId w:val="2"/>
+  </w:num>
+</w:numbering>
 </file>
 
 <file path=word/styles.xml><?xml version="1.0" encoding="utf-8"?>
@@ -3112,7 +5059,6 @@
     </w:rPrDefault>
     <w:pPrDefault>
       <w:pPr>
-        <w:widowControl/>
         <w:suppressAutoHyphens w:val="true"/>
       </w:pPr>
     </w:pPrDefault>
@@ -3122,7 +5068,10 @@
     <w:qFormat/>
     <w:pPr>
       <w:widowControl/>
+      <w:suppressAutoHyphens w:val="true"/>
       <w:bidi w:val="0"/>
+      <w:spacing w:before="0" w:after="0"/>
+      <w:jc w:val="left"/>
     </w:pPr>
     <w:rPr>
       <w:rFonts w:ascii="Helvetica Neue" w:hAnsi="Helvetica Neue" w:eastAsia="Songti SC" w:cs="Arial Unicode MS"/>
@@ -3131,6 +5080,40 @@
       <w:sz w:val="24"/>
       <w:szCs w:val="24"/>
       <w:lang w:val="en-GB" w:eastAsia="zh-CN" w:bidi="hi-IN"/>
+    </w:rPr>
+  </w:style>
+  <w:style w:type="paragraph" w:styleId="Heading2">
+    <w:name w:val="heading 2"/>
+    <w:basedOn w:val="Heading"/>
+    <w:next w:val="BodyText"/>
+    <w:qFormat/>
+    <w:pPr>
+      <w:spacing w:before="200" w:after="120"/>
+      <w:outlineLvl w:val="1"/>
+    </w:pPr>
+    <w:rPr>
+      <w:rFonts w:ascii="Liberation Serif" w:hAnsi="Liberation Serif" w:eastAsia="Songti SC" w:cs="Arial Unicode MS"/>
+      <w:b/>
+      <w:bCs/>
+      <w:sz w:val="36"/>
+      <w:szCs w:val="36"/>
+    </w:rPr>
+  </w:style>
+  <w:style w:type="paragraph" w:styleId="Heading3">
+    <w:name w:val="heading 3"/>
+    <w:basedOn w:val="Heading"/>
+    <w:next w:val="BodyText"/>
+    <w:qFormat/>
+    <w:pPr>
+      <w:spacing w:before="140" w:after="120"/>
+      <w:outlineLvl w:val="2"/>
+    </w:pPr>
+    <w:rPr>
+      <w:rFonts w:ascii="Liberation Serif" w:hAnsi="Liberation Serif" w:eastAsia="Songti SC" w:cs="Arial Unicode MS"/>
+      <w:b/>
+      <w:bCs/>
+      <w:sz w:val="28"/>
+      <w:szCs w:val="28"/>
     </w:rPr>
   </w:style>
   <w:style w:type="character" w:styleId="Strong">
@@ -3146,6 +5129,13 @@
     <w:qFormat/>
     <w:rPr>
       <w:rFonts w:ascii="Liberation Mono" w:hAnsi="Liberation Mono" w:eastAsia="Liberation Mono" w:cs="Liberation Mono"/>
+    </w:rPr>
+  </w:style>
+  <w:style w:type="character" w:styleId="Bullets">
+    <w:name w:val="Bullets"/>
+    <w:qFormat/>
+    <w:rPr>
+      <w:rFonts w:ascii="OpenSymbol" w:hAnsi="OpenSymbol" w:eastAsia="OpenSymbol" w:cs="OpenSymbol"/>
     </w:rPr>
   </w:style>
   <w:style w:type="paragraph" w:styleId="Heading">
@@ -3217,6 +5207,46 @@
       <w:rFonts w:ascii="Liberation Mono" w:hAnsi="Liberation Mono" w:eastAsia="Liberation Mono" w:cs="Liberation Mono"/>
       <w:sz w:val="20"/>
       <w:szCs w:val="20"/>
+    </w:rPr>
+  </w:style>
+  <w:style w:type="paragraph" w:styleId="HorizontalLine">
+    <w:name w:val="Horizontal Line"/>
+    <w:basedOn w:val="Normal"/>
+    <w:next w:val="BodyText"/>
+    <w:qFormat/>
+    <w:pPr>
+      <w:suppressLineNumbers/>
+      <w:pBdr>
+        <w:bottom w:val="double" w:sz="2" w:space="0" w:color="808080"/>
+      </w:pBdr>
+      <w:spacing w:before="0" w:after="283"/>
+    </w:pPr>
+    <w:rPr>
+      <w:sz w:val="12"/>
+      <w:szCs w:val="12"/>
+    </w:rPr>
+  </w:style>
+  <w:style w:type="paragraph" w:styleId="TableContents">
+    <w:name w:val="Table Contents"/>
+    <w:basedOn w:val="Normal"/>
+    <w:qFormat/>
+    <w:pPr>
+      <w:widowControl w:val="false"/>
+      <w:suppressLineNumbers/>
+    </w:pPr>
+    <w:rPr/>
+  </w:style>
+  <w:style w:type="paragraph" w:styleId="TableHeading">
+    <w:name w:val="Table Heading"/>
+    <w:basedOn w:val="TableContents"/>
+    <w:qFormat/>
+    <w:pPr>
+      <w:suppressLineNumbers/>
+      <w:jc w:val="center"/>
+    </w:pPr>
+    <w:rPr>
+      <w:b/>
+      <w:bCs/>
     </w:rPr>
   </w:style>
 </w:styles>

</xml_diff>

<commit_message>
Deploy 2026-04-04 08:09 — 5 file(s) updated
</commit_message>
<xml_diff>
--- a/Claude Notes.docx
+++ b/Claude Notes.docx
@@ -38,7 +38,13 @@
         </w:rPr>
       </w:pPr>
       <w:r>
-        <w:rPr/>
+        <w:rPr>
+          <w:rFonts w:ascii="Helvetica" w:hAnsi="Helvetica"/>
+          <w:b w:val="false"/>
+          <w:bCs w:val="false"/>
+          <w:sz w:val="20"/>
+          <w:szCs w:val="20"/>
+        </w:rPr>
       </w:r>
     </w:p>
     <w:p>
@@ -122,9 +128,11 @@
       </w:pPr>
       <w:r>
         <w:rPr>
-          <w:rFonts w:eastAsia="Songti SC" w:cs="Arial Unicode MS" w:ascii="Helvetica Neue" w:hAnsi="Helvetica Neue"/>
-          <w:sz w:val="24"/>
-          <w:szCs w:val="24"/>
+          <w:rFonts w:ascii="Helvetica" w:hAnsi="Helvetica"/>
+          <w:color w:val="6E7687"/>
+          <w:sz w:val="20"/>
+          <w:szCs w:val="20"/>
+          <w:shd w:fill="auto" w:val="clear"/>
         </w:rPr>
       </w:r>
     </w:p>
@@ -229,22 +237,24 @@
       </w:pPr>
       <w:r>
         <w:rPr>
+          <w:rFonts w:ascii="Helvetica" w:hAnsi="Helvetica"/>
+          <w:color w:val="6E7687"/>
+          <w:sz w:val="20"/>
+          <w:szCs w:val="20"/>
+          <w:shd w:fill="auto" w:val="clear"/>
+        </w:rPr>
+      </w:r>
+    </w:p>
+    <w:p>
+      <w:pPr>
+        <w:pStyle w:val="PreformattedText"/>
+        <w:spacing w:lineRule="auto" w:line="240" w:before="0" w:after="0"/>
+        <w:ind w:hanging="0" w:left="0" w:right="0"/>
+        <w:rPr>
           <w:rFonts w:ascii="Helvetica Neue" w:hAnsi="Helvetica Neue"/>
           <w:sz w:val="24"/>
           <w:szCs w:val="24"/>
         </w:rPr>
-      </w:r>
-    </w:p>
-    <w:p>
-      <w:pPr>
-        <w:pStyle w:val="PreformattedText"/>
-        <w:spacing w:lineRule="auto" w:line="240" w:before="0" w:after="0"/>
-        <w:ind w:hanging="0" w:left="0" w:right="0"/>
-        <w:rPr>
-          <w:rFonts w:ascii="Helvetica Neue" w:hAnsi="Helvetica Neue"/>
-          <w:sz w:val="24"/>
-          <w:szCs w:val="24"/>
-        </w:rPr>
       </w:pPr>
       <w:r>
         <w:rPr>
@@ -296,9 +306,11 @@
       </w:pPr>
       <w:r>
         <w:rPr>
-          <w:rFonts w:eastAsia="Songti SC" w:cs="Arial Unicode MS" w:ascii="Helvetica Neue" w:hAnsi="Helvetica Neue"/>
-          <w:sz w:val="24"/>
-          <w:szCs w:val="24"/>
+          <w:rFonts w:ascii="Helvetica" w:hAnsi="Helvetica"/>
+          <w:color w:val="14181F"/>
+          <w:sz w:val="20"/>
+          <w:szCs w:val="20"/>
+          <w:shd w:fill="auto" w:val="clear"/>
         </w:rPr>
       </w:r>
     </w:p>
@@ -649,25 +661,29 @@
         </w:rPr>
       </w:pPr>
       <w:r>
-        <w:rPr/>
-      </w:r>
-    </w:p>
-    <w:p>
-      <w:pPr>
-        <w:pStyle w:val="PreformattedText"/>
-        <w:bidi w:val="0"/>
-        <w:spacing w:lineRule="auto" w:line="240" w:before="0" w:after="0"/>
-        <w:ind w:hanging="0" w:left="0" w:right="0"/>
-        <w:jc w:val="left"/>
-        <w:rPr/>
-      </w:pPr>
-      <w:r>
-        <w:rPr>
-          <w:rStyle w:val="SourceText"/>
+        <w:rPr>
           <w:rFonts w:ascii="Helvetica" w:hAnsi="Helvetica"/>
           <w:color w:val="14181F"/>
           <w:shd w:fill="auto" w:val="clear"/>
         </w:rPr>
+      </w:r>
+    </w:p>
+    <w:p>
+      <w:pPr>
+        <w:pStyle w:val="PreformattedText"/>
+        <w:bidi w:val="0"/>
+        <w:spacing w:lineRule="auto" w:line="240" w:before="0" w:after="0"/>
+        <w:ind w:hanging="0" w:left="0" w:right="0"/>
+        <w:jc w:val="left"/>
+        <w:rPr/>
+      </w:pPr>
+      <w:r>
+        <w:rPr>
+          <w:rStyle w:val="SourceText"/>
+          <w:rFonts w:ascii="Helvetica" w:hAnsi="Helvetica"/>
+          <w:color w:val="14181F"/>
+          <w:shd w:fill="auto" w:val="clear"/>
+        </w:rPr>
         <w:t>python3 /Users/ncm/Pictures/Mohangraphy/Scripts/deploy.py</w:t>
       </w:r>
     </w:p>
@@ -749,11 +765,245 @@
         </w:rPr>
       </w:pPr>
       <w:r>
+        <w:rPr>
+          <w:rFonts w:ascii="Helvetica" w:hAnsi="Helvetica"/>
+          <w:color w:val="14181F"/>
+          <w:sz w:val="20"/>
+          <w:szCs w:val="20"/>
+          <w:shd w:fill="auto" w:val="clear"/>
+        </w:rPr>
+      </w:r>
+    </w:p>
+    <w:p>
+      <w:pPr>
+        <w:pStyle w:val="PreformattedText"/>
+        <w:spacing w:lineRule="auto" w:line="240" w:before="0" w:after="0"/>
+        <w:ind w:hanging="0" w:left="0" w:right="0"/>
         <w:rPr>
           <w:rFonts w:ascii="Helvetica Neue" w:hAnsi="Helvetica Neue"/>
           <w:sz w:val="24"/>
           <w:szCs w:val="24"/>
         </w:rPr>
+      </w:pPr>
+      <w:r>
+        <w:rPr>
+          <w:rStyle w:val="SourceText"/>
+          <w:rFonts w:ascii="Helvetica" w:hAnsi="Helvetica"/>
+          <w:color w:val="14181F"/>
+          <w:sz w:val="20"/>
+          <w:szCs w:val="20"/>
+          <w:shd w:fill="auto" w:val="clear"/>
+        </w:rPr>
+        <w:t>python3 /Users/ncm/Pictures/Mohangraphy/Scripts/blog_editor.py</w:t>
+      </w:r>
+    </w:p>
+    <w:p>
+      <w:pPr>
+        <w:pStyle w:val="PreformattedText"/>
+        <w:spacing w:lineRule="auto" w:line="240" w:before="0" w:after="0"/>
+        <w:ind w:hanging="0" w:left="0" w:right="0"/>
+        <w:rPr>
+          <w:rStyle w:val="SourceText"/>
+          <w:rFonts w:ascii="Helvetica" w:hAnsi="Helvetica"/>
+          <w:color w:val="6E7687"/>
+          <w:sz w:val="20"/>
+          <w:szCs w:val="20"/>
+          <w:shd w:fill="auto" w:val="clear"/>
+        </w:rPr>
+      </w:pPr>
+      <w:r>
+        <w:rPr>
+          <w:rFonts w:ascii="Helvetica" w:hAnsi="Helvetica"/>
+          <w:color w:val="6E7687"/>
+          <w:sz w:val="20"/>
+          <w:szCs w:val="20"/>
+          <w:shd w:fill="auto" w:val="clear"/>
+        </w:rPr>
+      </w:r>
+    </w:p>
+    <w:p>
+      <w:pPr>
+        <w:pStyle w:val="PreformattedText"/>
+        <w:spacing w:lineRule="auto" w:line="240" w:before="0" w:after="0"/>
+        <w:ind w:hanging="0" w:left="0" w:right="0"/>
+        <w:rPr>
+          <w:rFonts w:ascii="Helvetica Neue" w:hAnsi="Helvetica Neue" w:eastAsia="Songti SC" w:cs="Arial Unicode MS"/>
+          <w:sz w:val="24"/>
+          <w:szCs w:val="24"/>
+        </w:rPr>
+      </w:pPr>
+      <w:r>
+        <w:rPr>
+          <w:rStyle w:val="SourceText"/>
+          <w:rFonts w:ascii="Helvetica" w:hAnsi="Helvetica"/>
+          <w:color w:val="6E7687"/>
+          <w:sz w:val="20"/>
+          <w:szCs w:val="20"/>
+          <w:shd w:fill="auto" w:val="clear"/>
+        </w:rPr>
+        <w:t># Choose "New post" → fill in the Mac dialogs → Done</w:t>
+      </w:r>
+    </w:p>
+    <w:p>
+      <w:pPr>
+        <w:pStyle w:val="PreformattedText"/>
+        <w:spacing w:lineRule="auto" w:line="240" w:before="0" w:after="0"/>
+        <w:ind w:hanging="0" w:left="0" w:right="0"/>
+        <w:rPr>
+          <w:rFonts w:ascii="Helvetica Neue" w:hAnsi="Helvetica Neue" w:eastAsia="Songti SC" w:cs="Arial Unicode MS"/>
+          <w:sz w:val="24"/>
+          <w:szCs w:val="24"/>
+        </w:rPr>
+      </w:pPr>
+      <w:r>
+        <w:rPr>
+          <w:rStyle w:val="SourceText"/>
+          <w:rFonts w:ascii="Helvetica" w:hAnsi="Helvetica"/>
+          <w:color w:val="6E7687"/>
+          <w:sz w:val="20"/>
+          <w:szCs w:val="20"/>
+          <w:shd w:fill="auto" w:val="clear"/>
+        </w:rPr>
+        <w:t># Then deploy:</w:t>
+      </w:r>
+    </w:p>
+    <w:p>
+      <w:pPr>
+        <w:pStyle w:val="PreformattedText"/>
+        <w:bidi w:val="0"/>
+        <w:spacing w:lineRule="auto" w:line="240" w:before="0" w:after="0"/>
+        <w:ind w:hanging="0" w:left="0" w:right="0"/>
+        <w:jc w:val="left"/>
+        <w:rPr>
+          <w:rStyle w:val="SourceText"/>
+          <w:rFonts w:ascii="Helvetica" w:hAnsi="Helvetica"/>
+          <w:color w:val="14181F"/>
+          <w:sz w:val="20"/>
+          <w:szCs w:val="20"/>
+          <w:shd w:fill="auto" w:val="clear"/>
+        </w:rPr>
+      </w:pPr>
+      <w:r>
+        <w:rPr>
+          <w:rFonts w:ascii="Helvetica" w:hAnsi="Helvetica"/>
+          <w:color w:val="14181F"/>
+          <w:sz w:val="20"/>
+          <w:szCs w:val="20"/>
+          <w:shd w:fill="auto" w:val="clear"/>
+        </w:rPr>
+      </w:r>
+    </w:p>
+    <w:p>
+      <w:pPr>
+        <w:pStyle w:val="PreformattedText"/>
+        <w:spacing w:lineRule="auto" w:line="240" w:before="0" w:after="0"/>
+        <w:rPr>
+          <w:rFonts w:ascii="Helvetica Neue" w:hAnsi="Helvetica Neue" w:eastAsia="Songti SC" w:cs="Arial Unicode MS"/>
+          <w:sz w:val="24"/>
+          <w:szCs w:val="24"/>
+        </w:rPr>
+      </w:pPr>
+      <w:r>
+        <w:rPr>
+          <w:rStyle w:val="SourceText"/>
+          <w:rFonts w:ascii="Helvetica" w:hAnsi="Helvetica"/>
+          <w:color w:val="14181F"/>
+          <w:sz w:val="20"/>
+          <w:szCs w:val="20"/>
+          <w:shd w:fill="auto" w:val="clear"/>
+        </w:rPr>
+        <w:t>python3 /Users/ncm/Pictures/Mohangraphy/Scripts/Claude_mohangraphy.py</w:t>
+      </w:r>
+    </w:p>
+    <w:p>
+      <w:pPr>
+        <w:pStyle w:val="HorizontalLine"/>
+        <w:spacing w:lineRule="auto" w:line="240" w:before="0" w:after="0"/>
+        <w:rPr>
+          <w:rFonts w:ascii="Helvetica" w:hAnsi="Helvetica"/>
+          <w:sz w:val="20"/>
+          <w:szCs w:val="20"/>
+        </w:rPr>
+      </w:pPr>
+      <w:r>
+        <w:rPr>
+          <w:rFonts w:ascii="Helvetica" w:hAnsi="Helvetica"/>
+          <w:sz w:val="20"/>
+          <w:szCs w:val="20"/>
+        </w:rPr>
+      </w:r>
+    </w:p>
+    <w:p>
+      <w:pPr>
+        <w:pStyle w:val="Heading3"/>
+        <w:spacing w:lineRule="auto" w:line="240" w:before="0" w:after="0"/>
+        <w:rPr>
+          <w:rFonts w:ascii="Helvetica" w:hAnsi="Helvetica"/>
+          <w:b w:val="false"/>
+          <w:bCs w:val="false"/>
+          <w:sz w:val="20"/>
+          <w:szCs w:val="20"/>
+        </w:rPr>
+      </w:pPr>
+      <w:r>
+        <w:rPr>
+          <w:rFonts w:ascii="Helvetica" w:hAnsi="Helvetica"/>
+          <w:b w:val="false"/>
+          <w:bCs w:val="false"/>
+          <w:sz w:val="20"/>
+          <w:szCs w:val="20"/>
+        </w:rPr>
+      </w:r>
+    </w:p>
+    <w:p>
+      <w:pPr>
+        <w:pStyle w:val="Heading3"/>
+        <w:spacing w:lineRule="auto" w:line="240" w:before="0" w:after="0"/>
+        <w:rPr>
+          <w:rFonts w:ascii="Helvetica" w:hAnsi="Helvetica"/>
+          <w:b/>
+          <w:bCs/>
+          <w:sz w:val="20"/>
+          <w:szCs w:val="20"/>
+        </w:rPr>
+      </w:pPr>
+      <w:r>
+        <w:rPr>
+          <w:rFonts w:ascii="Helvetica" w:hAnsi="Helvetica"/>
+          <w:b/>
+          <w:bCs/>
+          <w:sz w:val="20"/>
+          <w:szCs w:val="20"/>
+        </w:rPr>
+        <w:t>Editing an existing blog post</w:t>
+      </w:r>
+    </w:p>
+    <w:p>
+      <w:pPr>
+        <w:pStyle w:val="PreformattedText"/>
+        <w:spacing w:lineRule="auto" w:line="240" w:before="0" w:after="0"/>
+        <w:ind w:hanging="0" w:left="0" w:right="0"/>
+        <w:rPr>
+          <w:rStyle w:val="SourceText"/>
+          <w:rFonts w:ascii="Helvetica" w:hAnsi="Helvetica"/>
+          <w:b/>
+          <w:bCs/>
+          <w:color w:val="14181F"/>
+          <w:sz w:val="20"/>
+          <w:szCs w:val="20"/>
+          <w:shd w:fill="auto" w:val="clear"/>
+        </w:rPr>
+      </w:pPr>
+      <w:r>
+        <w:rPr>
+          <w:rFonts w:ascii="Helvetica" w:hAnsi="Helvetica"/>
+          <w:b/>
+          <w:bCs/>
+          <w:color w:val="14181F"/>
+          <w:sz w:val="20"/>
+          <w:szCs w:val="20"/>
+          <w:shd w:fill="auto" w:val="clear"/>
+        </w:rPr>
       </w:r>
     </w:p>
     <w:p>
@@ -795,9 +1045,11 @@
       </w:pPr>
       <w:r>
         <w:rPr>
-          <w:rFonts w:eastAsia="Songti SC" w:cs="Arial Unicode MS" w:ascii="Helvetica Neue" w:hAnsi="Helvetica Neue"/>
-          <w:sz w:val="24"/>
-          <w:szCs w:val="24"/>
+          <w:rFonts w:ascii="Helvetica" w:hAnsi="Helvetica"/>
+          <w:color w:val="6E7687"/>
+          <w:sz w:val="20"/>
+          <w:szCs w:val="20"/>
+          <w:shd w:fill="auto" w:val="clear"/>
         </w:rPr>
       </w:r>
     </w:p>
@@ -821,14 +1073,36 @@
           <w:szCs w:val="20"/>
           <w:shd w:fill="auto" w:val="clear"/>
         </w:rPr>
-        <w:t># Choose "New post" → fill in the Mac dialogs → Done</w:t>
+        <w:t># Choose "Edit: [post name]" → make changes → Done → deploy</w:t>
       </w:r>
     </w:p>
     <w:p>
       <w:pPr>
         <w:pStyle w:val="PreformattedText"/>
         <w:spacing w:lineRule="auto" w:line="240" w:before="0" w:after="0"/>
-        <w:ind w:hanging="0" w:left="0" w:right="0"/>
+        <w:rPr>
+          <w:rStyle w:val="SourceText"/>
+          <w:rFonts w:ascii="Helvetica" w:hAnsi="Helvetica"/>
+          <w:color w:val="14181F"/>
+          <w:sz w:val="20"/>
+          <w:szCs w:val="20"/>
+          <w:shd w:fill="auto" w:val="clear"/>
+        </w:rPr>
+      </w:pPr>
+      <w:r>
+        <w:rPr>
+          <w:rFonts w:ascii="Helvetica" w:hAnsi="Helvetica"/>
+          <w:color w:val="14181F"/>
+          <w:sz w:val="20"/>
+          <w:szCs w:val="20"/>
+          <w:shd w:fill="auto" w:val="clear"/>
+        </w:rPr>
+      </w:r>
+    </w:p>
+    <w:p>
+      <w:pPr>
+        <w:pStyle w:val="PreformattedText"/>
+        <w:spacing w:lineRule="auto" w:line="240" w:before="0" w:after="0"/>
         <w:rPr>
           <w:rFonts w:ascii="Helvetica Neue" w:hAnsi="Helvetica Neue" w:eastAsia="Songti SC" w:cs="Arial Unicode MS"/>
           <w:sz w:val="24"/>
@@ -839,38 +1113,153 @@
         <w:rPr>
           <w:rStyle w:val="SourceText"/>
           <w:rFonts w:ascii="Helvetica" w:hAnsi="Helvetica"/>
+          <w:color w:val="14181F"/>
+          <w:sz w:val="20"/>
+          <w:szCs w:val="20"/>
+          <w:shd w:fill="auto" w:val="clear"/>
+        </w:rPr>
+        <w:t>python3 /Users/ncm/Pictures/Mohangraphy/Scripts/Claude_mohangraphy.py</w:t>
+      </w:r>
+    </w:p>
+    <w:p>
+      <w:pPr>
+        <w:pStyle w:val="HorizontalLine"/>
+        <w:spacing w:lineRule="auto" w:line="240" w:before="0" w:after="0"/>
+        <w:rPr>
+          <w:rFonts w:ascii="Helvetica" w:hAnsi="Helvetica"/>
+          <w:sz w:val="20"/>
+          <w:szCs w:val="20"/>
+        </w:rPr>
+      </w:pPr>
+      <w:r>
+        <w:rPr>
+          <w:rFonts w:ascii="Helvetica" w:hAnsi="Helvetica"/>
+          <w:sz w:val="20"/>
+          <w:szCs w:val="20"/>
+        </w:rPr>
+      </w:r>
+    </w:p>
+    <w:p>
+      <w:pPr>
+        <w:pStyle w:val="Heading3"/>
+        <w:spacing w:lineRule="auto" w:line="240" w:before="0" w:after="0"/>
+        <w:rPr>
+          <w:rFonts w:ascii="Helvetica" w:hAnsi="Helvetica"/>
+          <w:b w:val="false"/>
+          <w:bCs w:val="false"/>
+          <w:sz w:val="20"/>
+          <w:szCs w:val="20"/>
+        </w:rPr>
+      </w:pPr>
+      <w:r>
+        <w:rPr>
+          <w:rFonts w:ascii="Helvetica" w:hAnsi="Helvetica"/>
+          <w:b w:val="false"/>
+          <w:bCs w:val="false"/>
+          <w:sz w:val="20"/>
+          <w:szCs w:val="20"/>
+        </w:rPr>
+      </w:r>
+    </w:p>
+    <w:p>
+      <w:pPr>
+        <w:pStyle w:val="Heading3"/>
+        <w:spacing w:lineRule="auto" w:line="240" w:before="0" w:after="0"/>
+        <w:rPr>
+          <w:rFonts w:ascii="Helvetica" w:hAnsi="Helvetica"/>
+          <w:b/>
+          <w:bCs/>
+          <w:sz w:val="20"/>
+          <w:szCs w:val="20"/>
+        </w:rPr>
+      </w:pPr>
+      <w:r>
+        <w:rPr>
+          <w:rFonts w:ascii="Helvetica" w:hAnsi="Helvetica"/>
+          <w:b/>
+          <w:bCs/>
+          <w:sz w:val="20"/>
+          <w:szCs w:val="20"/>
+        </w:rPr>
+        <w:t>Downloading subscriber data</w:t>
+      </w:r>
+    </w:p>
+    <w:p>
+      <w:pPr>
+        <w:pStyle w:val="PreformattedText"/>
+        <w:spacing w:lineRule="auto" w:line="240" w:before="0" w:after="0"/>
+        <w:ind w:hanging="0" w:left="0" w:right="0"/>
+        <w:rPr>
+          <w:rStyle w:val="SourceText"/>
+          <w:rFonts w:ascii="Helvetica" w:hAnsi="Helvetica"/>
+          <w:color w:val="14181F"/>
+          <w:sz w:val="20"/>
+          <w:szCs w:val="20"/>
+          <w:shd w:fill="auto" w:val="clear"/>
+        </w:rPr>
+      </w:pPr>
+      <w:r>
+        <w:rPr>
+          <w:rFonts w:ascii="Helvetica" w:hAnsi="Helvetica"/>
+          <w:color w:val="14181F"/>
+          <w:sz w:val="20"/>
+          <w:szCs w:val="20"/>
+          <w:shd w:fill="auto" w:val="clear"/>
+        </w:rPr>
+      </w:r>
+    </w:p>
+    <w:p>
+      <w:pPr>
+        <w:pStyle w:val="PreformattedText"/>
+        <w:spacing w:lineRule="auto" w:line="240" w:before="0" w:after="0"/>
+        <w:ind w:hanging="0" w:left="0" w:right="0"/>
+        <w:rPr>
+          <w:rFonts w:ascii="Helvetica Neue" w:hAnsi="Helvetica Neue"/>
+          <w:sz w:val="24"/>
+          <w:szCs w:val="24"/>
+        </w:rPr>
+      </w:pPr>
+      <w:r>
+        <w:rPr>
+          <w:rStyle w:val="SourceText"/>
+          <w:rFonts w:ascii="Helvetica" w:hAnsi="Helvetica"/>
+          <w:color w:val="14181F"/>
+          <w:sz w:val="20"/>
+          <w:szCs w:val="20"/>
+          <w:shd w:fill="auto" w:val="clear"/>
+        </w:rPr>
+        <w:t>python3 /Users/ncm/Pictures/Mohangraphy/Scripts/list_subscribers.py</w:t>
+      </w:r>
+    </w:p>
+    <w:p>
+      <w:pPr>
+        <w:pStyle w:val="PreformattedText"/>
+        <w:spacing w:lineRule="auto" w:line="240" w:before="0" w:after="0"/>
+        <w:ind w:hanging="0" w:left="0" w:right="0"/>
+        <w:rPr>
+          <w:rStyle w:val="SourceText"/>
+          <w:rFonts w:ascii="Helvetica" w:hAnsi="Helvetica"/>
           <w:color w:val="6E7687"/>
           <w:sz w:val="20"/>
           <w:szCs w:val="20"/>
           <w:shd w:fill="auto" w:val="clear"/>
         </w:rPr>
-        <w:t># Then deploy:</w:t>
+      </w:pPr>
+      <w:r>
+        <w:rPr>
+          <w:rFonts w:ascii="Helvetica" w:hAnsi="Helvetica"/>
+          <w:color w:val="6E7687"/>
+          <w:sz w:val="20"/>
+          <w:szCs w:val="20"/>
+          <w:shd w:fill="auto" w:val="clear"/>
+        </w:rPr>
       </w:r>
     </w:p>
     <w:p>
       <w:pPr>
         <w:pStyle w:val="PreformattedText"/>
-        <w:bidi w:val="0"/>
         <w:spacing w:lineRule="auto" w:line="240" w:before="0" w:after="0"/>
         <w:ind w:hanging="0" w:left="0" w:right="0"/>
-        <w:jc w:val="left"/>
-        <w:rPr>
-          <w:rStyle w:val="SourceText"/>
-          <w:rFonts w:ascii="Helvetica" w:hAnsi="Helvetica"/>
-          <w:color w:val="14181F"/>
-          <w:sz w:val="20"/>
-          <w:szCs w:val="20"/>
-          <w:shd w:fill="auto" w:val="clear"/>
-        </w:rPr>
-      </w:pPr>
-      <w:r>
-        <w:rPr/>
-      </w:r>
-    </w:p>
-    <w:p>
-      <w:pPr>
-        <w:pStyle w:val="PreformattedText"/>
-        <w:spacing w:lineRule="auto" w:line="240" w:before="0" w:after="0"/>
         <w:rPr>
           <w:rFonts w:ascii="Helvetica Neue" w:hAnsi="Helvetica Neue" w:eastAsia="Songti SC" w:cs="Arial Unicode MS"/>
           <w:sz w:val="24"/>
@@ -881,12 +1270,12 @@
         <w:rPr>
           <w:rStyle w:val="SourceText"/>
           <w:rFonts w:ascii="Helvetica" w:hAnsi="Helvetica"/>
-          <w:color w:val="14181F"/>
+          <w:color w:val="6E7687"/>
           <w:sz w:val="20"/>
           <w:szCs w:val="20"/>
           <w:shd w:fill="auto" w:val="clear"/>
         </w:rPr>
-        <w:t>python3 /Users/ncm/Pictures/Mohangraphy/Scripts/Claude_mohangraphy.py</w:t>
+        <w:t># Saves an Excel file in Scripts/ with name, email, date subscribed</w:t>
       </w:r>
     </w:p>
     <w:p>
@@ -949,31 +1338,275 @@
           <w:sz w:val="20"/>
           <w:szCs w:val="20"/>
         </w:rPr>
-        <w:t>Editing an existing blog post</w:t>
-      </w:r>
-    </w:p>
-    <w:p>
-      <w:pPr>
-        <w:pStyle w:val="PreformattedText"/>
-        <w:spacing w:lineRule="auto" w:line="240" w:before="0" w:after="0"/>
-        <w:ind w:hanging="0" w:left="0" w:right="0"/>
-        <w:rPr>
-          <w:rStyle w:val="SourceText"/>
+      </w:r>
+      <w:r>
+        <w:br w:type="page"/>
+      </w:r>
+    </w:p>
+    <w:p>
+      <w:pPr>
+        <w:pStyle w:val="Heading3"/>
+        <w:spacing w:lineRule="auto" w:line="240" w:before="0" w:after="0"/>
+        <w:rPr>
           <w:rFonts w:ascii="Helvetica" w:hAnsi="Helvetica"/>
           <w:b/>
           <w:bCs/>
-          <w:color w:val="14181F"/>
+          <w:sz w:val="20"/>
+          <w:szCs w:val="20"/>
+        </w:rPr>
+      </w:pPr>
+      <w:r>
+        <w:rPr>
+          <w:rFonts w:ascii="Helvetica" w:hAnsi="Helvetica"/>
+          <w:b/>
+          <w:bCs/>
+          <w:sz w:val="20"/>
+          <w:szCs w:val="20"/>
+        </w:rPr>
+        <w:t>Full typical work session (sequential order)</w:t>
+      </w:r>
+    </w:p>
+    <w:p>
+      <w:pPr>
+        <w:pStyle w:val="PreformattedText"/>
+        <w:spacing w:lineRule="auto" w:line="240" w:before="0" w:after="0"/>
+        <w:ind w:hanging="0" w:left="0" w:right="0"/>
+        <w:rPr>
+          <w:rStyle w:val="SourceText"/>
+          <w:rFonts w:ascii="Helvetica" w:hAnsi="Helvetica"/>
+          <w:b/>
+          <w:bCs/>
+          <w:color w:val="6E7687"/>
           <w:sz w:val="20"/>
           <w:szCs w:val="20"/>
           <w:shd w:fill="auto" w:val="clear"/>
         </w:rPr>
       </w:pPr>
       <w:r>
+        <w:rPr>
+          <w:rFonts w:ascii="Helvetica" w:hAnsi="Helvetica"/>
+          <w:b/>
+          <w:bCs/>
+          <w:color w:val="6E7687"/>
+          <w:sz w:val="20"/>
+          <w:szCs w:val="20"/>
+          <w:shd w:fill="auto" w:val="clear"/>
+        </w:rPr>
+      </w:r>
+    </w:p>
+    <w:p>
+      <w:pPr>
+        <w:pStyle w:val="PreformattedText"/>
+        <w:spacing w:lineRule="auto" w:line="240" w:before="0" w:after="0"/>
+        <w:ind w:hanging="0" w:left="0" w:right="0"/>
         <w:rPr>
           <w:rFonts w:ascii="Helvetica Neue" w:hAnsi="Helvetica Neue"/>
           <w:sz w:val="24"/>
           <w:szCs w:val="24"/>
         </w:rPr>
+      </w:pPr>
+      <w:r>
+        <w:rPr>
+          <w:rStyle w:val="SourceText"/>
+          <w:rFonts w:ascii="Helvetica" w:hAnsi="Helvetica"/>
+          <w:color w:val="6E7687"/>
+          <w:sz w:val="20"/>
+          <w:szCs w:val="20"/>
+          <w:shd w:fill="auto" w:val="clear"/>
+        </w:rPr>
+        <w:t># 1. Start admin server</w:t>
+      </w:r>
+    </w:p>
+    <w:p>
+      <w:pPr>
+        <w:pStyle w:val="PreformattedText"/>
+        <w:spacing w:lineRule="auto" w:line="240" w:before="0" w:after="0"/>
+        <w:rPr>
+          <w:rFonts w:ascii="Helvetica Neue" w:hAnsi="Helvetica Neue" w:eastAsia="Songti SC" w:cs="Arial Unicode MS"/>
+          <w:sz w:val="24"/>
+          <w:szCs w:val="24"/>
+        </w:rPr>
+      </w:pPr>
+      <w:r>
+        <w:rPr>
+          <w:rStyle w:val="SourceText"/>
+          <w:rFonts w:ascii="Helvetica" w:hAnsi="Helvetica"/>
+          <w:color w:val="14181F"/>
+          <w:sz w:val="20"/>
+          <w:szCs w:val="20"/>
+          <w:shd w:fill="auto" w:val="clear"/>
+        </w:rPr>
+        <w:t>python3 /Users/ncm/Pictures/Mohangraphy/Scripts/patch_tags.py</w:t>
+      </w:r>
+    </w:p>
+    <w:p>
+      <w:pPr>
+        <w:pStyle w:val="PreformattedText"/>
+        <w:spacing w:lineRule="auto" w:line="240" w:before="0" w:after="0"/>
+        <w:rPr>
+          <w:rFonts w:ascii="Helvetica" w:hAnsi="Helvetica" w:eastAsia="Songti SC" w:cs="Arial Unicode MS"/>
+          <w:sz w:val="20"/>
+          <w:szCs w:val="20"/>
+        </w:rPr>
+      </w:pPr>
+      <w:r>
+        <w:rPr>
+          <w:rFonts w:eastAsia="Songti SC" w:cs="Arial Unicode MS" w:ascii="Helvetica" w:hAnsi="Helvetica"/>
+          <w:sz w:val="20"/>
+          <w:szCs w:val="20"/>
+        </w:rPr>
+      </w:r>
+    </w:p>
+    <w:p>
+      <w:pPr>
+        <w:pStyle w:val="PreformattedText"/>
+        <w:spacing w:lineRule="auto" w:line="240" w:before="0" w:after="0"/>
+        <w:ind w:hanging="0" w:left="0" w:right="0"/>
+        <w:rPr>
+          <w:rFonts w:ascii="Helvetica Neue" w:hAnsi="Helvetica Neue" w:eastAsia="Songti SC" w:cs="Arial Unicode MS"/>
+          <w:sz w:val="24"/>
+          <w:szCs w:val="24"/>
+        </w:rPr>
+      </w:pPr>
+      <w:r>
+        <w:rPr>
+          <w:rStyle w:val="SourceText"/>
+          <w:rFonts w:ascii="Helvetica" w:hAnsi="Helvetica"/>
+          <w:color w:val="6E7687"/>
+          <w:sz w:val="20"/>
+          <w:szCs w:val="20"/>
+          <w:shd w:fill="auto" w:val="clear"/>
+        </w:rPr>
+        <w:t># 2a. Tag new photos (if you added any)</w:t>
+      </w:r>
+    </w:p>
+    <w:p>
+      <w:pPr>
+        <w:pStyle w:val="PreformattedText"/>
+        <w:spacing w:lineRule="auto" w:line="240" w:before="0" w:after="0"/>
+        <w:rPr>
+          <w:rFonts w:ascii="Helvetica Neue" w:hAnsi="Helvetica Neue" w:eastAsia="Songti SC" w:cs="Arial Unicode MS"/>
+          <w:sz w:val="24"/>
+          <w:szCs w:val="24"/>
+        </w:rPr>
+      </w:pPr>
+      <w:r>
+        <w:rPr>
+          <w:rStyle w:val="SourceText"/>
+          <w:rFonts w:ascii="Helvetica" w:hAnsi="Helvetica"/>
+          <w:color w:val="14181F"/>
+          <w:sz w:val="20"/>
+          <w:szCs w:val="20"/>
+          <w:shd w:fill="auto" w:val="clear"/>
+        </w:rPr>
+        <w:t>python3 /Users/ncm/Pictures/Mohangraphy/Scripts/curator.py</w:t>
+      </w:r>
+    </w:p>
+    <w:p>
+      <w:pPr>
+        <w:pStyle w:val="PreformattedText"/>
+        <w:spacing w:lineRule="auto" w:line="240" w:before="0" w:after="0"/>
+        <w:rPr>
+          <w:rFonts w:ascii="Helvetica" w:hAnsi="Helvetica" w:eastAsia="Songti SC" w:cs="Arial Unicode MS"/>
+          <w:sz w:val="20"/>
+          <w:szCs w:val="20"/>
+        </w:rPr>
+      </w:pPr>
+      <w:r>
+        <w:rPr>
+          <w:rFonts w:eastAsia="Songti SC" w:cs="Arial Unicode MS" w:ascii="Helvetica" w:hAnsi="Helvetica"/>
+          <w:sz w:val="20"/>
+          <w:szCs w:val="20"/>
+        </w:rPr>
+      </w:r>
+    </w:p>
+    <w:p>
+      <w:pPr>
+        <w:pStyle w:val="PreformattedText"/>
+        <w:spacing w:lineRule="auto" w:line="240" w:before="0" w:after="0"/>
+        <w:ind w:hanging="0" w:left="0" w:right="0"/>
+        <w:rPr>
+          <w:rFonts w:ascii="Helvetica Neue" w:hAnsi="Helvetica Neue" w:eastAsia="Songti SC" w:cs="Arial Unicode MS"/>
+          <w:sz w:val="24"/>
+          <w:szCs w:val="24"/>
+        </w:rPr>
+      </w:pPr>
+      <w:r>
+        <w:rPr>
+          <w:rStyle w:val="SourceText"/>
+          <w:rFonts w:ascii="Helvetica" w:hAnsi="Helvetica"/>
+          <w:color w:val="6E7687"/>
+          <w:sz w:val="20"/>
+          <w:szCs w:val="20"/>
+          <w:shd w:fill="auto" w:val="clear"/>
+        </w:rPr>
+        <w:t># 2b. Fix tags via browser (right-click → Edit tags → Deploy Now)</w:t>
+      </w:r>
+    </w:p>
+    <w:p>
+      <w:pPr>
+        <w:pStyle w:val="PreformattedText"/>
+        <w:spacing w:lineRule="auto" w:line="240" w:before="0" w:after="0"/>
+        <w:ind w:hanging="0" w:left="0" w:right="0"/>
+        <w:rPr>
+          <w:rFonts w:ascii="Helvetica Neue" w:hAnsi="Helvetica Neue" w:eastAsia="Songti SC" w:cs="Arial Unicode MS"/>
+          <w:sz w:val="24"/>
+          <w:szCs w:val="24"/>
+        </w:rPr>
+      </w:pPr>
+      <w:r>
+        <w:rPr>
+          <w:rStyle w:val="SourceText"/>
+          <w:rFonts w:ascii="Helvetica" w:hAnsi="Helvetica"/>
+          <w:color w:val="6E7687"/>
+          <w:sz w:val="20"/>
+          <w:szCs w:val="20"/>
+          <w:shd w:fill="auto" w:val="clear"/>
+        </w:rPr>
+        <w:t>#     (admin server must be running from step 1)</w:t>
+      </w:r>
+    </w:p>
+    <w:p>
+      <w:pPr>
+        <w:pStyle w:val="PreformattedText"/>
+        <w:bidi w:val="0"/>
+        <w:spacing w:lineRule="auto" w:line="240" w:before="0" w:after="0"/>
+        <w:ind w:hanging="0" w:left="0" w:right="0"/>
+        <w:jc w:val="left"/>
+        <w:rPr/>
+      </w:pPr>
+      <w:r>
+        <w:rPr>
+          <w:rStyle w:val="SourceText"/>
+          <w:rFonts w:ascii="Helvetica" w:hAnsi="Helvetica"/>
+          <w:color w:val="14181F"/>
+          <w:shd w:fill="auto" w:val="clear"/>
+        </w:rPr>
+        <w:t>python3 /Users/ncm/Pictures/Mohangraphy/Scripts/deploy.py</w:t>
+      </w:r>
+    </w:p>
+    <w:p>
+      <w:pPr>
+        <w:pStyle w:val="PreformattedText"/>
+        <w:spacing w:lineRule="auto" w:line="240" w:before="0" w:after="0"/>
+        <w:ind w:hanging="0" w:left="0" w:right="0"/>
+        <w:rPr>
+          <w:rStyle w:val="SourceText"/>
+          <w:rFonts w:ascii="Helvetica" w:hAnsi="Helvetica"/>
+          <w:color w:val="6E7687"/>
+          <w:sz w:val="20"/>
+          <w:szCs w:val="20"/>
+          <w:shd w:fill="auto" w:val="clear"/>
+        </w:rPr>
+      </w:pPr>
+      <w:r>
+        <w:rPr>
+          <w:rFonts w:ascii="Helvetica" w:hAnsi="Helvetica"/>
+          <w:color w:val="6E7687"/>
+          <w:sz w:val="20"/>
+          <w:szCs w:val="20"/>
+          <w:shd w:fill="auto" w:val="clear"/>
+        </w:rPr>
       </w:r>
     </w:p>
     <w:p>
@@ -991,41 +1624,18 @@
         <w:rPr>
           <w:rStyle w:val="SourceText"/>
           <w:rFonts w:ascii="Helvetica" w:hAnsi="Helvetica"/>
-          <w:color w:val="14181F"/>
+          <w:color w:val="6E7687"/>
           <w:sz w:val="20"/>
           <w:szCs w:val="20"/>
           <w:shd w:fill="auto" w:val="clear"/>
         </w:rPr>
-        <w:t>python3 /Users/ncm/Pictures/Mohangraphy/Scripts/blog_editor.py</w:t>
+        <w:t># 3. Write or edit a blog post</w:t>
       </w:r>
     </w:p>
     <w:p>
       <w:pPr>
         <w:pStyle w:val="PreformattedText"/>
         <w:spacing w:lineRule="auto" w:line="240" w:before="0" w:after="0"/>
-        <w:ind w:hanging="0" w:left="0" w:right="0"/>
-        <w:rPr>
-          <w:rStyle w:val="SourceText"/>
-          <w:rFonts w:ascii="Helvetica" w:hAnsi="Helvetica"/>
-          <w:color w:val="6E7687"/>
-          <w:sz w:val="20"/>
-          <w:szCs w:val="20"/>
-          <w:shd w:fill="auto" w:val="clear"/>
-        </w:rPr>
-      </w:pPr>
-      <w:r>
-        <w:rPr>
-          <w:rFonts w:eastAsia="Songti SC" w:cs="Arial Unicode MS" w:ascii="Helvetica Neue" w:hAnsi="Helvetica Neue"/>
-          <w:sz w:val="24"/>
-          <w:szCs w:val="24"/>
-        </w:rPr>
-      </w:r>
-    </w:p>
-    <w:p>
-      <w:pPr>
-        <w:pStyle w:val="PreformattedText"/>
-        <w:spacing w:lineRule="auto" w:line="240" w:before="0" w:after="0"/>
-        <w:ind w:hanging="0" w:left="0" w:right="0"/>
         <w:rPr>
           <w:rFonts w:ascii="Helvetica Neue" w:hAnsi="Helvetica Neue" w:eastAsia="Songti SC" w:cs="Arial Unicode MS"/>
           <w:sz w:val="24"/>
@@ -1036,12 +1646,12 @@
         <w:rPr>
           <w:rStyle w:val="SourceText"/>
           <w:rFonts w:ascii="Helvetica" w:hAnsi="Helvetica"/>
-          <w:color w:val="6E7687"/>
+          <w:color w:val="14181F"/>
           <w:sz w:val="20"/>
           <w:szCs w:val="20"/>
           <w:shd w:fill="auto" w:val="clear"/>
         </w:rPr>
-        <w:t># Choose "Edit: [post name]" → make changes → Done → deploy</w:t>
+        <w:t>python3 /Users/ncm/Pictures/Mohangraphy/Scripts/blog_editor.py</w:t>
       </w:r>
     </w:p>
     <w:p>
@@ -1049,19 +1659,16 @@
         <w:pStyle w:val="PreformattedText"/>
         <w:spacing w:lineRule="auto" w:line="240" w:before="0" w:after="0"/>
         <w:rPr>
-          <w:rStyle w:val="SourceText"/>
-          <w:rFonts w:ascii="Helvetica" w:hAnsi="Helvetica"/>
-          <w:color w:val="14181F"/>
-          <w:sz w:val="20"/>
-          <w:szCs w:val="20"/>
-          <w:shd w:fill="auto" w:val="clear"/>
-        </w:rPr>
-      </w:pPr>
-      <w:r>
-        <w:rPr>
-          <w:rFonts w:eastAsia="Songti SC" w:cs="Arial Unicode MS" w:ascii="Helvetica Neue" w:hAnsi="Helvetica Neue"/>
-          <w:sz w:val="24"/>
-          <w:szCs w:val="24"/>
+          <w:rFonts w:ascii="Helvetica" w:hAnsi="Helvetica" w:eastAsia="Songti SC" w:cs="Arial Unicode MS"/>
+          <w:sz w:val="20"/>
+          <w:szCs w:val="20"/>
+        </w:rPr>
+      </w:pPr>
+      <w:r>
+        <w:rPr>
+          <w:rFonts w:eastAsia="Songti SC" w:cs="Arial Unicode MS" w:ascii="Helvetica" w:hAnsi="Helvetica"/>
+          <w:sz w:val="20"/>
+          <w:szCs w:val="20"/>
         </w:rPr>
       </w:r>
     </w:p>
@@ -1069,6 +1676,7 @@
       <w:pPr>
         <w:pStyle w:val="PreformattedText"/>
         <w:spacing w:lineRule="auto" w:line="240" w:before="0" w:after="0"/>
+        <w:ind w:hanging="0" w:left="0" w:right="0"/>
         <w:rPr>
           <w:rFonts w:ascii="Helvetica Neue" w:hAnsi="Helvetica Neue" w:eastAsia="Songti SC" w:cs="Arial Unicode MS"/>
           <w:sz w:val="24"/>
@@ -1079,149 +1687,18 @@
         <w:rPr>
           <w:rStyle w:val="SourceText"/>
           <w:rFonts w:ascii="Helvetica" w:hAnsi="Helvetica"/>
-          <w:color w:val="14181F"/>
+          <w:color w:val="6E7687"/>
           <w:sz w:val="20"/>
           <w:szCs w:val="20"/>
           <w:shd w:fill="auto" w:val="clear"/>
         </w:rPr>
-        <w:t>python3 /Users/ncm/Pictures/Mohangraphy/Scripts/Claude_mohangraphy.py</w:t>
-      </w:r>
-    </w:p>
-    <w:p>
-      <w:pPr>
-        <w:pStyle w:val="HorizontalLine"/>
-        <w:spacing w:lineRule="auto" w:line="240" w:before="0" w:after="0"/>
-        <w:rPr>
-          <w:rFonts w:ascii="Helvetica" w:hAnsi="Helvetica"/>
-          <w:sz w:val="20"/>
-          <w:szCs w:val="20"/>
-        </w:rPr>
-      </w:pPr>
-      <w:r>
-        <w:rPr>
-          <w:rFonts w:ascii="Helvetica" w:hAnsi="Helvetica"/>
-          <w:sz w:val="20"/>
-          <w:szCs w:val="20"/>
-        </w:rPr>
-      </w:r>
-    </w:p>
-    <w:p>
-      <w:pPr>
-        <w:pStyle w:val="Heading3"/>
-        <w:spacing w:lineRule="auto" w:line="240" w:before="0" w:after="0"/>
-        <w:rPr>
-          <w:rFonts w:ascii="Helvetica" w:hAnsi="Helvetica"/>
-          <w:b w:val="false"/>
-          <w:bCs w:val="false"/>
-          <w:sz w:val="20"/>
-          <w:szCs w:val="20"/>
-        </w:rPr>
-      </w:pPr>
-      <w:r>
-        <w:rPr>
-          <w:rFonts w:ascii="Helvetica" w:hAnsi="Helvetica"/>
-          <w:b w:val="false"/>
-          <w:bCs w:val="false"/>
-          <w:sz w:val="20"/>
-          <w:szCs w:val="20"/>
-        </w:rPr>
-      </w:r>
-    </w:p>
-    <w:p>
-      <w:pPr>
-        <w:pStyle w:val="Heading3"/>
-        <w:spacing w:lineRule="auto" w:line="240" w:before="0" w:after="0"/>
-        <w:rPr>
-          <w:rFonts w:ascii="Helvetica" w:hAnsi="Helvetica"/>
-          <w:b/>
-          <w:bCs/>
-          <w:sz w:val="20"/>
-          <w:szCs w:val="20"/>
-        </w:rPr>
-      </w:pPr>
-      <w:r>
-        <w:rPr>
-          <w:rFonts w:ascii="Helvetica" w:hAnsi="Helvetica"/>
-          <w:b/>
-          <w:bCs/>
-          <w:sz w:val="20"/>
-          <w:szCs w:val="20"/>
-        </w:rPr>
-        <w:t>Downloading subscriber data</w:t>
+        <w:t># 4. Build and deploy</w:t>
       </w:r>
     </w:p>
     <w:p>
       <w:pPr>
         <w:pStyle w:val="PreformattedText"/>
         <w:spacing w:lineRule="auto" w:line="240" w:before="0" w:after="0"/>
-        <w:ind w:hanging="0" w:left="0" w:right="0"/>
-        <w:rPr>
-          <w:rStyle w:val="SourceText"/>
-          <w:rFonts w:ascii="Helvetica" w:hAnsi="Helvetica"/>
-          <w:color w:val="14181F"/>
-          <w:sz w:val="20"/>
-          <w:szCs w:val="20"/>
-          <w:shd w:fill="auto" w:val="clear"/>
-        </w:rPr>
-      </w:pPr>
-      <w:r>
-        <w:rPr>
-          <w:rFonts w:ascii="Helvetica Neue" w:hAnsi="Helvetica Neue"/>
-          <w:sz w:val="24"/>
-          <w:szCs w:val="24"/>
-        </w:rPr>
-      </w:r>
-    </w:p>
-    <w:p>
-      <w:pPr>
-        <w:pStyle w:val="PreformattedText"/>
-        <w:spacing w:lineRule="auto" w:line="240" w:before="0" w:after="0"/>
-        <w:ind w:hanging="0" w:left="0" w:right="0"/>
-        <w:rPr>
-          <w:rFonts w:ascii="Helvetica Neue" w:hAnsi="Helvetica Neue"/>
-          <w:sz w:val="24"/>
-          <w:szCs w:val="24"/>
-        </w:rPr>
-      </w:pPr>
-      <w:r>
-        <w:rPr>
-          <w:rStyle w:val="SourceText"/>
-          <w:rFonts w:ascii="Helvetica" w:hAnsi="Helvetica"/>
-          <w:color w:val="14181F"/>
-          <w:sz w:val="20"/>
-          <w:szCs w:val="20"/>
-          <w:shd w:fill="auto" w:val="clear"/>
-        </w:rPr>
-        <w:t>python3 /Users/ncm/Pictures/Mohangraphy/Scripts/list_subscribers.py</w:t>
-      </w:r>
-    </w:p>
-    <w:p>
-      <w:pPr>
-        <w:pStyle w:val="PreformattedText"/>
-        <w:spacing w:lineRule="auto" w:line="240" w:before="0" w:after="0"/>
-        <w:ind w:hanging="0" w:left="0" w:right="0"/>
-        <w:rPr>
-          <w:rStyle w:val="SourceText"/>
-          <w:rFonts w:ascii="Helvetica" w:hAnsi="Helvetica"/>
-          <w:color w:val="6E7687"/>
-          <w:sz w:val="20"/>
-          <w:szCs w:val="20"/>
-          <w:shd w:fill="auto" w:val="clear"/>
-        </w:rPr>
-      </w:pPr>
-      <w:r>
-        <w:rPr>
-          <w:rFonts w:eastAsia="Songti SC" w:cs="Arial Unicode MS" w:ascii="Helvetica Neue" w:hAnsi="Helvetica Neue"/>
-          <w:sz w:val="24"/>
-          <w:szCs w:val="24"/>
-        </w:rPr>
-      </w:r>
-    </w:p>
-    <w:p>
-      <w:pPr>
-        <w:pStyle w:val="PreformattedText"/>
-        <w:spacing w:lineRule="auto" w:line="240" w:before="0" w:after="0"/>
-        <w:ind w:hanging="0" w:left="0" w:right="0"/>
         <w:rPr>
           <w:rFonts w:ascii="Helvetica Neue" w:hAnsi="Helvetica Neue" w:eastAsia="Songti SC" w:cs="Arial Unicode MS"/>
           <w:sz w:val="24"/>
@@ -1232,153 +1709,37 @@
         <w:rPr>
           <w:rStyle w:val="SourceText"/>
           <w:rFonts w:ascii="Helvetica" w:hAnsi="Helvetica"/>
-          <w:color w:val="6E7687"/>
+          <w:color w:val="14181F"/>
           <w:sz w:val="20"/>
           <w:szCs w:val="20"/>
           <w:shd w:fill="auto" w:val="clear"/>
         </w:rPr>
-        <w:t># Saves an Excel file in Scripts/ with name, email, date subscribed</w:t>
-      </w:r>
-    </w:p>
-    <w:p>
-      <w:pPr>
-        <w:pStyle w:val="HorizontalLine"/>
-        <w:spacing w:lineRule="auto" w:line="240" w:before="0" w:after="0"/>
-        <w:rPr>
-          <w:rFonts w:ascii="Helvetica" w:hAnsi="Helvetica"/>
-          <w:sz w:val="20"/>
-          <w:szCs w:val="20"/>
-        </w:rPr>
-      </w:pPr>
-      <w:r>
-        <w:rPr>
-          <w:rFonts w:ascii="Helvetica" w:hAnsi="Helvetica"/>
-          <w:sz w:val="20"/>
-          <w:szCs w:val="20"/>
-        </w:rPr>
-      </w:r>
-    </w:p>
-    <w:p>
-      <w:pPr>
-        <w:pStyle w:val="Heading3"/>
-        <w:spacing w:lineRule="auto" w:line="240" w:before="0" w:after="0"/>
-        <w:rPr>
-          <w:rFonts w:ascii="Helvetica" w:hAnsi="Helvetica"/>
-          <w:b w:val="false"/>
-          <w:bCs w:val="false"/>
-          <w:sz w:val="20"/>
-          <w:szCs w:val="20"/>
-        </w:rPr>
-      </w:pPr>
-      <w:r>
-        <w:rPr>
-          <w:rFonts w:ascii="Helvetica" w:hAnsi="Helvetica"/>
-          <w:b w:val="false"/>
-          <w:bCs w:val="false"/>
-          <w:sz w:val="20"/>
-          <w:szCs w:val="20"/>
-        </w:rPr>
-      </w:r>
-    </w:p>
-    <w:p>
-      <w:pPr>
-        <w:pStyle w:val="Heading3"/>
-        <w:spacing w:lineRule="auto" w:line="240" w:before="0" w:after="0"/>
-        <w:rPr>
-          <w:rFonts w:ascii="Helvetica" w:hAnsi="Helvetica"/>
-          <w:b/>
-          <w:bCs/>
-          <w:sz w:val="20"/>
-          <w:szCs w:val="20"/>
-        </w:rPr>
-      </w:pPr>
-      <w:r>
-        <w:rPr>
-          <w:rFonts w:ascii="Helvetica" w:hAnsi="Helvetica"/>
-          <w:b/>
-          <w:bCs/>
-          <w:sz w:val="20"/>
-          <w:szCs w:val="20"/>
-        </w:rPr>
-      </w:r>
-      <w:r>
-        <w:br w:type="page"/>
-      </w:r>
-    </w:p>
-    <w:p>
-      <w:pPr>
-        <w:pStyle w:val="Heading3"/>
-        <w:spacing w:lineRule="auto" w:line="240" w:before="0" w:after="0"/>
-        <w:rPr>
-          <w:rFonts w:ascii="Helvetica" w:hAnsi="Helvetica"/>
-          <w:b/>
-          <w:bCs/>
-          <w:sz w:val="20"/>
-          <w:szCs w:val="20"/>
-        </w:rPr>
-      </w:pPr>
-      <w:r>
-        <w:rPr>
-          <w:rFonts w:ascii="Helvetica" w:hAnsi="Helvetica"/>
-          <w:b/>
-          <w:bCs/>
-          <w:sz w:val="20"/>
-          <w:szCs w:val="20"/>
-        </w:rPr>
-        <w:t>Full typical work session (sequential order)</w:t>
+        <w:t>python3 /Users/ncm/Pictures/Mohangraphy/Scripts/Claude_mohangraphy.py</w:t>
       </w:r>
     </w:p>
     <w:p>
       <w:pPr>
         <w:pStyle w:val="PreformattedText"/>
         <w:spacing w:lineRule="auto" w:line="240" w:before="0" w:after="0"/>
+        <w:rPr>
+          <w:rFonts w:ascii="Helvetica" w:hAnsi="Helvetica" w:eastAsia="Songti SC" w:cs="Arial Unicode MS"/>
+          <w:sz w:val="20"/>
+          <w:szCs w:val="20"/>
+        </w:rPr>
+      </w:pPr>
+      <w:r>
+        <w:rPr>
+          <w:rFonts w:eastAsia="Songti SC" w:cs="Arial Unicode MS" w:ascii="Helvetica" w:hAnsi="Helvetica"/>
+          <w:sz w:val="20"/>
+          <w:szCs w:val="20"/>
+        </w:rPr>
+      </w:r>
+    </w:p>
+    <w:p>
+      <w:pPr>
+        <w:pStyle w:val="PreformattedText"/>
+        <w:spacing w:lineRule="auto" w:line="240" w:before="0" w:after="0"/>
         <w:ind w:hanging="0" w:left="0" w:right="0"/>
-        <w:rPr>
-          <w:rStyle w:val="SourceText"/>
-          <w:rFonts w:ascii="Helvetica" w:hAnsi="Helvetica"/>
-          <w:b/>
-          <w:bCs/>
-          <w:color w:val="6E7687"/>
-          <w:sz w:val="20"/>
-          <w:szCs w:val="20"/>
-          <w:shd w:fill="auto" w:val="clear"/>
-        </w:rPr>
-      </w:pPr>
-      <w:r>
-        <w:rPr>
-          <w:rFonts w:ascii="Helvetica Neue" w:hAnsi="Helvetica Neue"/>
-          <w:sz w:val="24"/>
-          <w:szCs w:val="24"/>
-        </w:rPr>
-      </w:r>
-    </w:p>
-    <w:p>
-      <w:pPr>
-        <w:pStyle w:val="PreformattedText"/>
-        <w:spacing w:lineRule="auto" w:line="240" w:before="0" w:after="0"/>
-        <w:ind w:hanging="0" w:left="0" w:right="0"/>
-        <w:rPr>
-          <w:rFonts w:ascii="Helvetica Neue" w:hAnsi="Helvetica Neue"/>
-          <w:sz w:val="24"/>
-          <w:szCs w:val="24"/>
-        </w:rPr>
-      </w:pPr>
-      <w:r>
-        <w:rPr>
-          <w:rStyle w:val="SourceText"/>
-          <w:rFonts w:ascii="Helvetica" w:hAnsi="Helvetica"/>
-          <w:color w:val="6E7687"/>
-          <w:sz w:val="20"/>
-          <w:szCs w:val="20"/>
-          <w:shd w:fill="auto" w:val="clear"/>
-        </w:rPr>
-        <w:t># 1. Start admin server</w:t>
-      </w:r>
-    </w:p>
-    <w:p>
-      <w:pPr>
-        <w:pStyle w:val="PreformattedText"/>
-        <w:spacing w:lineRule="auto" w:line="240" w:before="0" w:after="0"/>
         <w:rPr>
           <w:rFonts w:ascii="Helvetica Neue" w:hAnsi="Helvetica Neue" w:eastAsia="Songti SC" w:cs="Arial Unicode MS"/>
           <w:sz w:val="24"/>
@@ -1389,30 +1750,12 @@
         <w:rPr>
           <w:rStyle w:val="SourceText"/>
           <w:rFonts w:ascii="Helvetica" w:hAnsi="Helvetica"/>
-          <w:color w:val="14181F"/>
+          <w:color w:val="6E7687"/>
           <w:sz w:val="20"/>
           <w:szCs w:val="20"/>
           <w:shd w:fill="auto" w:val="clear"/>
         </w:rPr>
-        <w:t>python3 /Users/ncm/Pictures/Mohangraphy/Scripts/patch_tags.py</w:t>
-      </w:r>
-    </w:p>
-    <w:p>
-      <w:pPr>
-        <w:pStyle w:val="PreformattedText"/>
-        <w:spacing w:lineRule="auto" w:line="240" w:before="0" w:after="0"/>
-        <w:rPr>
-          <w:rFonts w:ascii="Helvetica" w:hAnsi="Helvetica" w:eastAsia="Songti SC" w:cs="Arial Unicode MS"/>
-          <w:sz w:val="20"/>
-          <w:szCs w:val="20"/>
-        </w:rPr>
-      </w:pPr>
-      <w:r>
-        <w:rPr>
-          <w:rFonts w:eastAsia="Songti SC" w:cs="Arial Unicode MS" w:ascii="Helvetica" w:hAnsi="Helvetica"/>
-          <w:sz w:val="20"/>
-          <w:szCs w:val="20"/>
-        </w:rPr>
+        <w:t># 5. Stop admin server</w:t>
       </w:r>
     </w:p>
     <w:p>
@@ -1435,13 +1778,32 @@
           <w:szCs w:val="20"/>
           <w:shd w:fill="auto" w:val="clear"/>
         </w:rPr>
-        <w:t># 2a. Tag new photos (if you added any)</w:t>
+        <w:t># Ctrl+C in the terminal running patch_tags.py</w:t>
       </w:r>
     </w:p>
     <w:p>
       <w:pPr>
         <w:pStyle w:val="PreformattedText"/>
         <w:spacing w:lineRule="auto" w:line="240" w:before="0" w:after="0"/>
+        <w:rPr>
+          <w:rFonts w:ascii="Helvetica" w:hAnsi="Helvetica" w:eastAsia="Songti SC" w:cs="Arial Unicode MS"/>
+          <w:sz w:val="20"/>
+          <w:szCs w:val="20"/>
+        </w:rPr>
+      </w:pPr>
+      <w:r>
+        <w:rPr>
+          <w:rFonts w:eastAsia="Songti SC" w:cs="Arial Unicode MS" w:ascii="Helvetica" w:hAnsi="Helvetica"/>
+          <w:sz w:val="20"/>
+          <w:szCs w:val="20"/>
+        </w:rPr>
+      </w:r>
+    </w:p>
+    <w:p>
+      <w:pPr>
+        <w:pStyle w:val="PreformattedText"/>
+        <w:spacing w:lineRule="auto" w:line="240" w:before="0" w:after="0"/>
+        <w:ind w:hanging="0" w:left="0" w:right="0"/>
         <w:rPr>
           <w:rFonts w:ascii="Helvetica Neue" w:hAnsi="Helvetica Neue" w:eastAsia="Songti SC" w:cs="Arial Unicode MS"/>
           <w:sz w:val="24"/>
@@ -1452,37 +1814,18 @@
         <w:rPr>
           <w:rStyle w:val="SourceText"/>
           <w:rFonts w:ascii="Helvetica" w:hAnsi="Helvetica"/>
-          <w:color w:val="14181F"/>
+          <w:color w:val="6E7687"/>
           <w:sz w:val="20"/>
           <w:szCs w:val="20"/>
           <w:shd w:fill="auto" w:val="clear"/>
         </w:rPr>
-        <w:t>python3 /Users/ncm/Pictures/Mohangraphy/Scripts/curator.py</w:t>
+        <w:t># 6. Download subscriber list (any time)</w:t>
       </w:r>
     </w:p>
     <w:p>
       <w:pPr>
         <w:pStyle w:val="PreformattedText"/>
         <w:spacing w:lineRule="auto" w:line="240" w:before="0" w:after="0"/>
-        <w:rPr>
-          <w:rFonts w:ascii="Helvetica" w:hAnsi="Helvetica" w:eastAsia="Songti SC" w:cs="Arial Unicode MS"/>
-          <w:sz w:val="20"/>
-          <w:szCs w:val="20"/>
-        </w:rPr>
-      </w:pPr>
-      <w:r>
-        <w:rPr>
-          <w:rFonts w:eastAsia="Songti SC" w:cs="Arial Unicode MS" w:ascii="Helvetica" w:hAnsi="Helvetica"/>
-          <w:sz w:val="20"/>
-          <w:szCs w:val="20"/>
-        </w:rPr>
-      </w:r>
-    </w:p>
-    <w:p>
-      <w:pPr>
-        <w:pStyle w:val="PreformattedText"/>
-        <w:spacing w:lineRule="auto" w:line="240" w:before="0" w:after="0"/>
-        <w:ind w:hanging="0" w:left="0" w:right="0"/>
         <w:rPr>
           <w:rFonts w:ascii="Helvetica Neue" w:hAnsi="Helvetica Neue" w:eastAsia="Songti SC" w:cs="Arial Unicode MS"/>
           <w:sz w:val="24"/>
@@ -1493,305 +1836,6 @@
         <w:rPr>
           <w:rStyle w:val="SourceText"/>
           <w:rFonts w:ascii="Helvetica" w:hAnsi="Helvetica"/>
-          <w:color w:val="6E7687"/>
-          <w:sz w:val="20"/>
-          <w:szCs w:val="20"/>
-          <w:shd w:fill="auto" w:val="clear"/>
-        </w:rPr>
-        <w:t># 2b. Fix tags via browser (right-click → Edit tags → Deploy Now)</w:t>
-      </w:r>
-    </w:p>
-    <w:p>
-      <w:pPr>
-        <w:pStyle w:val="PreformattedText"/>
-        <w:spacing w:lineRule="auto" w:line="240" w:before="0" w:after="0"/>
-        <w:ind w:hanging="0" w:left="0" w:right="0"/>
-        <w:rPr>
-          <w:rFonts w:ascii="Helvetica Neue" w:hAnsi="Helvetica Neue" w:eastAsia="Songti SC" w:cs="Arial Unicode MS"/>
-          <w:sz w:val="24"/>
-          <w:szCs w:val="24"/>
-        </w:rPr>
-      </w:pPr>
-      <w:r>
-        <w:rPr>
-          <w:rStyle w:val="SourceText"/>
-          <w:rFonts w:ascii="Helvetica" w:hAnsi="Helvetica"/>
-          <w:color w:val="6E7687"/>
-          <w:sz w:val="20"/>
-          <w:szCs w:val="20"/>
-          <w:shd w:fill="auto" w:val="clear"/>
-        </w:rPr>
-        <w:t>#     (admin server must be running from step 1)</w:t>
-      </w:r>
-    </w:p>
-    <w:p>
-      <w:pPr>
-        <w:pStyle w:val="PreformattedText"/>
-        <w:bidi w:val="0"/>
-        <w:spacing w:lineRule="auto" w:line="240" w:before="0" w:after="0"/>
-        <w:ind w:hanging="0" w:left="0" w:right="0"/>
-        <w:jc w:val="left"/>
-        <w:rPr/>
-      </w:pPr>
-      <w:r>
-        <w:rPr>
-          <w:rStyle w:val="SourceText"/>
-          <w:rFonts w:ascii="Helvetica" w:hAnsi="Helvetica"/>
-          <w:color w:val="14181F"/>
-          <w:shd w:fill="auto" w:val="clear"/>
-        </w:rPr>
-        <w:t>python3 /Users/ncm/Pictures/Mohangraphy/Scripts/deploy.py</w:t>
-      </w:r>
-    </w:p>
-    <w:p>
-      <w:pPr>
-        <w:pStyle w:val="PreformattedText"/>
-        <w:spacing w:lineRule="auto" w:line="240" w:before="0" w:after="0"/>
-        <w:ind w:hanging="0" w:left="0" w:right="0"/>
-        <w:rPr>
-          <w:rStyle w:val="SourceText"/>
-          <w:rFonts w:ascii="Helvetica" w:hAnsi="Helvetica"/>
-          <w:color w:val="6E7687"/>
-          <w:sz w:val="20"/>
-          <w:szCs w:val="20"/>
-          <w:shd w:fill="auto" w:val="clear"/>
-        </w:rPr>
-      </w:pPr>
-      <w:r>
-        <w:rPr>
-          <w:rFonts w:ascii="Helvetica Neue" w:hAnsi="Helvetica Neue"/>
-          <w:sz w:val="24"/>
-          <w:szCs w:val="24"/>
-        </w:rPr>
-      </w:r>
-    </w:p>
-    <w:p>
-      <w:pPr>
-        <w:pStyle w:val="PreformattedText"/>
-        <w:spacing w:lineRule="auto" w:line="240" w:before="0" w:after="0"/>
-        <w:ind w:hanging="0" w:left="0" w:right="0"/>
-        <w:rPr>
-          <w:rFonts w:ascii="Helvetica Neue" w:hAnsi="Helvetica Neue"/>
-          <w:sz w:val="24"/>
-          <w:szCs w:val="24"/>
-        </w:rPr>
-      </w:pPr>
-      <w:r>
-        <w:rPr>
-          <w:rStyle w:val="SourceText"/>
-          <w:rFonts w:ascii="Helvetica" w:hAnsi="Helvetica"/>
-          <w:color w:val="6E7687"/>
-          <w:sz w:val="20"/>
-          <w:szCs w:val="20"/>
-          <w:shd w:fill="auto" w:val="clear"/>
-        </w:rPr>
-        <w:t># 3. Write or edit a blog post</w:t>
-      </w:r>
-    </w:p>
-    <w:p>
-      <w:pPr>
-        <w:pStyle w:val="PreformattedText"/>
-        <w:spacing w:lineRule="auto" w:line="240" w:before="0" w:after="0"/>
-        <w:rPr>
-          <w:rFonts w:ascii="Helvetica Neue" w:hAnsi="Helvetica Neue" w:eastAsia="Songti SC" w:cs="Arial Unicode MS"/>
-          <w:sz w:val="24"/>
-          <w:szCs w:val="24"/>
-        </w:rPr>
-      </w:pPr>
-      <w:r>
-        <w:rPr>
-          <w:rStyle w:val="SourceText"/>
-          <w:rFonts w:ascii="Helvetica" w:hAnsi="Helvetica"/>
-          <w:color w:val="14181F"/>
-          <w:sz w:val="20"/>
-          <w:szCs w:val="20"/>
-          <w:shd w:fill="auto" w:val="clear"/>
-        </w:rPr>
-        <w:t>python3 /Users/ncm/Pictures/Mohangraphy/Scripts/blog_editor.py</w:t>
-      </w:r>
-    </w:p>
-    <w:p>
-      <w:pPr>
-        <w:pStyle w:val="PreformattedText"/>
-        <w:spacing w:lineRule="auto" w:line="240" w:before="0" w:after="0"/>
-        <w:rPr>
-          <w:rFonts w:ascii="Helvetica" w:hAnsi="Helvetica" w:eastAsia="Songti SC" w:cs="Arial Unicode MS"/>
-          <w:sz w:val="20"/>
-          <w:szCs w:val="20"/>
-        </w:rPr>
-      </w:pPr>
-      <w:r>
-        <w:rPr>
-          <w:rFonts w:eastAsia="Songti SC" w:cs="Arial Unicode MS" w:ascii="Helvetica" w:hAnsi="Helvetica"/>
-          <w:sz w:val="20"/>
-          <w:szCs w:val="20"/>
-        </w:rPr>
-      </w:r>
-    </w:p>
-    <w:p>
-      <w:pPr>
-        <w:pStyle w:val="PreformattedText"/>
-        <w:spacing w:lineRule="auto" w:line="240" w:before="0" w:after="0"/>
-        <w:ind w:hanging="0" w:left="0" w:right="0"/>
-        <w:rPr>
-          <w:rFonts w:ascii="Helvetica Neue" w:hAnsi="Helvetica Neue" w:eastAsia="Songti SC" w:cs="Arial Unicode MS"/>
-          <w:sz w:val="24"/>
-          <w:szCs w:val="24"/>
-        </w:rPr>
-      </w:pPr>
-      <w:r>
-        <w:rPr>
-          <w:rStyle w:val="SourceText"/>
-          <w:rFonts w:ascii="Helvetica" w:hAnsi="Helvetica"/>
-          <w:color w:val="6E7687"/>
-          <w:sz w:val="20"/>
-          <w:szCs w:val="20"/>
-          <w:shd w:fill="auto" w:val="clear"/>
-        </w:rPr>
-        <w:t># 4. Build and deploy</w:t>
-      </w:r>
-    </w:p>
-    <w:p>
-      <w:pPr>
-        <w:pStyle w:val="PreformattedText"/>
-        <w:spacing w:lineRule="auto" w:line="240" w:before="0" w:after="0"/>
-        <w:rPr>
-          <w:rFonts w:ascii="Helvetica Neue" w:hAnsi="Helvetica Neue" w:eastAsia="Songti SC" w:cs="Arial Unicode MS"/>
-          <w:sz w:val="24"/>
-          <w:szCs w:val="24"/>
-        </w:rPr>
-      </w:pPr>
-      <w:r>
-        <w:rPr>
-          <w:rStyle w:val="SourceText"/>
-          <w:rFonts w:ascii="Helvetica" w:hAnsi="Helvetica"/>
-          <w:color w:val="14181F"/>
-          <w:sz w:val="20"/>
-          <w:szCs w:val="20"/>
-          <w:shd w:fill="auto" w:val="clear"/>
-        </w:rPr>
-        <w:t>python3 /Users/ncm/Pictures/Mohangraphy/Scripts/Claude_mohangraphy.py</w:t>
-      </w:r>
-    </w:p>
-    <w:p>
-      <w:pPr>
-        <w:pStyle w:val="PreformattedText"/>
-        <w:spacing w:lineRule="auto" w:line="240" w:before="0" w:after="0"/>
-        <w:rPr>
-          <w:rFonts w:ascii="Helvetica" w:hAnsi="Helvetica" w:eastAsia="Songti SC" w:cs="Arial Unicode MS"/>
-          <w:sz w:val="20"/>
-          <w:szCs w:val="20"/>
-        </w:rPr>
-      </w:pPr>
-      <w:r>
-        <w:rPr>
-          <w:rFonts w:eastAsia="Songti SC" w:cs="Arial Unicode MS" w:ascii="Helvetica" w:hAnsi="Helvetica"/>
-          <w:sz w:val="20"/>
-          <w:szCs w:val="20"/>
-        </w:rPr>
-      </w:r>
-    </w:p>
-    <w:p>
-      <w:pPr>
-        <w:pStyle w:val="PreformattedText"/>
-        <w:spacing w:lineRule="auto" w:line="240" w:before="0" w:after="0"/>
-        <w:ind w:hanging="0" w:left="0" w:right="0"/>
-        <w:rPr>
-          <w:rFonts w:ascii="Helvetica Neue" w:hAnsi="Helvetica Neue" w:eastAsia="Songti SC" w:cs="Arial Unicode MS"/>
-          <w:sz w:val="24"/>
-          <w:szCs w:val="24"/>
-        </w:rPr>
-      </w:pPr>
-      <w:r>
-        <w:rPr>
-          <w:rStyle w:val="SourceText"/>
-          <w:rFonts w:ascii="Helvetica" w:hAnsi="Helvetica"/>
-          <w:color w:val="6E7687"/>
-          <w:sz w:val="20"/>
-          <w:szCs w:val="20"/>
-          <w:shd w:fill="auto" w:val="clear"/>
-        </w:rPr>
-        <w:t># 5. Stop admin server</w:t>
-      </w:r>
-    </w:p>
-    <w:p>
-      <w:pPr>
-        <w:pStyle w:val="PreformattedText"/>
-        <w:spacing w:lineRule="auto" w:line="240" w:before="0" w:after="0"/>
-        <w:ind w:hanging="0" w:left="0" w:right="0"/>
-        <w:rPr>
-          <w:rFonts w:ascii="Helvetica Neue" w:hAnsi="Helvetica Neue" w:eastAsia="Songti SC" w:cs="Arial Unicode MS"/>
-          <w:sz w:val="24"/>
-          <w:szCs w:val="24"/>
-        </w:rPr>
-      </w:pPr>
-      <w:r>
-        <w:rPr>
-          <w:rStyle w:val="SourceText"/>
-          <w:rFonts w:ascii="Helvetica" w:hAnsi="Helvetica"/>
-          <w:color w:val="6E7687"/>
-          <w:sz w:val="20"/>
-          <w:szCs w:val="20"/>
-          <w:shd w:fill="auto" w:val="clear"/>
-        </w:rPr>
-        <w:t># Ctrl+C in the terminal running patch_tags.py</w:t>
-      </w:r>
-    </w:p>
-    <w:p>
-      <w:pPr>
-        <w:pStyle w:val="PreformattedText"/>
-        <w:spacing w:lineRule="auto" w:line="240" w:before="0" w:after="0"/>
-        <w:rPr>
-          <w:rFonts w:ascii="Helvetica" w:hAnsi="Helvetica" w:eastAsia="Songti SC" w:cs="Arial Unicode MS"/>
-          <w:sz w:val="20"/>
-          <w:szCs w:val="20"/>
-        </w:rPr>
-      </w:pPr>
-      <w:r>
-        <w:rPr>
-          <w:rFonts w:eastAsia="Songti SC" w:cs="Arial Unicode MS" w:ascii="Helvetica" w:hAnsi="Helvetica"/>
-          <w:sz w:val="20"/>
-          <w:szCs w:val="20"/>
-        </w:rPr>
-      </w:r>
-    </w:p>
-    <w:p>
-      <w:pPr>
-        <w:pStyle w:val="PreformattedText"/>
-        <w:spacing w:lineRule="auto" w:line="240" w:before="0" w:after="0"/>
-        <w:ind w:hanging="0" w:left="0" w:right="0"/>
-        <w:rPr>
-          <w:rFonts w:ascii="Helvetica Neue" w:hAnsi="Helvetica Neue" w:eastAsia="Songti SC" w:cs="Arial Unicode MS"/>
-          <w:sz w:val="24"/>
-          <w:szCs w:val="24"/>
-        </w:rPr>
-      </w:pPr>
-      <w:r>
-        <w:rPr>
-          <w:rStyle w:val="SourceText"/>
-          <w:rFonts w:ascii="Helvetica" w:hAnsi="Helvetica"/>
-          <w:color w:val="6E7687"/>
-          <w:sz w:val="20"/>
-          <w:szCs w:val="20"/>
-          <w:shd w:fill="auto" w:val="clear"/>
-        </w:rPr>
-        <w:t># 6. Download subscriber list (any time)</w:t>
-      </w:r>
-    </w:p>
-    <w:p>
-      <w:pPr>
-        <w:pStyle w:val="PreformattedText"/>
-        <w:spacing w:lineRule="auto" w:line="240" w:before="0" w:after="0"/>
-        <w:rPr>
-          <w:rFonts w:ascii="Helvetica Neue" w:hAnsi="Helvetica Neue" w:eastAsia="Songti SC" w:cs="Arial Unicode MS"/>
-          <w:sz w:val="24"/>
-          <w:szCs w:val="24"/>
-        </w:rPr>
-      </w:pPr>
-      <w:r>
-        <w:rPr>
-          <w:rStyle w:val="SourceText"/>
-          <w:rFonts w:ascii="Helvetica" w:hAnsi="Helvetica"/>
           <w:color w:val="14181F"/>
           <w:sz w:val="20"/>
           <w:szCs w:val="20"/>
@@ -1871,7 +1915,11 @@
         </w:rPr>
       </w:pPr>
       <w:r>
-        <w:rPr/>
+        <w:rPr>
+          <w:rFonts w:ascii="Helvetica" w:hAnsi="Helvetica"/>
+          <w:sz w:val="20"/>
+          <w:szCs w:val="20"/>
+        </w:rPr>
       </w:r>
     </w:p>
     <w:p>
@@ -2203,7 +2251,31 @@
         </w:rPr>
       </w:pPr>
       <w:r>
+        <w:rPr>
+          <w:rFonts w:ascii="Helvetica" w:hAnsi="Helvetica"/>
+          <w:b w:val="false"/>
+          <w:bCs w:val="false"/>
+          <w:sz w:val="20"/>
+          <w:szCs w:val="20"/>
+        </w:rPr>
+      </w:r>
+    </w:p>
+    <w:p>
+      <w:pPr>
+        <w:pStyle w:val="BodyText"/>
+        <w:bidi w:val="0"/>
+        <w:spacing w:lineRule="auto" w:line="240" w:before="0" w:after="0"/>
+        <w:jc w:val="left"/>
         <w:rPr/>
+      </w:pPr>
+      <w:r>
+        <w:rPr>
+          <w:rStyle w:val="Strong"/>
+          <w:rFonts w:ascii="Helvetica" w:hAnsi="Helvetica"/>
+          <w:sz w:val="20"/>
+          <w:szCs w:val="20"/>
+        </w:rPr>
+        <w:t>ABOUT BLOG PATCH AND BLOG EDITOR SCRIPT</w:t>
       </w:r>
     </w:p>
     <w:p>
@@ -2212,6 +2284,27 @@
         <w:bidi w:val="0"/>
         <w:spacing w:lineRule="auto" w:line="240" w:before="0" w:after="0"/>
         <w:jc w:val="left"/>
+        <w:rPr>
+          <w:rStyle w:val="Strong"/>
+          <w:rFonts w:ascii="Helvetica" w:hAnsi="Helvetica"/>
+          <w:sz w:val="20"/>
+          <w:szCs w:val="20"/>
+        </w:rPr>
+      </w:pPr>
+      <w:r>
+        <w:rPr>
+          <w:rFonts w:ascii="Helvetica" w:hAnsi="Helvetica"/>
+          <w:sz w:val="20"/>
+          <w:szCs w:val="20"/>
+        </w:rPr>
+      </w:r>
+    </w:p>
+    <w:p>
+      <w:pPr>
+        <w:pStyle w:val="BodyText"/>
+        <w:bidi w:val="0"/>
+        <w:spacing w:lineRule="auto" w:line="240" w:before="0" w:after="0"/>
+        <w:jc w:val="left"/>
         <w:rPr/>
       </w:pPr>
       <w:r>
@@ -2221,7 +2314,7 @@
           <w:sz w:val="20"/>
           <w:szCs w:val="20"/>
         </w:rPr>
-        <w:t>ABOUT BLOG PATCH AND BLOG EDITOR SCRIPT</w:t>
+        <w:t>1.Copy the file to your Scripts folder:</w:t>
       </w:r>
     </w:p>
     <w:p>
@@ -2238,7 +2331,32 @@
         </w:rPr>
       </w:pPr>
       <w:r>
+        <w:rPr>
+          <w:rFonts w:ascii="Helvetica" w:hAnsi="Helvetica"/>
+          <w:sz w:val="20"/>
+          <w:szCs w:val="20"/>
+        </w:rPr>
+      </w:r>
+    </w:p>
+    <w:p>
+      <w:pPr>
+        <w:pStyle w:val="PreformattedText"/>
+        <w:bidi w:val="0"/>
+        <w:spacing w:lineRule="auto" w:line="240" w:before="0" w:after="0"/>
+        <w:ind w:hanging="0" w:left="0" w:right="0"/>
+        <w:jc w:val="left"/>
         <w:rPr/>
+      </w:pPr>
+      <w:r>
+        <w:rPr>
+          <w:rStyle w:val="SourceText"/>
+          <w:rFonts w:ascii="Helvetica" w:hAnsi="Helvetica"/>
+          <w:color w:val="14181F"/>
+          <w:sz w:val="20"/>
+          <w:szCs w:val="20"/>
+          <w:shd w:fill="auto" w:val="clear"/>
+        </w:rPr>
+        <w:t>cp ~/Downloads/blog_patch.py /Users/ncm/Pictures/Mohangraphy/Scripts/</w:t>
       </w:r>
     </w:p>
     <w:p>
@@ -2247,6 +2365,27 @@
         <w:bidi w:val="0"/>
         <w:spacing w:lineRule="auto" w:line="240" w:before="0" w:after="0"/>
         <w:jc w:val="left"/>
+        <w:rPr>
+          <w:rStyle w:val="Strong"/>
+          <w:rFonts w:ascii="Helvetica" w:hAnsi="Helvetica"/>
+          <w:sz w:val="20"/>
+          <w:szCs w:val="20"/>
+        </w:rPr>
+      </w:pPr>
+      <w:r>
+        <w:rPr>
+          <w:rFonts w:ascii="Helvetica" w:hAnsi="Helvetica"/>
+          <w:sz w:val="20"/>
+          <w:szCs w:val="20"/>
+        </w:rPr>
+      </w:r>
+    </w:p>
+    <w:p>
+      <w:pPr>
+        <w:pStyle w:val="BodyText"/>
+        <w:bidi w:val="0"/>
+        <w:spacing w:lineRule="auto" w:line="240" w:before="0" w:after="0"/>
+        <w:jc w:val="left"/>
         <w:rPr/>
       </w:pPr>
       <w:r>
@@ -2256,16 +2395,75 @@
           <w:sz w:val="20"/>
           <w:szCs w:val="20"/>
         </w:rPr>
-        <w:t>1.</w:t>
-      </w:r>
-      <w:r>
+        <w:t>2. Run it once:</w:t>
+      </w:r>
+    </w:p>
+    <w:p>
+      <w:pPr>
+        <w:pStyle w:val="BodyText"/>
+        <w:bidi w:val="0"/>
+        <w:spacing w:lineRule="auto" w:line="240" w:before="0" w:after="0"/>
+        <w:jc w:val="left"/>
         <w:rPr>
           <w:rStyle w:val="Strong"/>
           <w:rFonts w:ascii="Helvetica" w:hAnsi="Helvetica"/>
           <w:sz w:val="20"/>
           <w:szCs w:val="20"/>
         </w:rPr>
-        <w:t>Copy the file to your Scripts folder:</w:t>
+      </w:pPr>
+      <w:r>
+        <w:rPr>
+          <w:rFonts w:ascii="Helvetica" w:hAnsi="Helvetica"/>
+          <w:sz w:val="20"/>
+          <w:szCs w:val="20"/>
+        </w:rPr>
+      </w:r>
+    </w:p>
+    <w:p>
+      <w:pPr>
+        <w:pStyle w:val="PreformattedText"/>
+        <w:bidi w:val="0"/>
+        <w:spacing w:lineRule="auto" w:line="240" w:before="0" w:after="0"/>
+        <w:ind w:hanging="0" w:left="0" w:right="0"/>
+        <w:jc w:val="left"/>
+        <w:rPr/>
+      </w:pPr>
+      <w:r>
+        <w:rPr>
+          <w:rStyle w:val="SourceText"/>
+          <w:rFonts w:ascii="Helvetica" w:hAnsi="Helvetica"/>
+          <w:color w:val="14181F"/>
+          <w:sz w:val="20"/>
+          <w:szCs w:val="20"/>
+          <w:shd w:fill="auto" w:val="clear"/>
+        </w:rPr>
+        <w:t>python3 /Users/ncm/Pictures/Mohangraphy/Scripts/blog_patch.py</w:t>
+      </w:r>
+    </w:p>
+    <w:p>
+      <w:pPr>
+        <w:pStyle w:val="PreformattedText"/>
+        <w:bidi w:val="0"/>
+        <w:spacing w:lineRule="auto" w:line="240" w:before="0" w:after="0"/>
+        <w:ind w:hanging="0" w:left="0" w:right="0"/>
+        <w:jc w:val="left"/>
+        <w:rPr>
+          <w:rStyle w:val="SourceText"/>
+          <w:rFonts w:ascii="Helvetica" w:hAnsi="Helvetica"/>
+          <w:color w:val="14181F"/>
+          <w:sz w:val="20"/>
+          <w:szCs w:val="20"/>
+          <w:shd w:fill="auto" w:val="clear"/>
+        </w:rPr>
+      </w:pPr>
+      <w:r>
+        <w:rPr>
+          <w:rFonts w:ascii="Helvetica" w:hAnsi="Helvetica"/>
+          <w:color w:val="14181F"/>
+          <w:sz w:val="20"/>
+          <w:szCs w:val="20"/>
+          <w:shd w:fill="auto" w:val="clear"/>
+        </w:rPr>
       </w:r>
     </w:p>
     <w:p>
@@ -2275,6 +2473,27 @@
         <w:spacing w:lineRule="auto" w:line="240" w:before="0" w:after="0"/>
         <w:jc w:val="left"/>
         <w:rPr>
+          <w:rFonts w:ascii="Helvetica" w:hAnsi="Helvetica"/>
+          <w:sz w:val="20"/>
+          <w:szCs w:val="20"/>
+        </w:rPr>
+      </w:pPr>
+      <w:r>
+        <w:rPr>
+          <w:rFonts w:ascii="Helvetica" w:hAnsi="Helvetica"/>
+          <w:sz w:val="20"/>
+          <w:szCs w:val="20"/>
+        </w:rPr>
+        <w:t>It will print a checklist of 9 changes, verify syntax, back up your originals, then write everything. Takes about 3 seconds.</w:t>
+      </w:r>
+    </w:p>
+    <w:p>
+      <w:pPr>
+        <w:pStyle w:val="BodyText"/>
+        <w:bidi w:val="0"/>
+        <w:spacing w:lineRule="auto" w:line="240" w:before="0" w:after="0"/>
+        <w:jc w:val="left"/>
+        <w:rPr>
           <w:rStyle w:val="Strong"/>
           <w:rFonts w:ascii="Helvetica" w:hAnsi="Helvetica"/>
           <w:sz w:val="20"/>
@@ -2282,7 +2501,50 @@
         </w:rPr>
       </w:pPr>
       <w:r>
+        <w:rPr>
+          <w:rFonts w:ascii="Helvetica" w:hAnsi="Helvetica"/>
+          <w:sz w:val="20"/>
+          <w:szCs w:val="20"/>
+        </w:rPr>
+      </w:r>
+    </w:p>
+    <w:p>
+      <w:pPr>
+        <w:pStyle w:val="BodyText"/>
+        <w:bidi w:val="0"/>
+        <w:spacing w:lineRule="auto" w:line="240" w:before="0" w:after="0"/>
+        <w:jc w:val="left"/>
         <w:rPr/>
+      </w:pPr>
+      <w:r>
+        <w:rPr>
+          <w:rStyle w:val="Strong"/>
+          <w:rFonts w:ascii="Helvetica" w:hAnsi="Helvetica"/>
+          <w:sz w:val="20"/>
+          <w:szCs w:val="20"/>
+        </w:rPr>
+        <w:t>3. Write your first post:</w:t>
+      </w:r>
+    </w:p>
+    <w:p>
+      <w:pPr>
+        <w:pStyle w:val="BodyText"/>
+        <w:bidi w:val="0"/>
+        <w:spacing w:lineRule="auto" w:line="240" w:before="0" w:after="0"/>
+        <w:jc w:val="left"/>
+        <w:rPr>
+          <w:rStyle w:val="Strong"/>
+          <w:rFonts w:ascii="Helvetica" w:hAnsi="Helvetica"/>
+          <w:sz w:val="20"/>
+          <w:szCs w:val="20"/>
+        </w:rPr>
+      </w:pPr>
+      <w:r>
+        <w:rPr>
+          <w:rFonts w:ascii="Helvetica" w:hAnsi="Helvetica"/>
+          <w:sz w:val="20"/>
+          <w:szCs w:val="20"/>
+        </w:rPr>
       </w:r>
     </w:p>
     <w:p>
@@ -2303,7 +2565,33 @@
           <w:szCs w:val="20"/>
           <w:shd w:fill="auto" w:val="clear"/>
         </w:rPr>
-        <w:t>cp ~/Downloads/blog_patch.py /Users/ncm/Pictures/Mohangraphy/Scripts/</w:t>
+        <w:t>python3 /Users/ncm/Pictures/Mohangraphy/Scripts/blog_editor.py</w:t>
+      </w:r>
+    </w:p>
+    <w:p>
+      <w:pPr>
+        <w:pStyle w:val="PreformattedText"/>
+        <w:bidi w:val="0"/>
+        <w:spacing w:lineRule="auto" w:line="240" w:before="0" w:after="0"/>
+        <w:ind w:hanging="0" w:left="0" w:right="0"/>
+        <w:jc w:val="left"/>
+        <w:rPr>
+          <w:rStyle w:val="SourceText"/>
+          <w:rFonts w:ascii="Helvetica" w:hAnsi="Helvetica"/>
+          <w:color w:val="14181F"/>
+          <w:sz w:val="20"/>
+          <w:szCs w:val="20"/>
+          <w:shd w:fill="auto" w:val="clear"/>
+        </w:rPr>
+      </w:pPr>
+      <w:r>
+        <w:rPr>
+          <w:rFonts w:ascii="Helvetica" w:hAnsi="Helvetica"/>
+          <w:color w:val="14181F"/>
+          <w:sz w:val="20"/>
+          <w:szCs w:val="20"/>
+          <w:shd w:fill="auto" w:val="clear"/>
+        </w:rPr>
       </w:r>
     </w:p>
     <w:p>
@@ -2312,6 +2600,40 @@
         <w:bidi w:val="0"/>
         <w:spacing w:lineRule="auto" w:line="240" w:before="0" w:after="0"/>
         <w:jc w:val="left"/>
+        <w:rPr/>
+      </w:pPr>
+      <w:r>
+        <w:rPr>
+          <w:rFonts w:ascii="Helvetica" w:hAnsi="Helvetica"/>
+          <w:sz w:val="20"/>
+          <w:szCs w:val="20"/>
+        </w:rPr>
+        <w:t xml:space="preserve">The editor reads your existing </w:t>
+      </w:r>
+      <w:r>
+        <w:rPr>
+          <w:rStyle w:val="SourceText"/>
+          <w:rFonts w:ascii="Helvetica" w:hAnsi="Helvetica"/>
+          <w:sz w:val="20"/>
+          <w:szCs w:val="20"/>
+        </w:rPr>
+        <w:t>photo_metadata.json</w:t>
+      </w:r>
+      <w:r>
+        <w:rPr>
+          <w:rFonts w:ascii="Helvetica" w:hAnsi="Helvetica"/>
+          <w:sz w:val="20"/>
+          <w:szCs w:val="20"/>
+        </w:rPr>
+        <w:t xml:space="preserve"> and shows all your tagged places — Megamalai, Hampi, Badami etc. — as a pick-list so you don't have to type them. It walks you through each field with native Mac dialogs.</w:t>
+      </w:r>
+    </w:p>
+    <w:p>
+      <w:pPr>
+        <w:pStyle w:val="BodyText"/>
+        <w:bidi w:val="0"/>
+        <w:spacing w:lineRule="auto" w:line="240" w:before="0" w:after="0"/>
+        <w:jc w:val="left"/>
         <w:rPr>
           <w:rStyle w:val="Strong"/>
           <w:rFonts w:ascii="Helvetica" w:hAnsi="Helvetica"/>
@@ -2320,7 +2642,29 @@
         </w:rPr>
       </w:pPr>
       <w:r>
+        <w:rPr>
+          <w:rFonts w:ascii="Helvetica" w:hAnsi="Helvetica"/>
+          <w:sz w:val="20"/>
+          <w:szCs w:val="20"/>
+        </w:rPr>
+      </w:r>
+    </w:p>
+    <w:p>
+      <w:pPr>
+        <w:pStyle w:val="BodyText"/>
+        <w:bidi w:val="0"/>
+        <w:spacing w:lineRule="auto" w:line="240" w:before="0" w:after="0"/>
+        <w:jc w:val="left"/>
         <w:rPr/>
+      </w:pPr>
+      <w:r>
+        <w:rPr>
+          <w:rStyle w:val="Strong"/>
+          <w:rFonts w:ascii="Helvetica" w:hAnsi="Helvetica"/>
+          <w:sz w:val="20"/>
+          <w:szCs w:val="20"/>
+        </w:rPr>
+        <w:t>4. Deploy:</w:t>
       </w:r>
     </w:p>
     <w:p>
@@ -2329,46 +2673,32 @@
         <w:bidi w:val="0"/>
         <w:spacing w:lineRule="auto" w:line="240" w:before="0" w:after="0"/>
         <w:jc w:val="left"/>
+        <w:rPr>
+          <w:rStyle w:val="Strong"/>
+          <w:rFonts w:ascii="Helvetica" w:hAnsi="Helvetica"/>
+          <w:sz w:val="20"/>
+          <w:szCs w:val="20"/>
+        </w:rPr>
+      </w:pPr>
+      <w:r>
+        <w:rPr>
+          <w:rFonts w:ascii="Helvetica" w:hAnsi="Helvetica"/>
+          <w:sz w:val="20"/>
+          <w:szCs w:val="20"/>
+        </w:rPr>
+      </w:r>
+    </w:p>
+    <w:p>
+      <w:pPr>
+        <w:pStyle w:val="PreformattedText"/>
+        <w:bidi w:val="0"/>
+        <w:spacing w:lineRule="auto" w:line="240" w:before="0" w:after="0"/>
+        <w:ind w:hanging="0" w:left="0" w:right="0"/>
+        <w:jc w:val="left"/>
         <w:rPr/>
       </w:pPr>
       <w:r>
         <w:rPr>
-          <w:rStyle w:val="Strong"/>
-          <w:rFonts w:ascii="Helvetica" w:hAnsi="Helvetica"/>
-          <w:sz w:val="20"/>
-          <w:szCs w:val="20"/>
-        </w:rPr>
-        <w:t>2. Run it once:</w:t>
-      </w:r>
-    </w:p>
-    <w:p>
-      <w:pPr>
-        <w:pStyle w:val="BodyText"/>
-        <w:bidi w:val="0"/>
-        <w:spacing w:lineRule="auto" w:line="240" w:before="0" w:after="0"/>
-        <w:jc w:val="left"/>
-        <w:rPr>
-          <w:rStyle w:val="Strong"/>
-          <w:rFonts w:ascii="Helvetica" w:hAnsi="Helvetica"/>
-          <w:sz w:val="20"/>
-          <w:szCs w:val="20"/>
-        </w:rPr>
-      </w:pPr>
-      <w:r>
-        <w:rPr/>
-      </w:r>
-    </w:p>
-    <w:p>
-      <w:pPr>
-        <w:pStyle w:val="PreformattedText"/>
-        <w:bidi w:val="0"/>
-        <w:spacing w:lineRule="auto" w:line="240" w:before="0" w:after="0"/>
-        <w:ind w:hanging="0" w:left="0" w:right="0"/>
-        <w:jc w:val="left"/>
-        <w:rPr/>
-      </w:pPr>
-      <w:r>
-        <w:rPr>
           <w:rStyle w:val="SourceText"/>
           <w:rFonts w:ascii="Helvetica" w:hAnsi="Helvetica"/>
           <w:color w:val="14181F"/>
@@ -2376,247 +2706,6 @@
           <w:szCs w:val="20"/>
           <w:shd w:fill="auto" w:val="clear"/>
         </w:rPr>
-        <w:t>python3 /Users/ncm/Pictures/Mohangraphy/Scripts/blog_patch.py</w:t>
-      </w:r>
-    </w:p>
-    <w:p>
-      <w:pPr>
-        <w:pStyle w:val="PreformattedText"/>
-        <w:bidi w:val="0"/>
-        <w:spacing w:lineRule="auto" w:line="240" w:before="0" w:after="0"/>
-        <w:ind w:hanging="0" w:left="0" w:right="0"/>
-        <w:jc w:val="left"/>
-        <w:rPr>
-          <w:rStyle w:val="SourceText"/>
-          <w:rFonts w:ascii="Helvetica" w:hAnsi="Helvetica"/>
-          <w:color w:val="14181F"/>
-          <w:sz w:val="20"/>
-          <w:szCs w:val="20"/>
-          <w:shd w:fill="auto" w:val="clear"/>
-        </w:rPr>
-      </w:pPr>
-      <w:r>
-        <w:rPr/>
-      </w:r>
-    </w:p>
-    <w:p>
-      <w:pPr>
-        <w:pStyle w:val="BodyText"/>
-        <w:bidi w:val="0"/>
-        <w:spacing w:lineRule="auto" w:line="240" w:before="0" w:after="0"/>
-        <w:jc w:val="left"/>
-        <w:rPr>
-          <w:rFonts w:ascii="Helvetica" w:hAnsi="Helvetica"/>
-          <w:sz w:val="20"/>
-          <w:szCs w:val="20"/>
-        </w:rPr>
-      </w:pPr>
-      <w:r>
-        <w:rPr>
-          <w:rFonts w:ascii="Helvetica" w:hAnsi="Helvetica"/>
-          <w:sz w:val="20"/>
-          <w:szCs w:val="20"/>
-        </w:rPr>
-        <w:t>It will print a checklist of 9 changes, verify syntax, back up your originals, then write everything. Takes about 3 seconds.</w:t>
-      </w:r>
-    </w:p>
-    <w:p>
-      <w:pPr>
-        <w:pStyle w:val="BodyText"/>
-        <w:bidi w:val="0"/>
-        <w:spacing w:lineRule="auto" w:line="240" w:before="0" w:after="0"/>
-        <w:jc w:val="left"/>
-        <w:rPr>
-          <w:rStyle w:val="Strong"/>
-          <w:rFonts w:ascii="Helvetica" w:hAnsi="Helvetica"/>
-          <w:sz w:val="20"/>
-          <w:szCs w:val="20"/>
-        </w:rPr>
-      </w:pPr>
-      <w:r>
-        <w:rPr/>
-      </w:r>
-    </w:p>
-    <w:p>
-      <w:pPr>
-        <w:pStyle w:val="BodyText"/>
-        <w:bidi w:val="0"/>
-        <w:spacing w:lineRule="auto" w:line="240" w:before="0" w:after="0"/>
-        <w:jc w:val="left"/>
-        <w:rPr/>
-      </w:pPr>
-      <w:r>
-        <w:rPr>
-          <w:rStyle w:val="Strong"/>
-          <w:rFonts w:ascii="Helvetica" w:hAnsi="Helvetica"/>
-          <w:sz w:val="20"/>
-          <w:szCs w:val="20"/>
-        </w:rPr>
-        <w:t>3. Write your first post:</w:t>
-      </w:r>
-    </w:p>
-    <w:p>
-      <w:pPr>
-        <w:pStyle w:val="BodyText"/>
-        <w:bidi w:val="0"/>
-        <w:spacing w:lineRule="auto" w:line="240" w:before="0" w:after="0"/>
-        <w:jc w:val="left"/>
-        <w:rPr>
-          <w:rStyle w:val="Strong"/>
-          <w:rFonts w:ascii="Helvetica" w:hAnsi="Helvetica"/>
-          <w:sz w:val="20"/>
-          <w:szCs w:val="20"/>
-        </w:rPr>
-      </w:pPr>
-      <w:r>
-        <w:rPr/>
-      </w:r>
-    </w:p>
-    <w:p>
-      <w:pPr>
-        <w:pStyle w:val="PreformattedText"/>
-        <w:bidi w:val="0"/>
-        <w:spacing w:lineRule="auto" w:line="240" w:before="0" w:after="0"/>
-        <w:ind w:hanging="0" w:left="0" w:right="0"/>
-        <w:jc w:val="left"/>
-        <w:rPr/>
-      </w:pPr>
-      <w:r>
-        <w:rPr>
-          <w:rStyle w:val="SourceText"/>
-          <w:rFonts w:ascii="Helvetica" w:hAnsi="Helvetica"/>
-          <w:color w:val="14181F"/>
-          <w:sz w:val="20"/>
-          <w:szCs w:val="20"/>
-          <w:shd w:fill="auto" w:val="clear"/>
-        </w:rPr>
-        <w:t>python3 /Users/ncm/Pictures/Mohangraphy/Scripts/blog_editor.py</w:t>
-      </w:r>
-    </w:p>
-    <w:p>
-      <w:pPr>
-        <w:pStyle w:val="PreformattedText"/>
-        <w:bidi w:val="0"/>
-        <w:spacing w:lineRule="auto" w:line="240" w:before="0" w:after="0"/>
-        <w:ind w:hanging="0" w:left="0" w:right="0"/>
-        <w:jc w:val="left"/>
-        <w:rPr>
-          <w:rStyle w:val="SourceText"/>
-          <w:rFonts w:ascii="Helvetica" w:hAnsi="Helvetica"/>
-          <w:color w:val="14181F"/>
-          <w:sz w:val="20"/>
-          <w:szCs w:val="20"/>
-          <w:shd w:fill="auto" w:val="clear"/>
-        </w:rPr>
-      </w:pPr>
-      <w:r>
-        <w:rPr/>
-      </w:r>
-    </w:p>
-    <w:p>
-      <w:pPr>
-        <w:pStyle w:val="BodyText"/>
-        <w:bidi w:val="0"/>
-        <w:spacing w:lineRule="auto" w:line="240" w:before="0" w:after="0"/>
-        <w:jc w:val="left"/>
-        <w:rPr/>
-      </w:pPr>
-      <w:r>
-        <w:rPr>
-          <w:rFonts w:ascii="Helvetica" w:hAnsi="Helvetica"/>
-          <w:sz w:val="20"/>
-          <w:szCs w:val="20"/>
-        </w:rPr>
-        <w:t xml:space="preserve">The editor reads your existing </w:t>
-      </w:r>
-      <w:r>
-        <w:rPr>
-          <w:rStyle w:val="SourceText"/>
-          <w:rFonts w:ascii="Helvetica" w:hAnsi="Helvetica"/>
-          <w:sz w:val="20"/>
-          <w:szCs w:val="20"/>
-        </w:rPr>
-        <w:t>photo_metadata.json</w:t>
-      </w:r>
-      <w:r>
-        <w:rPr>
-          <w:rFonts w:ascii="Helvetica" w:hAnsi="Helvetica"/>
-          <w:sz w:val="20"/>
-          <w:szCs w:val="20"/>
-        </w:rPr>
-        <w:t xml:space="preserve"> and shows all your tagged places — Megamalai, Hampi, Badami etc. — as a pick-list so you don't have to type them. It walks you through each field with native Mac dialogs.</w:t>
-      </w:r>
-    </w:p>
-    <w:p>
-      <w:pPr>
-        <w:pStyle w:val="BodyText"/>
-        <w:bidi w:val="0"/>
-        <w:spacing w:lineRule="auto" w:line="240" w:before="0" w:after="0"/>
-        <w:jc w:val="left"/>
-        <w:rPr>
-          <w:rStyle w:val="Strong"/>
-          <w:rFonts w:ascii="Helvetica" w:hAnsi="Helvetica"/>
-          <w:sz w:val="20"/>
-          <w:szCs w:val="20"/>
-        </w:rPr>
-      </w:pPr>
-      <w:r>
-        <w:rPr/>
-      </w:r>
-    </w:p>
-    <w:p>
-      <w:pPr>
-        <w:pStyle w:val="BodyText"/>
-        <w:bidi w:val="0"/>
-        <w:spacing w:lineRule="auto" w:line="240" w:before="0" w:after="0"/>
-        <w:jc w:val="left"/>
-        <w:rPr/>
-      </w:pPr>
-      <w:r>
-        <w:rPr>
-          <w:rStyle w:val="Strong"/>
-          <w:rFonts w:ascii="Helvetica" w:hAnsi="Helvetica"/>
-          <w:sz w:val="20"/>
-          <w:szCs w:val="20"/>
-        </w:rPr>
-        <w:t>4. Deploy:</w:t>
-      </w:r>
-    </w:p>
-    <w:p>
-      <w:pPr>
-        <w:pStyle w:val="BodyText"/>
-        <w:bidi w:val="0"/>
-        <w:spacing w:lineRule="auto" w:line="240" w:before="0" w:after="0"/>
-        <w:jc w:val="left"/>
-        <w:rPr>
-          <w:rStyle w:val="Strong"/>
-          <w:rFonts w:ascii="Helvetica" w:hAnsi="Helvetica"/>
-          <w:sz w:val="20"/>
-          <w:szCs w:val="20"/>
-        </w:rPr>
-      </w:pPr>
-      <w:r>
-        <w:rPr/>
-      </w:r>
-    </w:p>
-    <w:p>
-      <w:pPr>
-        <w:pStyle w:val="PreformattedText"/>
-        <w:bidi w:val="0"/>
-        <w:spacing w:lineRule="auto" w:line="240" w:before="0" w:after="0"/>
-        <w:ind w:hanging="0" w:left="0" w:right="0"/>
-        <w:jc w:val="left"/>
-        <w:rPr/>
-      </w:pPr>
-      <w:r>
-        <w:rPr>
-          <w:rStyle w:val="SourceText"/>
-          <w:rFonts w:ascii="Helvetica" w:hAnsi="Helvetica"/>
-          <w:color w:val="14181F"/>
-          <w:sz w:val="20"/>
-          <w:szCs w:val="20"/>
-          <w:shd w:fill="auto" w:val="clear"/>
-        </w:rPr>
         <w:t>python3 /Users/ncm/Pictures/Mohangraphy/Scripts/deploy.py</w:t>
       </w:r>
     </w:p>
@@ -2706,6 +2795,28 @@
           <w:szCs w:val="20"/>
         </w:rPr>
         <w:t>cp ~/Downloads/patch_tags.py /Users/ncm/Pictures/Mohangraphy/Scripts/</w:t>
+      </w:r>
+    </w:p>
+    <w:p>
+      <w:pPr>
+        <w:pStyle w:val="Normal"/>
+        <w:bidi w:val="0"/>
+        <w:spacing w:lineRule="auto" w:line="240" w:before="0" w:after="0"/>
+        <w:jc w:val="left"/>
+        <w:rPr>
+          <w:rFonts w:ascii="Helvetica" w:hAnsi="Helvetica"/>
+          <w:color w:val="000000"/>
+          <w:sz w:val="20"/>
+          <w:szCs w:val="20"/>
+        </w:rPr>
+      </w:pPr>
+      <w:r>
+        <w:rPr>
+          <w:rFonts w:ascii="Helvetica" w:hAnsi="Helvetica"/>
+          <w:color w:val="000000"/>
+          <w:sz w:val="20"/>
+          <w:szCs w:val="20"/>
+        </w:rPr>
       </w:r>
     </w:p>
     <w:p>
@@ -6959,7 +7070,6 @@
     <w:lvl w:ilvl="1">
       <w:start w:val="1"/>
       <w:numFmt w:val="none"/>
-      <w:pStyle w:val="Heading2"/>
       <w:suff w:val="nothing"/>
       <w:lvlText w:val=""/>
       <w:lvlJc w:val="left"/>
@@ -6973,7 +7083,6 @@
     <w:lvl w:ilvl="2">
       <w:start w:val="1"/>
       <w:numFmt w:val="none"/>
-      <w:pStyle w:val="Heading3"/>
       <w:suff w:val="nothing"/>
       <w:lvlText w:val=""/>
       <w:lvlJc w:val="left"/>
@@ -7158,8 +7267,8 @@
       <w:rFonts w:ascii="Liberation Mono" w:hAnsi="Liberation Mono" w:eastAsia="Liberation Mono" w:cs="Liberation Mono"/>
     </w:rPr>
   </w:style>
-  <w:style w:type="character" w:styleId="Bullets">
-    <w:name w:val="Bullets"/>
+  <w:style w:type="character" w:styleId="Bulletsuser">
+    <w:name w:val="Bullets (user)"/>
     <w:qFormat/>
     <w:rPr>
       <w:rFonts w:ascii="OpenSymbol" w:hAnsi="OpenSymbol" w:eastAsia="OpenSymbol" w:cs="OpenSymbol"/>

</xml_diff>

<commit_message>
Deploy 2026-04-04 11:37 — 8 file(s) updated
</commit_message>
<xml_diff>
--- a/Claude Notes.docx
+++ b/Claude Notes.docx
@@ -2,6 +2,283 @@
 <file path=word/document.xml><?xml version="1.0" encoding="utf-8"?>
 <w:document xmlns:o="urn:schemas-microsoft-com:office:office" xmlns:r="http://schemas.openxmlformats.org/officeDocument/2006/relationships" xmlns:v="urn:schemas-microsoft-com:vml" xmlns:w="http://schemas.openxmlformats.org/wordprocessingml/2006/main" xmlns:w10="urn:schemas-microsoft-com:office:word" xmlns:wp="http://schemas.openxmlformats.org/drawingml/2006/wordprocessingDrawing" xmlns:pic="http://schemas.openxmlformats.org/drawingml/2006/picture" xmlns:wps="http://schemas.microsoft.com/office/word/2010/wordprocessingShape" xmlns:wpg="http://schemas.microsoft.com/office/word/2010/wordprocessingGroup" xmlns:mc="http://schemas.openxmlformats.org/markup-compatibility/2006" xmlns:wp14="http://schemas.microsoft.com/office/word/2010/wordprocessingDrawing" xmlns:w14="http://schemas.microsoft.com/office/word/2010/wordml" xmlns:w15="http://schemas.microsoft.com/office/word/2012/wordml" mc:Ignorable="w14 wp14 w15">
   <w:body>
+    <w:p>
+      <w:pPr>
+        <w:pStyle w:val="Heading2"/>
+        <w:bidi w:val="0"/>
+        <w:spacing w:lineRule="auto" w:line="240" w:before="0" w:after="0"/>
+        <w:jc w:val="left"/>
+        <w:rPr/>
+      </w:pPr>
+      <w:r>
+        <w:rPr>
+          <w:rStyle w:val="Strong"/>
+          <w:rFonts w:ascii="Helvetica" w:hAnsi="Helvetica"/>
+          <w:b w:val="false"/>
+          <w:bCs w:val="false"/>
+          <w:sz w:val="20"/>
+          <w:szCs w:val="20"/>
+        </w:rPr>
+        <w:t>F</w:t>
+      </w:r>
+      <w:r>
+        <w:rPr>
+          <w:rStyle w:val="Strong"/>
+          <w:rFonts w:ascii="Helvetica" w:hAnsi="Helvetica"/>
+          <w:b w:val="false"/>
+          <w:bCs w:val="false"/>
+          <w:sz w:val="20"/>
+          <w:szCs w:val="20"/>
+        </w:rPr>
+        <w:t>u</w:t>
+      </w:r>
+      <w:r>
+        <w:rPr>
+          <w:rStyle w:val="Strong"/>
+          <w:rFonts w:ascii="Helvetica" w:hAnsi="Helvetica"/>
+          <w:b w:val="false"/>
+          <w:bCs w:val="false"/>
+          <w:sz w:val="20"/>
+          <w:szCs w:val="20"/>
+        </w:rPr>
+        <w:t>ture Vision:</w:t>
+      </w:r>
+    </w:p>
+    <w:p>
+      <w:pPr>
+        <w:pStyle w:val="BodyText"/>
+        <w:bidi w:val="0"/>
+        <w:spacing w:lineRule="auto" w:line="240" w:before="0" w:after="0"/>
+        <w:jc w:val="left"/>
+        <w:rPr>
+          <w:rStyle w:val="Strong"/>
+          <w:rFonts w:ascii="Helvetica" w:hAnsi="Helvetica"/>
+          <w:b w:val="false"/>
+          <w:bCs w:val="false"/>
+          <w:sz w:val="20"/>
+          <w:szCs w:val="20"/>
+        </w:rPr>
+      </w:pPr>
+      <w:r>
+        <w:rPr/>
+      </w:r>
+    </w:p>
+    <w:p>
+      <w:pPr>
+        <w:pStyle w:val="BodyText"/>
+        <w:bidi w:val="0"/>
+        <w:spacing w:lineRule="auto" w:line="240" w:before="0" w:after="0"/>
+        <w:jc w:val="left"/>
+        <w:rPr/>
+      </w:pPr>
+      <w:r>
+        <w:rPr>
+          <w:rStyle w:val="Strong"/>
+          <w:rFonts w:ascii="Helvetica" w:hAnsi="Helvetica"/>
+          <w:b w:val="false"/>
+          <w:bCs w:val="false"/>
+          <w:sz w:val="20"/>
+          <w:szCs w:val="20"/>
+        </w:rPr>
+        <w:t>Under Places : National and International</w:t>
+      </w:r>
+    </w:p>
+    <w:p>
+      <w:pPr>
+        <w:pStyle w:val="BodyText"/>
+        <w:bidi w:val="0"/>
+        <w:spacing w:lineRule="auto" w:line="240" w:before="0" w:after="0"/>
+        <w:jc w:val="left"/>
+        <w:rPr>
+          <w:rStyle w:val="Strong"/>
+          <w:rFonts w:ascii="Helvetica" w:hAnsi="Helvetica"/>
+          <w:b w:val="false"/>
+          <w:bCs w:val="false"/>
+          <w:sz w:val="20"/>
+          <w:szCs w:val="20"/>
+        </w:rPr>
+      </w:pPr>
+      <w:r>
+        <w:rPr/>
+      </w:r>
+    </w:p>
+    <w:p>
+      <w:pPr>
+        <w:pStyle w:val="BodyText"/>
+        <w:bidi w:val="0"/>
+        <w:spacing w:lineRule="auto" w:line="240" w:before="0" w:after="0"/>
+        <w:jc w:val="left"/>
+        <w:rPr/>
+      </w:pPr>
+      <w:r>
+        <w:rPr>
+          <w:rStyle w:val="Strong"/>
+          <w:rFonts w:ascii="Helvetica" w:hAnsi="Helvetica"/>
+          <w:b w:val="false"/>
+          <w:bCs w:val="false"/>
+          <w:sz w:val="20"/>
+          <w:szCs w:val="20"/>
+        </w:rPr>
+        <w:t>National : Show India Map – with each state in a different colour with the name of the state on it..</w:t>
+      </w:r>
+    </w:p>
+    <w:p>
+      <w:pPr>
+        <w:pStyle w:val="BodyText"/>
+        <w:bidi w:val="0"/>
+        <w:spacing w:lineRule="auto" w:line="240" w:before="0" w:after="0"/>
+        <w:jc w:val="left"/>
+        <w:rPr/>
+      </w:pPr>
+      <w:r>
+        <w:rPr>
+          <w:rStyle w:val="Strong"/>
+          <w:rFonts w:ascii="Helvetica" w:hAnsi="Helvetica"/>
+          <w:b w:val="false"/>
+          <w:bCs w:val="false"/>
+          <w:sz w:val="20"/>
+          <w:szCs w:val="20"/>
+        </w:rPr>
+        <w:t>When the cursor hovers over a state, it should highlight the name of the state, if it has photos of that state.</w:t>
+      </w:r>
+    </w:p>
+    <w:p>
+      <w:pPr>
+        <w:pStyle w:val="BodyText"/>
+        <w:bidi w:val="0"/>
+        <w:spacing w:lineRule="auto" w:line="240" w:before="0" w:after="0"/>
+        <w:jc w:val="left"/>
+        <w:rPr/>
+      </w:pPr>
+      <w:r>
+        <w:rPr>
+          <w:rStyle w:val="Strong"/>
+          <w:rFonts w:ascii="Helvetica" w:hAnsi="Helvetica"/>
+          <w:b w:val="false"/>
+          <w:bCs w:val="false"/>
+          <w:sz w:val="20"/>
+          <w:szCs w:val="20"/>
+        </w:rPr>
+        <w:t>On the bottom right, it should list all states and should highlight the URL link if it has photos of that state.</w:t>
+      </w:r>
+    </w:p>
+    <w:p>
+      <w:pPr>
+        <w:pStyle w:val="BodyText"/>
+        <w:bidi w:val="0"/>
+        <w:spacing w:lineRule="auto" w:line="240" w:before="0" w:after="0"/>
+        <w:jc w:val="left"/>
+        <w:rPr/>
+      </w:pPr>
+      <w:r>
+        <w:rPr>
+          <w:rStyle w:val="Strong"/>
+          <w:rFonts w:ascii="Helvetica" w:hAnsi="Helvetica"/>
+          <w:b w:val="false"/>
+          <w:bCs w:val="false"/>
+          <w:sz w:val="20"/>
+          <w:szCs w:val="20"/>
+        </w:rPr>
+        <w:t xml:space="preserve">When a State has photos and the user clicks on a state on the map or on the list, it should open a separate window and show a map of that state and the cities covered in that State. The city names should be placed according to the geographyic location. Once the state map is opened, the user can click on the cities visited where photos have been uploded corresponding to that city. </w:t>
+      </w:r>
+    </w:p>
+    <w:p>
+      <w:pPr>
+        <w:pStyle w:val="BodyText"/>
+        <w:bidi w:val="0"/>
+        <w:spacing w:lineRule="auto" w:line="240" w:before="0" w:after="0"/>
+        <w:jc w:val="left"/>
+        <w:rPr/>
+      </w:pPr>
+      <w:r>
+        <w:rPr>
+          <w:rStyle w:val="Strong"/>
+          <w:rFonts w:ascii="Helvetica" w:hAnsi="Helvetica"/>
+          <w:b w:val="false"/>
+          <w:bCs w:val="false"/>
+          <w:sz w:val="20"/>
+          <w:szCs w:val="20"/>
+        </w:rPr>
+        <w:t>For example, When I click on Kerala, it should open the map of Kerala. And, it should show Thekkady and Munnar in the Kerala map according to where it is geographyically located. Then the user clicks on Thekkady, it should take the user to the photos of Thekkady.</w:t>
+      </w:r>
+    </w:p>
+    <w:p>
+      <w:pPr>
+        <w:pStyle w:val="BodyText"/>
+        <w:bidi w:val="0"/>
+        <w:spacing w:lineRule="auto" w:line="240" w:before="0" w:after="0"/>
+        <w:jc w:val="left"/>
+        <w:rPr>
+          <w:rStyle w:val="Strong"/>
+          <w:rFonts w:ascii="Helvetica" w:hAnsi="Helvetica"/>
+          <w:b w:val="false"/>
+          <w:bCs w:val="false"/>
+          <w:sz w:val="20"/>
+          <w:szCs w:val="20"/>
+        </w:rPr>
+      </w:pPr>
+      <w:r>
+        <w:rPr/>
+      </w:r>
+    </w:p>
+    <w:p>
+      <w:pPr>
+        <w:pStyle w:val="BodyText"/>
+        <w:bidi w:val="0"/>
+        <w:spacing w:lineRule="auto" w:line="240" w:before="0" w:after="0"/>
+        <w:jc w:val="left"/>
+        <w:rPr/>
+      </w:pPr>
+      <w:r>
+        <w:rPr>
+          <w:rStyle w:val="Strong"/>
+          <w:rFonts w:ascii="Helvetica" w:hAnsi="Helvetica"/>
+          <w:b w:val="false"/>
+          <w:bCs w:val="false"/>
+          <w:sz w:val="20"/>
+          <w:szCs w:val="20"/>
+        </w:rPr>
+        <w:t xml:space="preserve">International: Should have the maps of all continents as follows: Asia, Europe, North America, South America, Africa, Australia/New Zealand with the names of the countries highlighted if photos are uploaded to that country. When a country is selected, it should open the country’s map in a separate window with the list of cities visited with a link to photos of that city. The city names must be placed according to the geophraphic location. </w:t>
+      </w:r>
+    </w:p>
+    <w:p>
+      <w:pPr>
+        <w:pStyle w:val="Heading2"/>
+        <w:bidi w:val="0"/>
+        <w:spacing w:lineRule="auto" w:line="240" w:before="0" w:after="0"/>
+        <w:jc w:val="left"/>
+        <w:rPr>
+          <w:rStyle w:val="Strong"/>
+          <w:rFonts w:ascii="Helvetica" w:hAnsi="Helvetica"/>
+          <w:b w:val="false"/>
+          <w:bCs w:val="false"/>
+          <w:sz w:val="20"/>
+          <w:szCs w:val="20"/>
+        </w:rPr>
+      </w:pPr>
+      <w:r>
+        <w:rPr/>
+      </w:r>
+    </w:p>
+    <w:p>
+      <w:pPr>
+        <w:pStyle w:val="Heading2"/>
+        <w:bidi w:val="0"/>
+        <w:spacing w:lineRule="auto" w:line="240" w:before="0" w:after="0"/>
+        <w:jc w:val="left"/>
+        <w:rPr>
+          <w:rStyle w:val="Strong"/>
+          <w:rFonts w:ascii="Helvetica" w:hAnsi="Helvetica"/>
+          <w:b w:val="false"/>
+          <w:bCs w:val="false"/>
+          <w:sz w:val="20"/>
+          <w:szCs w:val="20"/>
+        </w:rPr>
+      </w:pPr>
+      <w:r>
+        <w:rPr/>
+      </w:r>
+    </w:p>
     <w:p>
       <w:pPr>
         <w:pStyle w:val="Heading2"/>
@@ -1878,6 +2155,59 @@
           <w:sz w:val="20"/>
           <w:szCs w:val="20"/>
         </w:rPr>
+      </w:r>
+    </w:p>
+    <w:p>
+      <w:pPr>
+        <w:pStyle w:val="PreformattedText"/>
+        <w:bidi w:val="0"/>
+        <w:spacing w:lineRule="auto" w:line="240" w:before="0" w:after="0"/>
+        <w:ind w:hanging="0" w:left="0" w:right="0"/>
+        <w:jc w:val="left"/>
+        <w:rPr/>
+      </w:pPr>
+      <w:r>
+        <w:rPr>
+          <w:rStyle w:val="SourceText"/>
+          <w:rFonts w:ascii="Helvetica" w:hAnsi="Helvetica"/>
+          <w:color w:val="14181F"/>
+          <w:shd w:fill="auto" w:val="clear"/>
+        </w:rPr>
+        <w:t>python3 /Users/ncm/Pictures/Mohangraphy/Scripts/deploy.py</w:t>
+      </w:r>
+    </w:p>
+    <w:p>
+      <w:pPr>
+        <w:pStyle w:val="PreformattedText"/>
+        <w:spacing w:lineRule="auto" w:line="240" w:before="0" w:after="0"/>
+        <w:rPr>
+          <w:rFonts w:ascii="Helvetica Neue" w:hAnsi="Helvetica Neue" w:eastAsia="Songti SC" w:cs="Arial Unicode MS"/>
+          <w:sz w:val="24"/>
+          <w:szCs w:val="24"/>
+        </w:rPr>
+      </w:pPr>
+      <w:r>
+        <w:rPr>
+          <w:rStyle w:val="SourceText"/>
+          <w:rFonts w:ascii="Helvetica" w:hAnsi="Helvetica"/>
+          <w:color w:val="14181F"/>
+          <w:shd w:fill="auto" w:val="clear"/>
+        </w:rPr>
+        <w:t>python3 /Users/ncm/Pictures/Mohangraphy/Scripts/Claude_mohangraphy.py</w:t>
+      </w:r>
+    </w:p>
+    <w:p>
+      <w:pPr>
+        <w:pStyle w:val="PreformattedText"/>
+        <w:spacing w:lineRule="auto" w:line="240" w:before="0" w:after="0"/>
+        <w:rPr>
+          <w:rFonts w:ascii="Helvetica Neue" w:hAnsi="Helvetica Neue" w:eastAsia="Songti SC" w:cs="Arial Unicode MS"/>
+          <w:sz w:val="24"/>
+          <w:szCs w:val="24"/>
+        </w:rPr>
+      </w:pPr>
+      <w:r>
+        <w:rPr/>
       </w:r>
     </w:p>
     <w:p>
@@ -7267,8 +7597,8 @@
       <w:rFonts w:ascii="Liberation Mono" w:hAnsi="Liberation Mono" w:eastAsia="Liberation Mono" w:cs="Liberation Mono"/>
     </w:rPr>
   </w:style>
-  <w:style w:type="character" w:styleId="Bulletsuser">
-    <w:name w:val="Bullets (user)"/>
+  <w:style w:type="character" w:styleId="Bullets">
+    <w:name w:val="Bullets"/>
     <w:qFormat/>
     <w:rPr>
       <w:rFonts w:ascii="OpenSymbol" w:hAnsi="OpenSymbol" w:eastAsia="OpenSymbol" w:cs="OpenSymbol"/>

</xml_diff>

<commit_message>
Deploy 2026-04-04 23:13 — 7 file(s) updated
</commit_message>
<xml_diff>
--- a/Claude Notes.docx
+++ b/Claude Notes.docx
@@ -19,9 +19,15 @@
           <w:sz w:val="20"/>
           <w:szCs w:val="20"/>
         </w:rPr>
-        <w:t>F</w:t>
-      </w:r>
-      <w:r>
+        <w:t>Future Vision:</w:t>
+      </w:r>
+    </w:p>
+    <w:p>
+      <w:pPr>
+        <w:pStyle w:val="BodyText"/>
+        <w:bidi w:val="0"/>
+        <w:spacing w:lineRule="auto" w:line="240" w:before="0" w:after="0"/>
+        <w:jc w:val="left"/>
         <w:rPr>
           <w:rStyle w:val="Strong"/>
           <w:rFonts w:ascii="Helvetica" w:hAnsi="Helvetica"/>
@@ -30,18 +36,15 @@
           <w:sz w:val="20"/>
           <w:szCs w:val="20"/>
         </w:rPr>
-        <w:t>u</w:t>
-      </w:r>
-      <w:r>
-        <w:rPr>
-          <w:rStyle w:val="Strong"/>
+      </w:pPr>
+      <w:r>
+        <w:rPr>
           <w:rFonts w:ascii="Helvetica" w:hAnsi="Helvetica"/>
           <w:b w:val="false"/>
           <w:bCs w:val="false"/>
           <w:sz w:val="20"/>
           <w:szCs w:val="20"/>
         </w:rPr>
-        <w:t>ture Vision:</w:t>
       </w:r>
     </w:p>
     <w:p>
@@ -50,6 +53,9 @@
         <w:bidi w:val="0"/>
         <w:spacing w:lineRule="auto" w:line="240" w:before="0" w:after="0"/>
         <w:jc w:val="left"/>
+        <w:rPr/>
+      </w:pPr>
+      <w:r>
         <w:rPr>
           <w:rStyle w:val="Strong"/>
           <w:rFonts w:ascii="Helvetica" w:hAnsi="Helvetica"/>
@@ -58,9 +64,7 @@
           <w:sz w:val="20"/>
           <w:szCs w:val="20"/>
         </w:rPr>
-      </w:pPr>
-      <w:r>
-        <w:rPr/>
+        <w:t>Under Places : National and International</w:t>
       </w:r>
     </w:p>
     <w:p>
@@ -69,9 +73,6 @@
         <w:bidi w:val="0"/>
         <w:spacing w:lineRule="auto" w:line="240" w:before="0" w:after="0"/>
         <w:jc w:val="left"/>
-        <w:rPr/>
-      </w:pPr>
-      <w:r>
         <w:rPr>
           <w:rStyle w:val="Strong"/>
           <w:rFonts w:ascii="Helvetica" w:hAnsi="Helvetica"/>
@@ -80,26 +81,15 @@
           <w:sz w:val="20"/>
           <w:szCs w:val="20"/>
         </w:rPr>
-        <w:t>Under Places : National and International</w:t>
-      </w:r>
-    </w:p>
-    <w:p>
-      <w:pPr>
-        <w:pStyle w:val="BodyText"/>
-        <w:bidi w:val="0"/>
-        <w:spacing w:lineRule="auto" w:line="240" w:before="0" w:after="0"/>
-        <w:jc w:val="left"/>
-        <w:rPr>
-          <w:rStyle w:val="Strong"/>
+      </w:pPr>
+      <w:r>
+        <w:rPr>
           <w:rFonts w:ascii="Helvetica" w:hAnsi="Helvetica"/>
           <w:b w:val="false"/>
           <w:bCs w:val="false"/>
           <w:sz w:val="20"/>
           <w:szCs w:val="20"/>
         </w:rPr>
-      </w:pPr>
-      <w:r>
-        <w:rPr/>
       </w:r>
     </w:p>
     <w:p>
@@ -218,35 +208,24 @@
         </w:rPr>
       </w:pPr>
       <w:r>
-        <w:rPr/>
-      </w:r>
-    </w:p>
-    <w:p>
-      <w:pPr>
-        <w:pStyle w:val="BodyText"/>
-        <w:bidi w:val="0"/>
-        <w:spacing w:lineRule="auto" w:line="240" w:before="0" w:after="0"/>
-        <w:jc w:val="left"/>
-        <w:rPr/>
-      </w:pPr>
-      <w:r>
-        <w:rPr>
-          <w:rStyle w:val="Strong"/>
+        <w:rPr>
           <w:rFonts w:ascii="Helvetica" w:hAnsi="Helvetica"/>
           <w:b w:val="false"/>
           <w:bCs w:val="false"/>
           <w:sz w:val="20"/>
           <w:szCs w:val="20"/>
         </w:rPr>
-        <w:t xml:space="preserve">International: Should have the maps of all continents as follows: Asia, Europe, North America, South America, Africa, Australia/New Zealand with the names of the countries highlighted if photos are uploaded to that country. When a country is selected, it should open the country’s map in a separate window with the list of cities visited with a link to photos of that city. The city names must be placed according to the geophraphic location. </w:t>
-      </w:r>
-    </w:p>
-    <w:p>
-      <w:pPr>
-        <w:pStyle w:val="Heading2"/>
-        <w:bidi w:val="0"/>
-        <w:spacing w:lineRule="auto" w:line="240" w:before="0" w:after="0"/>
-        <w:jc w:val="left"/>
+      </w:r>
+    </w:p>
+    <w:p>
+      <w:pPr>
+        <w:pStyle w:val="BodyText"/>
+        <w:bidi w:val="0"/>
+        <w:spacing w:lineRule="auto" w:line="240" w:before="0" w:after="0"/>
+        <w:jc w:val="left"/>
+        <w:rPr/>
+      </w:pPr>
+      <w:r>
         <w:rPr>
           <w:rStyle w:val="Strong"/>
           <w:rFonts w:ascii="Helvetica" w:hAnsi="Helvetica"/>
@@ -255,9 +234,7 @@
           <w:sz w:val="20"/>
           <w:szCs w:val="20"/>
         </w:rPr>
-      </w:pPr>
-      <w:r>
-        <w:rPr/>
+        <w:t xml:space="preserve">International: Should have the maps of all continents as follows: Asia, Europe, North America, South America, Africa, Australia/New Zealand with the names of the countries highlighted if photos are uploaded to that country. When a country is selected, it should open the country’s map in a separate window with the list of cities visited with a link to photos of that city. The city names must be placed according to the geophraphic location. </w:t>
       </w:r>
     </w:p>
     <w:p>
@@ -276,7 +253,38 @@
         </w:rPr>
       </w:pPr>
       <w:r>
-        <w:rPr/>
+        <w:rPr>
+          <w:rFonts w:ascii="Helvetica" w:hAnsi="Helvetica"/>
+          <w:b w:val="false"/>
+          <w:bCs w:val="false"/>
+          <w:sz w:val="20"/>
+          <w:szCs w:val="20"/>
+        </w:rPr>
+      </w:r>
+    </w:p>
+    <w:p>
+      <w:pPr>
+        <w:pStyle w:val="Heading2"/>
+        <w:bidi w:val="0"/>
+        <w:spacing w:lineRule="auto" w:line="240" w:before="0" w:after="0"/>
+        <w:jc w:val="left"/>
+        <w:rPr>
+          <w:rStyle w:val="Strong"/>
+          <w:rFonts w:ascii="Helvetica" w:hAnsi="Helvetica"/>
+          <w:b w:val="false"/>
+          <w:bCs w:val="false"/>
+          <w:sz w:val="20"/>
+          <w:szCs w:val="20"/>
+        </w:rPr>
+      </w:pPr>
+      <w:r>
+        <w:rPr>
+          <w:rFonts w:ascii="Helvetica" w:hAnsi="Helvetica"/>
+          <w:b w:val="false"/>
+          <w:bCs w:val="false"/>
+          <w:sz w:val="20"/>
+          <w:szCs w:val="20"/>
+        </w:rPr>
       </w:r>
     </w:p>
     <w:p>
@@ -2208,6 +2216,79 @@
       </w:pPr>
       <w:r>
         <w:rPr/>
+      </w:r>
+    </w:p>
+    <w:p>
+      <w:pPr>
+        <w:pStyle w:val="PreformattedText"/>
+        <w:spacing w:lineRule="auto" w:line="240" w:before="0" w:after="0"/>
+        <w:rPr>
+          <w:rFonts w:ascii="Helvetica Neue" w:hAnsi="Helvetica Neue" w:eastAsia="Songti SC" w:cs="Arial Unicode MS"/>
+          <w:sz w:val="24"/>
+          <w:szCs w:val="24"/>
+        </w:rPr>
+      </w:pPr>
+      <w:r>
+        <w:rPr>
+          <w:rStyle w:val="Strong"/>
+          <w:rFonts w:eastAsia="Songti SC" w:cs="Arial Unicode MS" w:ascii="Helvetica Neue" w:hAnsi="Helvetica Neue"/>
+          <w:color w:val="14181F"/>
+          <w:sz w:val="24"/>
+          <w:szCs w:val="24"/>
+          <w:shd w:fill="auto" w:val="clear"/>
+        </w:rPr>
+        <w:t>To prevent this in future</w:t>
+      </w:r>
+      <w:r>
+        <w:rPr>
+          <w:rStyle w:val="SourceText"/>
+          <w:rFonts w:eastAsia="Songti SC" w:cs="Arial Unicode MS" w:ascii="Helvetica Neue" w:hAnsi="Helvetica Neue"/>
+          <w:color w:val="14181F"/>
+          <w:sz w:val="24"/>
+          <w:szCs w:val="24"/>
+          <w:shd w:fill="auto" w:val="clear"/>
+        </w:rPr>
+        <w:t xml:space="preserve"> — when you see the "Open in TextEdit" prompt, always right-click the link and choose </w:t>
+      </w:r>
+      <w:r>
+        <w:rPr>
+          <w:rStyle w:val="Strong"/>
+          <w:rFonts w:eastAsia="Songti SC" w:cs="Arial Unicode MS" w:ascii="Helvetica Neue" w:hAnsi="Helvetica Neue"/>
+          <w:color w:val="14181F"/>
+          <w:sz w:val="24"/>
+          <w:szCs w:val="24"/>
+          <w:shd w:fill="auto" w:val="clear"/>
+        </w:rPr>
+        <w:t>"Download Linked File"</w:t>
+      </w:r>
+      <w:r>
+        <w:rPr>
+          <w:rStyle w:val="SourceText"/>
+          <w:rFonts w:eastAsia="Songti SC" w:cs="Arial Unicode MS" w:ascii="Helvetica Neue" w:hAnsi="Helvetica Neue"/>
+          <w:color w:val="14181F"/>
+          <w:sz w:val="24"/>
+          <w:szCs w:val="24"/>
+          <w:shd w:fill="auto" w:val="clear"/>
+        </w:rPr>
+        <w:t xml:space="preserve"> rather than letting it open. That bypasses TextEdit entirely.</w:t>
+      </w:r>
+    </w:p>
+    <w:p>
+      <w:pPr>
+        <w:pStyle w:val="PreformattedText"/>
+        <w:spacing w:lineRule="auto" w:line="240" w:before="0" w:after="0"/>
+        <w:rPr>
+          <w:rFonts w:ascii="Helvetica Neue" w:hAnsi="Helvetica Neue" w:eastAsia="Songti SC" w:cs="Arial Unicode MS"/>
+          <w:sz w:val="24"/>
+          <w:szCs w:val="24"/>
+        </w:rPr>
+      </w:pPr>
+      <w:r>
+        <w:rPr>
+          <w:rFonts w:eastAsia="Songti SC" w:cs="Arial Unicode MS" w:ascii="Helvetica Neue" w:hAnsi="Helvetica Neue"/>
+          <w:sz w:val="24"/>
+          <w:szCs w:val="24"/>
+        </w:rPr>
       </w:r>
     </w:p>
     <w:p>
@@ -3047,26 +3128,6 @@
         <w:jc w:val="left"/>
         <w:rPr>
           <w:rFonts w:ascii="Helvetica" w:hAnsi="Helvetica"/>
-          <w:sz w:val="20"/>
-          <w:szCs w:val="20"/>
-        </w:rPr>
-      </w:pPr>
-      <w:r>
-        <w:rPr>
-          <w:rFonts w:ascii="Helvetica" w:hAnsi="Helvetica"/>
-          <w:sz w:val="20"/>
-          <w:szCs w:val="20"/>
-        </w:rPr>
-      </w:r>
-    </w:p>
-    <w:p>
-      <w:pPr>
-        <w:pStyle w:val="Normal"/>
-        <w:bidi w:val="0"/>
-        <w:spacing w:lineRule="auto" w:line="240" w:before="0" w:after="0"/>
-        <w:jc w:val="left"/>
-        <w:rPr>
-          <w:rFonts w:ascii="Helvetica" w:hAnsi="Helvetica"/>
           <w:color w:val="000000"/>
           <w:sz w:val="20"/>
           <w:szCs w:val="20"/>
@@ -3194,6 +3255,203 @@
         </w:rPr>
         <w:t>python3 /Users/ncm/Pictures/Mohangraphy/Scripts/Claude_mohangraphy.py</w:t>
       </w:r>
+    </w:p>
+    <w:p>
+      <w:pPr>
+        <w:pStyle w:val="Normal"/>
+        <w:bidi w:val="0"/>
+        <w:spacing w:lineRule="auto" w:line="240" w:before="0" w:after="0"/>
+        <w:jc w:val="left"/>
+        <w:rPr>
+          <w:rFonts w:ascii="Helvetica" w:hAnsi="Helvetica"/>
+          <w:color w:val="000000"/>
+          <w:sz w:val="20"/>
+          <w:szCs w:val="20"/>
+        </w:rPr>
+      </w:pPr>
+      <w:r>
+        <w:rPr>
+          <w:rFonts w:ascii="Helvetica" w:hAnsi="Helvetica"/>
+          <w:color w:val="000000"/>
+          <w:sz w:val="20"/>
+          <w:szCs w:val="20"/>
+        </w:rPr>
+      </w:r>
+    </w:p>
+    <w:p>
+      <w:pPr>
+        <w:pStyle w:val="BodyText"/>
+        <w:bidi w:val="0"/>
+        <w:spacing w:lineRule="auto" w:line="240" w:before="0" w:after="0"/>
+        <w:jc w:val="left"/>
+        <w:rPr>
+          <w:rFonts w:ascii="Helvetica" w:hAnsi="Helvetica"/>
+          <w:color w:val="000000"/>
+          <w:sz w:val="20"/>
+          <w:szCs w:val="20"/>
+        </w:rPr>
+      </w:pPr>
+      <w:r>
+        <w:rPr>
+          <w:rStyle w:val="Strong"/>
+          <w:rFonts w:ascii="Helvetica" w:hAnsi="Helvetica"/>
+          <w:color w:val="000000"/>
+          <w:sz w:val="20"/>
+          <w:szCs w:val="20"/>
+        </w:rPr>
+        <w:t>Inserting a photo in the blog</w:t>
+      </w:r>
+      <w:r>
+        <w:rPr>
+          <w:rFonts w:ascii="Helvetica" w:hAnsi="Helvetica"/>
+          <w:color w:val="000000"/>
+          <w:sz w:val="20"/>
+          <w:szCs w:val="20"/>
+        </w:rPr>
+        <w:t xml:space="preserve"> — add this anywhere in your </w:t>
+      </w:r>
+      <w:r>
+        <w:rPr>
+          <w:rStyle w:val="SourceText"/>
+          <w:rFonts w:ascii="Helvetica" w:hAnsi="Helvetica"/>
+          <w:color w:val="000000"/>
+          <w:sz w:val="20"/>
+          <w:szCs w:val="20"/>
+        </w:rPr>
+        <w:t>body</w:t>
+      </w:r>
+      <w:r>
+        <w:rPr>
+          <w:rFonts w:ascii="Helvetica" w:hAnsi="Helvetica"/>
+          <w:color w:val="000000"/>
+          <w:sz w:val="20"/>
+          <w:szCs w:val="20"/>
+        </w:rPr>
+        <w:t xml:space="preserve"> text in </w:t>
+      </w:r>
+      <w:r>
+        <w:rPr>
+          <w:rStyle w:val="SourceText"/>
+          <w:rFonts w:ascii="Helvetica" w:hAnsi="Helvetica"/>
+          <w:color w:val="000000"/>
+          <w:sz w:val="20"/>
+          <w:szCs w:val="20"/>
+        </w:rPr>
+        <w:t>blog_posts.json</w:t>
+      </w:r>
+      <w:r>
+        <w:rPr>
+          <w:rFonts w:ascii="Helvetica" w:hAnsi="Helvetica"/>
+          <w:color w:val="000000"/>
+          <w:sz w:val="20"/>
+          <w:szCs w:val="20"/>
+        </w:rPr>
+        <w:t>:</w:t>
+      </w:r>
+    </w:p>
+    <w:p>
+      <w:pPr>
+        <w:pStyle w:val="PreformattedText"/>
+        <w:spacing w:before="0" w:after="283"/>
+        <w:ind w:hanging="0" w:left="0" w:right="0"/>
+        <w:rPr>
+          <w:rFonts w:ascii="Helvetica" w:hAnsi="Helvetica" w:eastAsia="Songti SC" w:cs="Arial Unicode MS"/>
+          <w:color w:val="000000"/>
+        </w:rPr>
+      </w:pPr>
+      <w:r>
+        <w:rPr>
+          <w:rStyle w:val="SourceText"/>
+          <w:rFonts w:ascii="var font-mono" w:hAnsi="var font-mono"/>
+          <w:color w:val="000000"/>
+          <w:shd w:fill="auto" w:val="clear"/>
+        </w:rPr>
+        <w:t>[photo: 2026-0324-Tadoba-NCM-9512.JPG]</w:t>
+      </w:r>
+    </w:p>
+    <w:p>
+      <w:pPr>
+        <w:pStyle w:val="BodyText"/>
+        <w:spacing w:lineRule="auto" w:line="240"/>
+        <w:rPr>
+          <w:rFonts w:ascii="Helvetica" w:hAnsi="Helvetica"/>
+          <w:color w:val="000000"/>
+          <w:sz w:val="20"/>
+          <w:szCs w:val="20"/>
+        </w:rPr>
+      </w:pPr>
+      <w:r>
+        <w:rPr>
+          <w:rFonts w:ascii="Helvetica" w:hAnsi="Helvetica"/>
+          <w:color w:val="000000"/>
+          <w:sz w:val="20"/>
+          <w:szCs w:val="20"/>
+        </w:rPr>
+        <w:t>Or with a caption:</w:t>
+      </w:r>
+    </w:p>
+    <w:p>
+      <w:pPr>
+        <w:pStyle w:val="PreformattedText"/>
+        <w:spacing w:before="0" w:after="283"/>
+        <w:ind w:hanging="0" w:left="0" w:right="0"/>
+        <w:rPr>
+          <w:rFonts w:ascii="Helvetica" w:hAnsi="Helvetica" w:eastAsia="Songti SC" w:cs="Arial Unicode MS"/>
+          <w:color w:val="000000"/>
+        </w:rPr>
+      </w:pPr>
+      <w:r>
+        <w:rPr>
+          <w:rStyle w:val="SourceText"/>
+          <w:rFonts w:ascii="var font-mono" w:hAnsi="var font-mono"/>
+          <w:color w:val="000000"/>
+          <w:shd w:fill="auto" w:val="clear"/>
+        </w:rPr>
+        <w:t>[photo: 2026-0324-Tadoba-NCM-9512.JPG | The elusive tiger, finally spotted]</w:t>
+      </w:r>
+    </w:p>
+    <w:p>
+      <w:pPr>
+        <w:pStyle w:val="BodyText"/>
+        <w:spacing w:lineRule="auto" w:line="240"/>
+        <w:rPr>
+          <w:rFonts w:ascii="Helvetica" w:hAnsi="Helvetica"/>
+          <w:color w:val="000000"/>
+          <w:sz w:val="20"/>
+          <w:szCs w:val="20"/>
+        </w:rPr>
+      </w:pPr>
+      <w:r>
+        <w:rPr>
+          <w:rFonts w:ascii="Helvetica" w:hAnsi="Helvetica"/>
+          <w:color w:val="000000"/>
+          <w:sz w:val="20"/>
+          <w:szCs w:val="20"/>
+        </w:rPr>
+        <w:t>Use the exact filename. The photo becomes clickable (opens the lightbox). Separate it from surrounding text with blank lines like any other paragraph.</w:t>
+      </w:r>
+    </w:p>
+    <w:p>
+      <w:pPr>
+        <w:pStyle w:val="Normal"/>
+        <w:bidi w:val="0"/>
+        <w:spacing w:lineRule="auto" w:line="240" w:before="0" w:after="0"/>
+        <w:jc w:val="left"/>
+        <w:rPr>
+          <w:rFonts w:ascii="Helvetica" w:hAnsi="Helvetica"/>
+          <w:color w:val="000000"/>
+          <w:sz w:val="20"/>
+          <w:szCs w:val="20"/>
+        </w:rPr>
+      </w:pPr>
+      <w:r>
+        <w:rPr>
+          <w:rFonts w:ascii="Helvetica" w:hAnsi="Helvetica"/>
+          <w:color w:val="000000"/>
+          <w:sz w:val="20"/>
+          <w:szCs w:val="20"/>
+        </w:rPr>
+      </w:r>
       <w:r>
         <w:br w:type="page"/>
       </w:r>
@@ -7225,10 +7483,151 @@
       </w:pPr>
       <w:r>
         <w:rPr>
-          <w:rFonts w:ascii="Helvetica" w:hAnsi="Helvetica"/>
-          <w:sz w:val="20"/>
-          <w:szCs w:val="20"/>
-        </w:rPr>
+          <w:rFonts w:ascii="Arial;Helvetica;sans-serif" w:hAnsi="Arial;Helvetica;sans-serif"/>
+          <w:b w:val="false"/>
+          <w:i w:val="false"/>
+          <w:caps w:val="false"/>
+          <w:smallCaps w:val="false"/>
+          <w:color w:val="222222"/>
+          <w:spacing w:val="0"/>
+          <w:sz w:val="24"/>
+          <w:szCs w:val="20"/>
+        </w:rPr>
+        <w:t>13th afternoon;</w:t>
+      </w:r>
+    </w:p>
+    <w:p>
+      <w:pPr>
+        <w:pStyle w:val="Normal"/>
+        <w:bidi w:val="0"/>
+        <w:spacing w:lineRule="auto" w:line="240" w:before="0" w:after="0"/>
+        <w:jc w:val="left"/>
+        <w:rPr>
+          <w:rFonts w:ascii="Helvetica" w:hAnsi="Helvetica"/>
+          <w:sz w:val="20"/>
+          <w:szCs w:val="20"/>
+        </w:rPr>
+      </w:pPr>
+      <w:r>
+        <w:rPr>
+          <w:rFonts w:ascii="Arial;Helvetica;sans-serif" w:hAnsi="Arial;Helvetica;sans-serif"/>
+          <w:b w:val="false"/>
+          <w:i w:val="false"/>
+          <w:caps w:val="false"/>
+          <w:smallCaps w:val="false"/>
+          <w:color w:val="222222"/>
+          <w:spacing w:val="0"/>
+          <w:sz w:val="24"/>
+          <w:szCs w:val="20"/>
+        </w:rPr>
+        <w:t>a day trip to Santorini on 14th;</w:t>
+      </w:r>
+    </w:p>
+    <w:p>
+      <w:pPr>
+        <w:pStyle w:val="Normal"/>
+        <w:bidi w:val="0"/>
+        <w:spacing w:lineRule="auto" w:line="240" w:before="0" w:after="0"/>
+        <w:jc w:val="left"/>
+        <w:rPr>
+          <w:rFonts w:ascii="Helvetica" w:hAnsi="Helvetica"/>
+          <w:sz w:val="20"/>
+          <w:szCs w:val="20"/>
+        </w:rPr>
+      </w:pPr>
+      <w:r>
+        <w:rPr>
+          <w:rFonts w:ascii="Arial;Helvetica;sans-serif" w:hAnsi="Arial;Helvetica;sans-serif"/>
+          <w:b w:val="false"/>
+          <w:i w:val="false"/>
+          <w:caps w:val="false"/>
+          <w:smallCaps w:val="false"/>
+          <w:color w:val="222222"/>
+          <w:spacing w:val="0"/>
+          <w:sz w:val="24"/>
+          <w:szCs w:val="20"/>
+        </w:rPr>
+        <w:t>a day trip to Delphi on 15th;</w:t>
+      </w:r>
+    </w:p>
+    <w:p>
+      <w:pPr>
+        <w:pStyle w:val="Normal"/>
+        <w:bidi w:val="0"/>
+        <w:spacing w:lineRule="auto" w:line="240" w:before="0" w:after="0"/>
+        <w:jc w:val="left"/>
+        <w:rPr>
+          <w:rFonts w:ascii="Helvetica" w:hAnsi="Helvetica"/>
+          <w:sz w:val="20"/>
+          <w:szCs w:val="20"/>
+        </w:rPr>
+      </w:pPr>
+      <w:r>
+        <w:rPr>
+          <w:rFonts w:ascii="Arial;Helvetica;sans-serif" w:hAnsi="Arial;Helvetica;sans-serif"/>
+          <w:b w:val="false"/>
+          <w:i w:val="false"/>
+          <w:caps w:val="false"/>
+          <w:smallCaps w:val="false"/>
+          <w:color w:val="222222"/>
+          <w:spacing w:val="0"/>
+          <w:sz w:val="24"/>
+          <w:szCs w:val="20"/>
+        </w:rPr>
+        <w:t>and a day trip again on 16th to Hydra.</w:t>
+      </w:r>
+    </w:p>
+    <w:p>
+      <w:pPr>
+        <w:pStyle w:val="Normal"/>
+        <w:bidi w:val="0"/>
+        <w:spacing w:lineRule="auto" w:line="240" w:before="0" w:after="0"/>
+        <w:jc w:val="left"/>
+        <w:rPr>
+          <w:rFonts w:ascii="Helvetica" w:hAnsi="Helvetica"/>
+          <w:sz w:val="20"/>
+          <w:szCs w:val="20"/>
+        </w:rPr>
+      </w:pPr>
+      <w:r>
+        <w:rPr>
+          <w:rFonts w:ascii="Arial;Helvetica;sans-serif" w:hAnsi="Arial;Helvetica;sans-serif"/>
+          <w:b w:val="false"/>
+          <w:i w:val="false"/>
+          <w:caps w:val="false"/>
+          <w:smallCaps w:val="false"/>
+          <w:color w:val="222222"/>
+          <w:spacing w:val="0"/>
+          <w:sz w:val="24"/>
+          <w:szCs w:val="20"/>
+        </w:rPr>
+      </w:r>
+    </w:p>
+    <w:p>
+      <w:pPr>
+        <w:pStyle w:val="Normal"/>
+        <w:bidi w:val="0"/>
+        <w:spacing w:lineRule="auto" w:line="240" w:before="0" w:after="0"/>
+        <w:jc w:val="left"/>
+        <w:rPr>
+          <w:rFonts w:ascii="Helvetica" w:hAnsi="Helvetica"/>
+          <w:sz w:val="20"/>
+          <w:szCs w:val="20"/>
+        </w:rPr>
+      </w:pPr>
+      <w:r>
+        <w:rPr>
+          <w:rFonts w:ascii="Arial;Helvetica;sans-serif" w:hAnsi="Arial;Helvetica;sans-serif"/>
+          <w:b w:val="false"/>
+          <w:i w:val="false"/>
+          <w:caps w:val="false"/>
+          <w:smallCaps w:val="false"/>
+          <w:color w:val="222222"/>
+          <w:spacing w:val="0"/>
+          <w:sz w:val="24"/>
+          <w:szCs w:val="20"/>
+        </w:rPr>
+        <w:t>We will be staying in an Air BNB apartment from 13-17; We will move to Inter Continental on 17th and will be there thru 21st. While</w:t>
       </w:r>
     </w:p>
     <w:sectPr>
@@ -7597,8 +7996,8 @@
       <w:rFonts w:ascii="Liberation Mono" w:hAnsi="Liberation Mono" w:eastAsia="Liberation Mono" w:cs="Liberation Mono"/>
     </w:rPr>
   </w:style>
-  <w:style w:type="character" w:styleId="Bullets">
-    <w:name w:val="Bullets"/>
+  <w:style w:type="character" w:styleId="Bulletsuser">
+    <w:name w:val="Bullets (user)"/>
     <w:qFormat/>
     <w:rPr>
       <w:rFonts w:ascii="OpenSymbol" w:hAnsi="OpenSymbol" w:eastAsia="OpenSymbol" w:cs="OpenSymbol"/>

</xml_diff>

<commit_message>
Deploy 2026-04-04 23:47 — 6 file(s) updated
</commit_message>
<xml_diff>
--- a/Claude Notes.docx
+++ b/Claude Notes.docx
@@ -2,291 +2,6 @@
 <file path=word/document.xml><?xml version="1.0" encoding="utf-8"?>
 <w:document xmlns:o="urn:schemas-microsoft-com:office:office" xmlns:r="http://schemas.openxmlformats.org/officeDocument/2006/relationships" xmlns:v="urn:schemas-microsoft-com:vml" xmlns:w="http://schemas.openxmlformats.org/wordprocessingml/2006/main" xmlns:w10="urn:schemas-microsoft-com:office:word" xmlns:wp="http://schemas.openxmlformats.org/drawingml/2006/wordprocessingDrawing" xmlns:pic="http://schemas.openxmlformats.org/drawingml/2006/picture" xmlns:wps="http://schemas.microsoft.com/office/word/2010/wordprocessingShape" xmlns:wpg="http://schemas.microsoft.com/office/word/2010/wordprocessingGroup" xmlns:mc="http://schemas.openxmlformats.org/markup-compatibility/2006" xmlns:wp14="http://schemas.microsoft.com/office/word/2010/wordprocessingDrawing" xmlns:w14="http://schemas.microsoft.com/office/word/2010/wordml" xmlns:w15="http://schemas.microsoft.com/office/word/2012/wordml" mc:Ignorable="w14 wp14 w15">
   <w:body>
-    <w:p>
-      <w:pPr>
-        <w:pStyle w:val="Heading2"/>
-        <w:bidi w:val="0"/>
-        <w:spacing w:lineRule="auto" w:line="240" w:before="0" w:after="0"/>
-        <w:jc w:val="left"/>
-        <w:rPr/>
-      </w:pPr>
-      <w:r>
-        <w:rPr>
-          <w:rStyle w:val="Strong"/>
-          <w:rFonts w:ascii="Helvetica" w:hAnsi="Helvetica"/>
-          <w:b w:val="false"/>
-          <w:bCs w:val="false"/>
-          <w:sz w:val="20"/>
-          <w:szCs w:val="20"/>
-        </w:rPr>
-        <w:t>Future Vision:</w:t>
-      </w:r>
-    </w:p>
-    <w:p>
-      <w:pPr>
-        <w:pStyle w:val="BodyText"/>
-        <w:bidi w:val="0"/>
-        <w:spacing w:lineRule="auto" w:line="240" w:before="0" w:after="0"/>
-        <w:jc w:val="left"/>
-        <w:rPr>
-          <w:rStyle w:val="Strong"/>
-          <w:rFonts w:ascii="Helvetica" w:hAnsi="Helvetica"/>
-          <w:b w:val="false"/>
-          <w:bCs w:val="false"/>
-          <w:sz w:val="20"/>
-          <w:szCs w:val="20"/>
-        </w:rPr>
-      </w:pPr>
-      <w:r>
-        <w:rPr>
-          <w:rFonts w:ascii="Helvetica" w:hAnsi="Helvetica"/>
-          <w:b w:val="false"/>
-          <w:bCs w:val="false"/>
-          <w:sz w:val="20"/>
-          <w:szCs w:val="20"/>
-        </w:rPr>
-      </w:r>
-    </w:p>
-    <w:p>
-      <w:pPr>
-        <w:pStyle w:val="BodyText"/>
-        <w:bidi w:val="0"/>
-        <w:spacing w:lineRule="auto" w:line="240" w:before="0" w:after="0"/>
-        <w:jc w:val="left"/>
-        <w:rPr/>
-      </w:pPr>
-      <w:r>
-        <w:rPr>
-          <w:rStyle w:val="Strong"/>
-          <w:rFonts w:ascii="Helvetica" w:hAnsi="Helvetica"/>
-          <w:b w:val="false"/>
-          <w:bCs w:val="false"/>
-          <w:sz w:val="20"/>
-          <w:szCs w:val="20"/>
-        </w:rPr>
-        <w:t>Under Places : National and International</w:t>
-      </w:r>
-    </w:p>
-    <w:p>
-      <w:pPr>
-        <w:pStyle w:val="BodyText"/>
-        <w:bidi w:val="0"/>
-        <w:spacing w:lineRule="auto" w:line="240" w:before="0" w:after="0"/>
-        <w:jc w:val="left"/>
-        <w:rPr>
-          <w:rStyle w:val="Strong"/>
-          <w:rFonts w:ascii="Helvetica" w:hAnsi="Helvetica"/>
-          <w:b w:val="false"/>
-          <w:bCs w:val="false"/>
-          <w:sz w:val="20"/>
-          <w:szCs w:val="20"/>
-        </w:rPr>
-      </w:pPr>
-      <w:r>
-        <w:rPr>
-          <w:rFonts w:ascii="Helvetica" w:hAnsi="Helvetica"/>
-          <w:b w:val="false"/>
-          <w:bCs w:val="false"/>
-          <w:sz w:val="20"/>
-          <w:szCs w:val="20"/>
-        </w:rPr>
-      </w:r>
-    </w:p>
-    <w:p>
-      <w:pPr>
-        <w:pStyle w:val="BodyText"/>
-        <w:bidi w:val="0"/>
-        <w:spacing w:lineRule="auto" w:line="240" w:before="0" w:after="0"/>
-        <w:jc w:val="left"/>
-        <w:rPr/>
-      </w:pPr>
-      <w:r>
-        <w:rPr>
-          <w:rStyle w:val="Strong"/>
-          <w:rFonts w:ascii="Helvetica" w:hAnsi="Helvetica"/>
-          <w:b w:val="false"/>
-          <w:bCs w:val="false"/>
-          <w:sz w:val="20"/>
-          <w:szCs w:val="20"/>
-        </w:rPr>
-        <w:t>National : Show India Map – with each state in a different colour with the name of the state on it..</w:t>
-      </w:r>
-    </w:p>
-    <w:p>
-      <w:pPr>
-        <w:pStyle w:val="BodyText"/>
-        <w:bidi w:val="0"/>
-        <w:spacing w:lineRule="auto" w:line="240" w:before="0" w:after="0"/>
-        <w:jc w:val="left"/>
-        <w:rPr/>
-      </w:pPr>
-      <w:r>
-        <w:rPr>
-          <w:rStyle w:val="Strong"/>
-          <w:rFonts w:ascii="Helvetica" w:hAnsi="Helvetica"/>
-          <w:b w:val="false"/>
-          <w:bCs w:val="false"/>
-          <w:sz w:val="20"/>
-          <w:szCs w:val="20"/>
-        </w:rPr>
-        <w:t>When the cursor hovers over a state, it should highlight the name of the state, if it has photos of that state.</w:t>
-      </w:r>
-    </w:p>
-    <w:p>
-      <w:pPr>
-        <w:pStyle w:val="BodyText"/>
-        <w:bidi w:val="0"/>
-        <w:spacing w:lineRule="auto" w:line="240" w:before="0" w:after="0"/>
-        <w:jc w:val="left"/>
-        <w:rPr/>
-      </w:pPr>
-      <w:r>
-        <w:rPr>
-          <w:rStyle w:val="Strong"/>
-          <w:rFonts w:ascii="Helvetica" w:hAnsi="Helvetica"/>
-          <w:b w:val="false"/>
-          <w:bCs w:val="false"/>
-          <w:sz w:val="20"/>
-          <w:szCs w:val="20"/>
-        </w:rPr>
-        <w:t>On the bottom right, it should list all states and should highlight the URL link if it has photos of that state.</w:t>
-      </w:r>
-    </w:p>
-    <w:p>
-      <w:pPr>
-        <w:pStyle w:val="BodyText"/>
-        <w:bidi w:val="0"/>
-        <w:spacing w:lineRule="auto" w:line="240" w:before="0" w:after="0"/>
-        <w:jc w:val="left"/>
-        <w:rPr/>
-      </w:pPr>
-      <w:r>
-        <w:rPr>
-          <w:rStyle w:val="Strong"/>
-          <w:rFonts w:ascii="Helvetica" w:hAnsi="Helvetica"/>
-          <w:b w:val="false"/>
-          <w:bCs w:val="false"/>
-          <w:sz w:val="20"/>
-          <w:szCs w:val="20"/>
-        </w:rPr>
-        <w:t xml:space="preserve">When a State has photos and the user clicks on a state on the map or on the list, it should open a separate window and show a map of that state and the cities covered in that State. The city names should be placed according to the geographyic location. Once the state map is opened, the user can click on the cities visited where photos have been uploded corresponding to that city. </w:t>
-      </w:r>
-    </w:p>
-    <w:p>
-      <w:pPr>
-        <w:pStyle w:val="BodyText"/>
-        <w:bidi w:val="0"/>
-        <w:spacing w:lineRule="auto" w:line="240" w:before="0" w:after="0"/>
-        <w:jc w:val="left"/>
-        <w:rPr/>
-      </w:pPr>
-      <w:r>
-        <w:rPr>
-          <w:rStyle w:val="Strong"/>
-          <w:rFonts w:ascii="Helvetica" w:hAnsi="Helvetica"/>
-          <w:b w:val="false"/>
-          <w:bCs w:val="false"/>
-          <w:sz w:val="20"/>
-          <w:szCs w:val="20"/>
-        </w:rPr>
-        <w:t>For example, When I click on Kerala, it should open the map of Kerala. And, it should show Thekkady and Munnar in the Kerala map according to where it is geographyically located. Then the user clicks on Thekkady, it should take the user to the photos of Thekkady.</w:t>
-      </w:r>
-    </w:p>
-    <w:p>
-      <w:pPr>
-        <w:pStyle w:val="BodyText"/>
-        <w:bidi w:val="0"/>
-        <w:spacing w:lineRule="auto" w:line="240" w:before="0" w:after="0"/>
-        <w:jc w:val="left"/>
-        <w:rPr>
-          <w:rStyle w:val="Strong"/>
-          <w:rFonts w:ascii="Helvetica" w:hAnsi="Helvetica"/>
-          <w:b w:val="false"/>
-          <w:bCs w:val="false"/>
-          <w:sz w:val="20"/>
-          <w:szCs w:val="20"/>
-        </w:rPr>
-      </w:pPr>
-      <w:r>
-        <w:rPr>
-          <w:rFonts w:ascii="Helvetica" w:hAnsi="Helvetica"/>
-          <w:b w:val="false"/>
-          <w:bCs w:val="false"/>
-          <w:sz w:val="20"/>
-          <w:szCs w:val="20"/>
-        </w:rPr>
-      </w:r>
-    </w:p>
-    <w:p>
-      <w:pPr>
-        <w:pStyle w:val="BodyText"/>
-        <w:bidi w:val="0"/>
-        <w:spacing w:lineRule="auto" w:line="240" w:before="0" w:after="0"/>
-        <w:jc w:val="left"/>
-        <w:rPr/>
-      </w:pPr>
-      <w:r>
-        <w:rPr>
-          <w:rStyle w:val="Strong"/>
-          <w:rFonts w:ascii="Helvetica" w:hAnsi="Helvetica"/>
-          <w:b w:val="false"/>
-          <w:bCs w:val="false"/>
-          <w:sz w:val="20"/>
-          <w:szCs w:val="20"/>
-        </w:rPr>
-        <w:t xml:space="preserve">International: Should have the maps of all continents as follows: Asia, Europe, North America, South America, Africa, Australia/New Zealand with the names of the countries highlighted if photos are uploaded to that country. When a country is selected, it should open the country’s map in a separate window with the list of cities visited with a link to photos of that city. The city names must be placed according to the geophraphic location. </w:t>
-      </w:r>
-    </w:p>
-    <w:p>
-      <w:pPr>
-        <w:pStyle w:val="Heading2"/>
-        <w:bidi w:val="0"/>
-        <w:spacing w:lineRule="auto" w:line="240" w:before="0" w:after="0"/>
-        <w:jc w:val="left"/>
-        <w:rPr>
-          <w:rStyle w:val="Strong"/>
-          <w:rFonts w:ascii="Helvetica" w:hAnsi="Helvetica"/>
-          <w:b w:val="false"/>
-          <w:bCs w:val="false"/>
-          <w:sz w:val="20"/>
-          <w:szCs w:val="20"/>
-        </w:rPr>
-      </w:pPr>
-      <w:r>
-        <w:rPr>
-          <w:rFonts w:ascii="Helvetica" w:hAnsi="Helvetica"/>
-          <w:b w:val="false"/>
-          <w:bCs w:val="false"/>
-          <w:sz w:val="20"/>
-          <w:szCs w:val="20"/>
-        </w:rPr>
-      </w:r>
-    </w:p>
-    <w:p>
-      <w:pPr>
-        <w:pStyle w:val="Heading2"/>
-        <w:bidi w:val="0"/>
-        <w:spacing w:lineRule="auto" w:line="240" w:before="0" w:after="0"/>
-        <w:jc w:val="left"/>
-        <w:rPr>
-          <w:rStyle w:val="Strong"/>
-          <w:rFonts w:ascii="Helvetica" w:hAnsi="Helvetica"/>
-          <w:b w:val="false"/>
-          <w:bCs w:val="false"/>
-          <w:sz w:val="20"/>
-          <w:szCs w:val="20"/>
-        </w:rPr>
-      </w:pPr>
-      <w:r>
-        <w:rPr>
-          <w:rFonts w:ascii="Helvetica" w:hAnsi="Helvetica"/>
-          <w:b w:val="false"/>
-          <w:bCs w:val="false"/>
-          <w:sz w:val="20"/>
-          <w:szCs w:val="20"/>
-        </w:rPr>
-      </w:r>
-    </w:p>
     <w:p>
       <w:pPr>
         <w:pStyle w:val="Heading2"/>

</xml_diff>

<commit_message>
Deploy 2026-04-05 12:29 — 13 file(s) updated
</commit_message>
<xml_diff>
--- a/Claude Notes.docx
+++ b/Claude Notes.docx
@@ -1930,7 +1930,11 @@
         </w:rPr>
       </w:pPr>
       <w:r>
-        <w:rPr/>
+        <w:rPr>
+          <w:rFonts w:eastAsia="Songti SC" w:cs="Arial Unicode MS" w:ascii="Helvetica Neue" w:hAnsi="Helvetica Neue"/>
+          <w:sz w:val="24"/>
+          <w:szCs w:val="24"/>
+        </w:rPr>
       </w:r>
     </w:p>
     <w:p>
@@ -3122,7 +3126,34 @@
           <w:color w:val="000000"/>
           <w:shd w:fill="auto" w:val="clear"/>
         </w:rPr>
-        <w:t>[photo: 2026-0324-Tadoba-NCM-9512.JPG | The elusive tiger, finally spotted]</w:t>
+        <w:t>[photo: edit-2026-0326-Tadoba-VCM-IMG-4481.jpg |</w:t>
+      </w:r>
+      <w:r>
+        <w:rPr>
+          <w:rStyle w:val="SourceText"/>
+          <w:rFonts w:ascii="var font-mono" w:hAnsi="var font-mono"/>
+          <w:color w:val="000000"/>
+          <w:shd w:fill="auto" w:val="clear"/>
+        </w:rPr>
+        <w:t xml:space="preserve"> Safari @ Karwa</w:t>
+      </w:r>
+      <w:r>
+        <w:rPr>
+          <w:rStyle w:val="SourceText"/>
+          <w:rFonts w:ascii="var font-mono" w:hAnsi="var font-mono"/>
+          <w:color w:val="000000"/>
+          <w:shd w:fill="auto" w:val="clear"/>
+        </w:rPr>
+        <w:t>]</w:t>
+      </w:r>
+      <w:r>
+        <w:rPr>
+          <w:rStyle w:val="SourceText"/>
+          <w:rFonts w:ascii="var font-mono" w:hAnsi="var font-mono"/>
+          <w:color w:val="000000"/>
+          <w:shd w:fill="auto" w:val="clear"/>
+        </w:rPr>
+        <w:t>\n\n</w:t>
       </w:r>
     </w:p>
     <w:p>
@@ -7306,14 +7337,8 @@
       </w:pPr>
       <w:r>
         <w:rPr>
-          <w:rFonts w:ascii="Arial;Helvetica;sans-serif" w:hAnsi="Arial;Helvetica;sans-serif"/>
-          <w:b w:val="false"/>
-          <w:i w:val="false"/>
-          <w:caps w:val="false"/>
-          <w:smallCaps w:val="false"/>
-          <w:color w:val="222222"/>
-          <w:spacing w:val="0"/>
-          <w:sz w:val="24"/>
+          <w:rFonts w:ascii="Helvetica" w:hAnsi="Helvetica"/>
+          <w:sz w:val="20"/>
           <w:szCs w:val="20"/>
         </w:rPr>
       </w:r>
@@ -7711,8 +7736,8 @@
       <w:rFonts w:ascii="Liberation Mono" w:hAnsi="Liberation Mono" w:eastAsia="Liberation Mono" w:cs="Liberation Mono"/>
     </w:rPr>
   </w:style>
-  <w:style w:type="character" w:styleId="Bulletsuser">
-    <w:name w:val="Bullets (user)"/>
+  <w:style w:type="character" w:styleId="Bullets">
+    <w:name w:val="Bullets"/>
     <w:qFormat/>
     <w:rPr>
       <w:rFonts w:ascii="OpenSymbol" w:hAnsi="OpenSymbol" w:eastAsia="OpenSymbol" w:cs="OpenSymbol"/>

</xml_diff>

<commit_message>
Deploy 2026-04-08 13:39 — 4 file(s) updated
</commit_message>
<xml_diff>
--- a/Claude Notes.docx
+++ b/Claude Notes.docx
@@ -3126,34 +3126,7 @@
           <w:color w:val="000000"/>
           <w:shd w:fill="auto" w:val="clear"/>
         </w:rPr>
-        <w:t>[photo: edit-2026-0326-Tadoba-VCM-IMG-4481.jpg |</w:t>
-      </w:r>
-      <w:r>
-        <w:rPr>
-          <w:rStyle w:val="SourceText"/>
-          <w:rFonts w:ascii="var font-mono" w:hAnsi="var font-mono"/>
-          <w:color w:val="000000"/>
-          <w:shd w:fill="auto" w:val="clear"/>
-        </w:rPr>
-        <w:t xml:space="preserve"> Safari @ Karwa</w:t>
-      </w:r>
-      <w:r>
-        <w:rPr>
-          <w:rStyle w:val="SourceText"/>
-          <w:rFonts w:ascii="var font-mono" w:hAnsi="var font-mono"/>
-          <w:color w:val="000000"/>
-          <w:shd w:fill="auto" w:val="clear"/>
-        </w:rPr>
-        <w:t>]</w:t>
-      </w:r>
-      <w:r>
-        <w:rPr>
-          <w:rStyle w:val="SourceText"/>
-          <w:rFonts w:ascii="var font-mono" w:hAnsi="var font-mono"/>
-          <w:color w:val="000000"/>
-          <w:shd w:fill="auto" w:val="clear"/>
-        </w:rPr>
-        <w:t>\n\n</w:t>
+        <w:t>[photo: edit-2026-0326-Tadoba-VCM-IMG-4481.jpg | Safari @ Karwa]\n\n</w:t>
       </w:r>
     </w:p>
     <w:p>
@@ -3175,6 +3148,391 @@
           <w:szCs w:val="20"/>
         </w:rPr>
         <w:t>Use the exact filename. The photo becomes clickable (opens the lightbox). Separate it from surrounding text with blank lines like any other paragraph.</w:t>
+      </w:r>
+    </w:p>
+    <w:p>
+      <w:pPr>
+        <w:pStyle w:val="Normal"/>
+        <w:bidi w:val="0"/>
+        <w:spacing w:lineRule="auto" w:line="240" w:before="0" w:after="0"/>
+        <w:jc w:val="left"/>
+        <w:rPr>
+          <w:rFonts w:ascii="Helvetica" w:hAnsi="Helvetica"/>
+          <w:color w:val="000000"/>
+          <w:sz w:val="20"/>
+          <w:szCs w:val="20"/>
+        </w:rPr>
+      </w:pPr>
+      <w:r>
+        <w:rPr>
+          <w:rFonts w:ascii="Helvetica" w:hAnsi="Helvetica"/>
+          <w:color w:val="000000"/>
+          <w:sz w:val="20"/>
+          <w:szCs w:val="20"/>
+        </w:rPr>
+      </w:r>
+    </w:p>
+    <w:p>
+      <w:pPr>
+        <w:pStyle w:val="BodyText"/>
+        <w:bidi w:val="0"/>
+        <w:spacing w:lineRule="auto" w:line="240" w:before="0" w:after="0"/>
+        <w:jc w:val="left"/>
+        <w:rPr>
+          <w:rFonts w:ascii="Helvetica" w:hAnsi="Helvetica"/>
+          <w:color w:val="000000"/>
+          <w:sz w:val="20"/>
+          <w:szCs w:val="20"/>
+        </w:rPr>
+      </w:pPr>
+      <w:r>
+        <w:rPr>
+          <w:rFonts w:ascii="Helvetica" w:hAnsi="Helvetica"/>
+          <w:color w:val="000000"/>
+          <w:sz w:val="20"/>
+          <w:szCs w:val="20"/>
+        </w:rPr>
+        <w:t>A few things to be upfront about here:</w:t>
+      </w:r>
+    </w:p>
+    <w:p>
+      <w:pPr>
+        <w:pStyle w:val="BodyText"/>
+        <w:spacing w:lineRule="auto" w:line="240"/>
+        <w:rPr>
+          <w:rFonts w:ascii="Helvetica" w:hAnsi="Helvetica"/>
+          <w:color w:val="000000"/>
+          <w:sz w:val="20"/>
+          <w:szCs w:val="20"/>
+        </w:rPr>
+      </w:pPr>
+      <w:r>
+        <w:rPr>
+          <w:rStyle w:val="Strong"/>
+          <w:rFonts w:ascii="Helvetica" w:hAnsi="Helvetica"/>
+          <w:color w:val="000000"/>
+          <w:sz w:val="20"/>
+          <w:szCs w:val="20"/>
+        </w:rPr>
+        <w:t>I cannot see your personal usage data.</w:t>
+      </w:r>
+      <w:r>
+        <w:rPr>
+          <w:rFonts w:ascii="Helvetica" w:hAnsi="Helvetica"/>
+          <w:color w:val="000000"/>
+          <w:sz w:val="20"/>
+          <w:szCs w:val="20"/>
+        </w:rPr>
+        <w:t xml:space="preserve"> I have no access to how many messages you've sent, tokens consumed, or anything account-specific. That data lives in Anthropic's servers, not in this conversation.</w:t>
+      </w:r>
+    </w:p>
+    <w:p>
+      <w:pPr>
+        <w:pStyle w:val="BodyText"/>
+        <w:spacing w:lineRule="auto" w:line="240"/>
+        <w:rPr>
+          <w:rFonts w:ascii="Helvetica" w:hAnsi="Helvetica"/>
+          <w:color w:val="000000"/>
+          <w:sz w:val="20"/>
+          <w:szCs w:val="20"/>
+        </w:rPr>
+      </w:pPr>
+      <w:r>
+        <w:rPr>
+          <w:rStyle w:val="Strong"/>
+          <w:rFonts w:ascii="Helvetica" w:hAnsi="Helvetica"/>
+          <w:color w:val="000000"/>
+          <w:sz w:val="20"/>
+          <w:szCs w:val="20"/>
+        </w:rPr>
+        <w:t>On the limits themselves</w:t>
+      </w:r>
+      <w:r>
+        <w:rPr>
+          <w:rFonts w:ascii="Helvetica" w:hAnsi="Helvetica"/>
+          <w:color w:val="000000"/>
+          <w:sz w:val="20"/>
+          <w:szCs w:val="20"/>
+        </w:rPr>
+        <w:t xml:space="preserve"> — Anthropic intentionally doesn't publish hard, fixed numbers, and your usage is affected by several factors, including the length and complexity of your conversations, the features you use, and which Claude model you're chatting with. </w:t>
+      </w:r>
+      <w:hyperlink r:id="rId2" w:tgtFrame="_blank">
+        <w:r>
+          <w:rPr>
+            <w:rStyle w:val="Hyperlink"/>
+            <w:rFonts w:ascii="Helvetica" w:hAnsi="Helvetica"/>
+            <w:color w:val="000000"/>
+            <w:sz w:val="20"/>
+            <w:szCs w:val="20"/>
+          </w:rPr>
+          <w:t>Claude</w:t>
+        </w:r>
+      </w:hyperlink>
+      <w:r>
+        <w:rPr>
+          <w:rFonts w:ascii="Helvetica" w:hAnsi="Helvetica"/>
+          <w:color w:val="000000"/>
+          <w:sz w:val="20"/>
+          <w:szCs w:val="20"/>
+        </w:rPr>
+        <w:t xml:space="preserve"> So there's no simple "X messages per day" rule that applies universally.</w:t>
+      </w:r>
+    </w:p>
+    <w:p>
+      <w:pPr>
+        <w:pStyle w:val="BodyText"/>
+        <w:spacing w:lineRule="auto" w:line="240"/>
+        <w:rPr>
+          <w:rFonts w:ascii="Helvetica" w:hAnsi="Helvetica"/>
+          <w:color w:val="000000"/>
+          <w:sz w:val="20"/>
+          <w:szCs w:val="20"/>
+        </w:rPr>
+      </w:pPr>
+      <w:r>
+        <w:rPr>
+          <w:rFonts w:ascii="Helvetica" w:hAnsi="Helvetica"/>
+          <w:color w:val="000000"/>
+          <w:sz w:val="20"/>
+          <w:szCs w:val="20"/>
+        </w:rPr>
+        <w:t>What is known from current sources:</w:t>
+      </w:r>
+    </w:p>
+    <w:p>
+      <w:pPr>
+        <w:pStyle w:val="BodyText"/>
+        <w:numPr>
+          <w:ilvl w:val="0"/>
+          <w:numId w:val="2"/>
+        </w:numPr>
+        <w:tabs>
+          <w:tab w:val="clear" w:pos="709"/>
+          <w:tab w:val="left" w:pos="0" w:leader="none"/>
+        </w:tabs>
+        <w:spacing w:lineRule="auto" w:line="240" w:before="0" w:after="0"/>
+        <w:ind w:hanging="283" w:left="709"/>
+        <w:rPr>
+          <w:rFonts w:ascii="Helvetica" w:hAnsi="Helvetica"/>
+          <w:color w:val="000000"/>
+          <w:sz w:val="20"/>
+          <w:szCs w:val="20"/>
+        </w:rPr>
+      </w:pPr>
+      <w:r>
+        <w:rPr>
+          <w:rFonts w:ascii="Helvetica" w:hAnsi="Helvetica"/>
+          <w:color w:val="000000"/>
+          <w:sz w:val="20"/>
+          <w:szCs w:val="20"/>
+        </w:rPr>
+        <w:t xml:space="preserve">The rolling usage window resets every few hours rather than being a fixed daily total. </w:t>
+      </w:r>
+      <w:hyperlink r:id="rId3" w:tgtFrame="_blank">
+        <w:r>
+          <w:rPr>
+            <w:rStyle w:val="Hyperlink"/>
+            <w:rFonts w:ascii="Helvetica" w:hAnsi="Helvetica"/>
+            <w:color w:val="000000"/>
+            <w:sz w:val="20"/>
+            <w:szCs w:val="20"/>
+          </w:rPr>
+          <w:t>Verdent AI</w:t>
+        </w:r>
+      </w:hyperlink>
+      <w:r>
+        <w:rPr>
+          <w:rFonts w:ascii="Helvetica" w:hAnsi="Helvetica"/>
+          <w:color w:val="000000"/>
+          <w:sz w:val="20"/>
+          <w:szCs w:val="20"/>
+        </w:rPr>
+        <w:t xml:space="preserve"> It's not a strict per-day or per-week counter. </w:t>
+      </w:r>
+    </w:p>
+    <w:p>
+      <w:pPr>
+        <w:pStyle w:val="BodyText"/>
+        <w:numPr>
+          <w:ilvl w:val="0"/>
+          <w:numId w:val="2"/>
+        </w:numPr>
+        <w:tabs>
+          <w:tab w:val="clear" w:pos="709"/>
+          <w:tab w:val="left" w:pos="0" w:leader="none"/>
+        </w:tabs>
+        <w:spacing w:lineRule="auto" w:line="240" w:before="0" w:after="0"/>
+        <w:ind w:hanging="283" w:left="709"/>
+        <w:rPr>
+          <w:rFonts w:ascii="Helvetica" w:hAnsi="Helvetica"/>
+          <w:color w:val="000000"/>
+          <w:sz w:val="20"/>
+          <w:szCs w:val="20"/>
+        </w:rPr>
+      </w:pPr>
+      <w:r>
+        <w:rPr>
+          <w:rFonts w:ascii="Helvetica" w:hAnsi="Helvetica"/>
+          <w:color w:val="000000"/>
+          <w:sz w:val="20"/>
+          <w:szCs w:val="20"/>
+        </w:rPr>
+        <w:t xml:space="preserve">During weekdays between 5am–11am PT / 1pm–7pm GMT, you'll move through your 5-hour session limits faster than before </w:t>
+      </w:r>
+      <w:hyperlink r:id="rId4" w:tgtFrame="_blank">
+        <w:r>
+          <w:rPr>
+            <w:rStyle w:val="Hyperlink"/>
+            <w:rFonts w:ascii="Helvetica" w:hAnsi="Helvetica"/>
+            <w:color w:val="000000"/>
+            <w:sz w:val="20"/>
+            <w:szCs w:val="20"/>
+          </w:rPr>
+          <w:t>TechRadar</w:t>
+        </w:r>
+      </w:hyperlink>
+      <w:r>
+        <w:rPr>
+          <w:rFonts w:ascii="Helvetica" w:hAnsi="Helvetica"/>
+          <w:color w:val="000000"/>
+          <w:sz w:val="20"/>
+          <w:szCs w:val="20"/>
+        </w:rPr>
+        <w:t xml:space="preserve"> — Anthropic recently tightened limits during peak hours to manage demand. </w:t>
+      </w:r>
+    </w:p>
+    <w:p>
+      <w:pPr>
+        <w:pStyle w:val="BodyText"/>
+        <w:numPr>
+          <w:ilvl w:val="0"/>
+          <w:numId w:val="2"/>
+        </w:numPr>
+        <w:tabs>
+          <w:tab w:val="clear" w:pos="709"/>
+          <w:tab w:val="left" w:pos="0" w:leader="none"/>
+        </w:tabs>
+        <w:spacing w:lineRule="auto" w:line="240"/>
+        <w:ind w:hanging="283" w:left="709"/>
+        <w:rPr>
+          <w:rFonts w:ascii="Helvetica" w:hAnsi="Helvetica"/>
+          <w:color w:val="000000"/>
+          <w:sz w:val="20"/>
+          <w:szCs w:val="20"/>
+        </w:rPr>
+      </w:pPr>
+      <w:r>
+        <w:rPr>
+          <w:rFonts w:ascii="Helvetica" w:hAnsi="Helvetica"/>
+          <w:color w:val="000000"/>
+          <w:sz w:val="20"/>
+          <w:szCs w:val="20"/>
+        </w:rPr>
+        <w:t xml:space="preserve">Free tier users can expect to send around 40 short messages per day, dropping to around 20–30 per day for longer conversations or ones involving attachments. </w:t>
+      </w:r>
+      <w:hyperlink r:id="rId5" w:tgtFrame="_blank">
+        <w:r>
+          <w:rPr>
+            <w:rStyle w:val="Hyperlink"/>
+            <w:rFonts w:ascii="Helvetica" w:hAnsi="Helvetica"/>
+            <w:color w:val="000000"/>
+            <w:sz w:val="20"/>
+            <w:szCs w:val="20"/>
+          </w:rPr>
+          <w:t>16x Prompt</w:t>
+        </w:r>
+      </w:hyperlink>
+      <w:r>
+        <w:rPr>
+          <w:rFonts w:ascii="Helvetica" w:hAnsi="Helvetica"/>
+          <w:color w:val="000000"/>
+          <w:sz w:val="20"/>
+          <w:szCs w:val="20"/>
+        </w:rPr>
+        <w:t xml:space="preserve"> These are rough community estimates, not official figures. </w:t>
+      </w:r>
+    </w:p>
+    <w:p>
+      <w:pPr>
+        <w:pStyle w:val="BodyText"/>
+        <w:spacing w:lineRule="auto" w:line="240"/>
+        <w:rPr>
+          <w:rFonts w:ascii="Helvetica" w:hAnsi="Helvetica"/>
+          <w:color w:val="000000"/>
+          <w:sz w:val="20"/>
+          <w:szCs w:val="20"/>
+        </w:rPr>
+      </w:pPr>
+      <w:r>
+        <w:rPr>
+          <w:rStyle w:val="Strong"/>
+          <w:rFonts w:ascii="Helvetica" w:hAnsi="Helvetica"/>
+          <w:color w:val="000000"/>
+          <w:sz w:val="20"/>
+          <w:szCs w:val="20"/>
+        </w:rPr>
+        <w:t>How to check your own usage:</w:t>
+      </w:r>
+    </w:p>
+    <w:p>
+      <w:pPr>
+        <w:pStyle w:val="BodyText"/>
+        <w:spacing w:lineRule="auto" w:line="240"/>
+        <w:rPr>
+          <w:rFonts w:ascii="Helvetica" w:hAnsi="Helvetica"/>
+          <w:color w:val="000000"/>
+          <w:sz w:val="20"/>
+          <w:szCs w:val="20"/>
+        </w:rPr>
+      </w:pPr>
+      <w:r>
+        <w:rPr>
+          <w:rFonts w:ascii="Helvetica" w:hAnsi="Helvetica"/>
+          <w:color w:val="000000"/>
+          <w:sz w:val="20"/>
+          <w:szCs w:val="20"/>
+        </w:rPr>
+        <w:t xml:space="preserve">The only place your actual usage data is visible is within your claude.ai account itself. Go to </w:t>
+      </w:r>
+      <w:r>
+        <w:rPr>
+          <w:rStyle w:val="Strong"/>
+          <w:rFonts w:ascii="Helvetica" w:hAnsi="Helvetica"/>
+          <w:color w:val="000000"/>
+          <w:sz w:val="20"/>
+          <w:szCs w:val="20"/>
+        </w:rPr>
+        <w:t>claude.ai → Settings</w:t>
+      </w:r>
+      <w:r>
+        <w:rPr>
+          <w:rFonts w:ascii="Helvetica" w:hAnsi="Helvetica"/>
+          <w:color w:val="000000"/>
+          <w:sz w:val="20"/>
+          <w:szCs w:val="20"/>
+        </w:rPr>
+        <w:t xml:space="preserve"> and look for a usage or billing section. When you're approaching your limit, Claude will also display a warning message directly in the chat interface before cutting you off.</w:t>
+      </w:r>
+    </w:p>
+    <w:p>
+      <w:pPr>
+        <w:pStyle w:val="BodyText"/>
+        <w:spacing w:lineRule="auto" w:line="240"/>
+        <w:rPr>
+          <w:rFonts w:ascii="Helvetica" w:hAnsi="Helvetica"/>
+          <w:color w:val="000000"/>
+          <w:sz w:val="20"/>
+          <w:szCs w:val="20"/>
+        </w:rPr>
+      </w:pPr>
+      <w:r>
+        <w:rPr>
+          <w:rFonts w:ascii="Helvetica" w:hAnsi="Helvetica"/>
+          <w:color w:val="000000"/>
+          <w:sz w:val="20"/>
+          <w:szCs w:val="20"/>
+        </w:rPr>
+        <w:t>If you're hitting limits frequently, the main levers are: starting fresh conversations (shorter context = less usage consumed per message), and avoiding extended thinking mode unless you need it.</w:t>
       </w:r>
     </w:p>
     <w:p>
@@ -7525,6 +7883,143 @@
   <w:abstractNum w:abstractNumId="2">
     <w:lvl w:ilvl="0">
       <w:start w:val="1"/>
+      <w:numFmt w:val="bullet"/>
+      <w:lvlText w:val=""/>
+      <w:lvlJc w:val="left"/>
+      <w:pPr>
+        <w:tabs>
+          <w:tab w:val="num" w:pos="709"/>
+        </w:tabs>
+        <w:ind w:left="709" w:hanging="283"/>
+      </w:pPr>
+      <w:rPr>
+        <w:rFonts w:ascii="Symbol" w:hAnsi="Symbol" w:cs="Symbol" w:hint="default"/>
+      </w:rPr>
+    </w:lvl>
+    <w:lvl w:ilvl="1">
+      <w:start w:val="1"/>
+      <w:numFmt w:val="bullet"/>
+      <w:lvlText w:val=""/>
+      <w:lvlJc w:val="left"/>
+      <w:pPr>
+        <w:tabs>
+          <w:tab w:val="num" w:pos="1418"/>
+        </w:tabs>
+        <w:ind w:left="1418" w:hanging="283"/>
+      </w:pPr>
+      <w:rPr>
+        <w:rFonts w:ascii="Symbol" w:hAnsi="Symbol" w:cs="Symbol" w:hint="default"/>
+      </w:rPr>
+    </w:lvl>
+    <w:lvl w:ilvl="2">
+      <w:start w:val="1"/>
+      <w:numFmt w:val="bullet"/>
+      <w:lvlText w:val=""/>
+      <w:lvlJc w:val="left"/>
+      <w:pPr>
+        <w:tabs>
+          <w:tab w:val="num" w:pos="2127"/>
+        </w:tabs>
+        <w:ind w:left="2127" w:hanging="283"/>
+      </w:pPr>
+      <w:rPr>
+        <w:rFonts w:ascii="Symbol" w:hAnsi="Symbol" w:cs="Symbol" w:hint="default"/>
+      </w:rPr>
+    </w:lvl>
+    <w:lvl w:ilvl="3">
+      <w:start w:val="1"/>
+      <w:numFmt w:val="bullet"/>
+      <w:lvlText w:val=""/>
+      <w:lvlJc w:val="left"/>
+      <w:pPr>
+        <w:tabs>
+          <w:tab w:val="num" w:pos="2836"/>
+        </w:tabs>
+        <w:ind w:left="2836" w:hanging="283"/>
+      </w:pPr>
+      <w:rPr>
+        <w:rFonts w:ascii="Symbol" w:hAnsi="Symbol" w:cs="Symbol" w:hint="default"/>
+      </w:rPr>
+    </w:lvl>
+    <w:lvl w:ilvl="4">
+      <w:start w:val="1"/>
+      <w:numFmt w:val="bullet"/>
+      <w:lvlText w:val=""/>
+      <w:lvlJc w:val="left"/>
+      <w:pPr>
+        <w:tabs>
+          <w:tab w:val="num" w:pos="3545"/>
+        </w:tabs>
+        <w:ind w:left="3545" w:hanging="283"/>
+      </w:pPr>
+      <w:rPr>
+        <w:rFonts w:ascii="Symbol" w:hAnsi="Symbol" w:cs="Symbol" w:hint="default"/>
+      </w:rPr>
+    </w:lvl>
+    <w:lvl w:ilvl="5">
+      <w:start w:val="1"/>
+      <w:numFmt w:val="bullet"/>
+      <w:lvlText w:val=""/>
+      <w:lvlJc w:val="left"/>
+      <w:pPr>
+        <w:tabs>
+          <w:tab w:val="num" w:pos="4254"/>
+        </w:tabs>
+        <w:ind w:left="4254" w:hanging="283"/>
+      </w:pPr>
+      <w:rPr>
+        <w:rFonts w:ascii="Symbol" w:hAnsi="Symbol" w:cs="Symbol" w:hint="default"/>
+      </w:rPr>
+    </w:lvl>
+    <w:lvl w:ilvl="6">
+      <w:start w:val="1"/>
+      <w:numFmt w:val="bullet"/>
+      <w:lvlText w:val=""/>
+      <w:lvlJc w:val="left"/>
+      <w:pPr>
+        <w:tabs>
+          <w:tab w:val="num" w:pos="4963"/>
+        </w:tabs>
+        <w:ind w:left="4963" w:hanging="283"/>
+      </w:pPr>
+      <w:rPr>
+        <w:rFonts w:ascii="Symbol" w:hAnsi="Symbol" w:cs="Symbol" w:hint="default"/>
+      </w:rPr>
+    </w:lvl>
+    <w:lvl w:ilvl="7">
+      <w:start w:val="1"/>
+      <w:numFmt w:val="bullet"/>
+      <w:lvlText w:val=""/>
+      <w:lvlJc w:val="left"/>
+      <w:pPr>
+        <w:tabs>
+          <w:tab w:val="num" w:pos="5672"/>
+        </w:tabs>
+        <w:ind w:left="5672" w:hanging="283"/>
+      </w:pPr>
+      <w:rPr>
+        <w:rFonts w:ascii="Symbol" w:hAnsi="Symbol" w:cs="Symbol" w:hint="default"/>
+      </w:rPr>
+    </w:lvl>
+    <w:lvl w:ilvl="8">
+      <w:start w:val="1"/>
+      <w:numFmt w:val="bullet"/>
+      <w:lvlText w:val=""/>
+      <w:lvlJc w:val="left"/>
+      <w:pPr>
+        <w:tabs>
+          <w:tab w:val="num" w:pos="6381"/>
+        </w:tabs>
+        <w:ind w:left="6381" w:hanging="283"/>
+      </w:pPr>
+      <w:rPr>
+        <w:rFonts w:ascii="Symbol" w:hAnsi="Symbol" w:cs="Symbol" w:hint="default"/>
+      </w:rPr>
+    </w:lvl>
+  </w:abstractNum>
+  <w:abstractNum w:abstractNumId="3">
+    <w:lvl w:ilvl="0">
+      <w:start w:val="1"/>
       <w:numFmt w:val="none"/>
       <w:suff w:val="nothing"/>
       <w:lvlText w:val=""/>
@@ -7646,6 +8141,9 @@
   </w:num>
   <w:num w:numId="2">
     <w:abstractNumId w:val="2"/>
+  </w:num>
+  <w:num w:numId="3">
+    <w:abstractNumId w:val="3"/>
   </w:num>
 </w:numbering>
 </file>
@@ -7734,6 +8232,20 @@
     <w:qFormat/>
     <w:rPr>
       <w:rFonts w:ascii="Liberation Mono" w:hAnsi="Liberation Mono" w:eastAsia="Liberation Mono" w:cs="Liberation Mono"/>
+    </w:rPr>
+  </w:style>
+  <w:style w:type="character" w:styleId="Bulletsuser">
+    <w:name w:val="Bullets (user)"/>
+    <w:qFormat/>
+    <w:rPr>
+      <w:rFonts w:ascii="OpenSymbol" w:hAnsi="OpenSymbol" w:eastAsia="OpenSymbol" w:cs="OpenSymbol"/>
+    </w:rPr>
+  </w:style>
+  <w:style w:type="character" w:styleId="Hyperlink">
+    <w:name w:val="Hyperlink"/>
+    <w:rPr>
+      <w:color w:val="000080"/>
+      <w:u w:val="single"/>
     </w:rPr>
   </w:style>
   <w:style w:type="character" w:styleId="Bullets">

</xml_diff>